<commit_message>
web function more nice early selection function done
</commit_message>
<xml_diff>
--- a/ancient seletion早期选择分析.docx
+++ b/ancient seletion早期选择分析.docx
@@ -868,15 +868,44 @@
       </w:r>
     </w:p>
     <w:p>
-      <w:r>
-        <w:rPr>
-          <w:noProof/>
-        </w:rPr>
+      <w:pPr>
+        <w:rPr>
+          <w:rFonts w:hint="eastAsia"/>
+        </w:rPr>
+      </w:pPr>
+      <w:r>
+        <w:rPr>
+          <w:rFonts w:hint="eastAsia"/>
+        </w:rPr>
+        <w:t>再填充太湖鹅外群的基因型。</w:t>
+      </w:r>
+      <w:bookmarkStart w:id="0" w:name="_GoBack"/>
+      <w:bookmarkEnd w:id="0"/>
+    </w:p>
+    <w:p>
+      <w:pPr>
+        <w:rPr>
+          <w:rFonts w:hint="eastAsia"/>
+        </w:rPr>
+      </w:pPr>
+      <w:r>
+        <w:t>python ~/life/src/NGS/Service/fillancestraltemp_usingBAM.py -t mspsgjlksy10pop_toplevel_pekingduckref -C /ifs1/User/lrui/data/duckproject/configfile/taihugeeseBJ.VCFBAMconfig   -c pekingduckchrominfo.5MBPLUS_1</w:t>
+      </w:r>
+    </w:p>
+    <w:p/>
+    <w:p>
+      <w:r>
         <w:drawing>
-          <wp:inline distT="0" distB="0" distL="0" distR="0" wp14:anchorId="1BDB56F7" wp14:editId="2E7ADC71">
-            <wp:extent cx="5274310" cy="1333500"/>
-            <wp:effectExtent l="0" t="0" r="2540" b="0"/>
-            <wp:docPr id="4" name="图片 4"/>
+          <wp:inline distT="0" distB="0" distL="0" distR="0" wp14:anchorId="09F1B66A" wp14:editId="57E308D9">
+            <wp:extent cx="5274310" cy="873125"/>
+            <wp:effectExtent l="0" t="0" r="2540" b="3175"/>
+            <wp:docPr id="3" name="图片 3">
+              <a:extLst xmlns:a="http://schemas.openxmlformats.org/drawingml/2006/main">
+                <a:ext uri="{FF2B5EF4-FFF2-40B4-BE49-F238E27FC236}">
+                  <a16:creationId xmlns:a16="http://schemas.microsoft.com/office/drawing/2014/main" id="{B92E957D-3312-43B3-BB01-0243D5EAB1CF}"/>
+                </a:ext>
+              </a:extLst>
+            </wp:docPr>
             <wp:cNvGraphicFramePr>
               <a:graphicFrameLocks xmlns:a="http://schemas.openxmlformats.org/drawingml/2006/main" noChangeAspect="1"/>
             </wp:cNvGraphicFramePr>
@@ -884,8 +913,16 @@
               <a:graphicData uri="http://schemas.openxmlformats.org/drawingml/2006/picture">
                 <pic:pic xmlns:pic="http://schemas.openxmlformats.org/drawingml/2006/picture">
                   <pic:nvPicPr>
-                    <pic:cNvPr id="1" name=""/>
-                    <pic:cNvPicPr/>
+                    <pic:cNvPr id="4" name="图片 3">
+                      <a:extLst>
+                        <a:ext uri="{FF2B5EF4-FFF2-40B4-BE49-F238E27FC236}">
+                          <a16:creationId xmlns:a16="http://schemas.microsoft.com/office/drawing/2014/main" id="{B92E957D-3312-43B3-BB01-0243D5EAB1CF}"/>
+                        </a:ext>
+                      </a:extLst>
+                    </pic:cNvPr>
+                    <pic:cNvPicPr>
+                      <a:picLocks noChangeAspect="1"/>
+                    </pic:cNvPicPr>
                   </pic:nvPicPr>
                   <pic:blipFill>
                     <a:blip r:embed="rId8"/>
@@ -896,7 +933,7 @@
                   <pic:spPr>
                     <a:xfrm>
                       <a:off x="0" y="0"/>
-                      <a:ext cx="5274310" cy="1333500"/>
+                      <a:ext cx="5274310" cy="873125"/>
                     </a:xfrm>
                     <a:prstGeom prst="rect">
                       <a:avLst/>
@@ -908,16 +945,94 @@
           </wp:inline>
         </w:drawing>
       </w:r>
-      <w:bookmarkStart w:id="0" w:name="_GoBack"/>
-      <w:bookmarkEnd w:id="0"/>
+    </w:p>
+    <w:p>
+      <w:r>
+        <w:rPr>
+          <w:rFonts w:hint="eastAsia"/>
+        </w:rPr>
+        <w:t>生成过程中番鸭的b</w:t>
+      </w:r>
+      <w:r>
+        <w:t>am</w:t>
+      </w:r>
+      <w:r>
+        <w:rPr>
+          <w:rFonts w:hint="eastAsia"/>
+        </w:rPr>
+        <w:t>有点问题，之前记着就有问题，</w:t>
+      </w:r>
+      <w:r>
+        <w:t>KB742404.1</w:t>
+      </w:r>
+      <w:r>
+        <w:rPr>
+          <w:rFonts w:hint="eastAsia"/>
+        </w:rPr>
+        <w:t>这条染色体无法读取后面的数据，但是v</w:t>
+      </w:r>
+      <w:r>
+        <w:t>cf</w:t>
+      </w:r>
+      <w:r>
+        <w:rPr>
+          <w:rFonts w:hint="eastAsia"/>
+        </w:rPr>
+        <w:t>文件应该是没问题的。所以重新生成了f</w:t>
+      </w:r>
+      <w:r>
+        <w:t>anya</w:t>
+      </w:r>
+      <w:r>
+        <w:rPr>
+          <w:rFonts w:hint="eastAsia"/>
+        </w:rPr>
+        <w:t>的b</w:t>
+      </w:r>
+      <w:r>
+        <w:t>am</w:t>
+      </w:r>
+      <w:r>
+        <w:rPr>
+          <w:rFonts w:hint="eastAsia"/>
+        </w:rPr>
+        <w:t>以备以后使用。同时取消了n</w:t>
+      </w:r>
+      <w:r>
+        <w:t>o covered</w:t>
+      </w:r>
+      <w:r>
+        <w:rPr>
+          <w:rFonts w:hint="eastAsia"/>
+        </w:rPr>
+        <w:t>改为</w:t>
+      </w:r>
+      <w:r>
+        <w:t>0,0</w:t>
+      </w:r>
     </w:p>
     <w:p>
       <w:pPr>
         <w:rPr>
-          <w:b/>
-          <w:bCs/>
+          <w:rFonts w:hint="eastAsia"/>
         </w:rPr>
       </w:pPr>
+    </w:p>
+    <w:p/>
+    <w:p>
+      <w:pPr>
+        <w:rPr>
+          <w:rFonts w:hint="eastAsia"/>
+        </w:rPr>
+      </w:pPr>
+    </w:p>
+    <w:p>
+      <w:pPr>
+        <w:rPr>
+          <w:b/>
+          <w:bCs/>
+        </w:rPr>
+      </w:pPr>
       <w:r>
         <w:rPr>
           <w:rFonts w:hint="eastAsia"/>
@@ -985,6 +1100,376 @@
           <w:bCs/>
         </w:rPr>
         <w:t>文件</w:t>
+      </w:r>
+    </w:p>
+    <w:p>
+      <w:pPr>
+        <w:rPr>
+          <w:rFonts w:ascii="Times New Roman" w:eastAsia="Times New Roman" w:hAnsi="Times New Roman" w:cs="Times New Roman"/>
+          <w:color w:val="000000"/>
+          <w:sz w:val="24"/>
+          <w:szCs w:val="24"/>
+        </w:rPr>
+      </w:pPr>
+      <w:r>
+        <w:rPr>
+          <w:rFonts w:ascii="Times New Roman" w:eastAsia="Times New Roman" w:hAnsi="Times New Roman" w:cs="Times New Roman"/>
+          <w:color w:val="000000"/>
+          <w:sz w:val="24"/>
+          <w:szCs w:val="24"/>
+        </w:rPr>
+        <w:t xml:space="preserve">We then inferred ancestral alleles </w:t>
+      </w:r>
+      <w:r>
+        <w:rPr>
+          <w:rFonts w:ascii="Times New Roman" w:eastAsia="Times New Roman" w:hAnsi="Times New Roman" w:cs="Times New Roman"/>
+          <w:color w:val="000000"/>
+          <w:sz w:val="24"/>
+          <w:szCs w:val="24"/>
+        </w:rPr>
+        <w:t xml:space="preserve">by </w:t>
+      </w:r>
+      <w:r>
+        <w:rPr>
+          <w:rFonts w:ascii="Times New Roman" w:eastAsia="Times New Roman" w:hAnsi="Times New Roman" w:cs="Times New Roman"/>
+          <w:color w:val="000000"/>
+          <w:sz w:val="24"/>
+          <w:szCs w:val="24"/>
+        </w:rPr>
+        <w:t>using Muscovy ducks</w:t>
+      </w:r>
+      <w:r>
+        <w:rPr>
+          <w:rFonts w:ascii="Times New Roman" w:eastAsia="Times New Roman" w:hAnsi="Times New Roman" w:cs="Times New Roman"/>
+          <w:color w:val="000000"/>
+          <w:sz w:val="24"/>
+          <w:szCs w:val="24"/>
+        </w:rPr>
+        <w:t xml:space="preserve"> and </w:t>
+      </w:r>
+      <w:r>
+        <w:rPr>
+          <w:rFonts w:ascii="Times New Roman" w:eastAsia="Times New Roman" w:hAnsi="Times New Roman" w:cs="Times New Roman"/>
+          <w:color w:val="000000"/>
+          <w:sz w:val="24"/>
+          <w:szCs w:val="24"/>
+        </w:rPr>
+        <w:t xml:space="preserve"> </w:t>
+      </w:r>
+      <w:r>
+        <w:rPr>
+          <w:rFonts w:ascii="Times New Roman" w:eastAsia="Times New Roman" w:hAnsi="Times New Roman" w:cs="Times New Roman"/>
+          <w:color w:val="000000"/>
+          <w:sz w:val="24"/>
+          <w:szCs w:val="24"/>
+        </w:rPr>
+        <w:t xml:space="preserve">Taihu </w:t>
+      </w:r>
+      <w:r>
+        <w:rPr>
+          <w:rFonts w:ascii="Times New Roman" w:eastAsia="Times New Roman" w:hAnsi="Times New Roman" w:cs="Times New Roman"/>
+          <w:color w:val="000000"/>
+          <w:sz w:val="24"/>
+          <w:szCs w:val="24"/>
+        </w:rPr>
+        <w:t xml:space="preserve">geese as outgroups using the following thresholds: (1) more than 30-fold coverage </w:t>
+      </w:r>
+      <w:r>
+        <w:rPr>
+          <w:rFonts w:ascii="Times New Roman" w:eastAsia="Times New Roman" w:hAnsi="Times New Roman" w:cs="Times New Roman"/>
+          <w:color w:val="000000"/>
+          <w:sz w:val="24"/>
+          <w:szCs w:val="24"/>
+        </w:rPr>
+        <w:t>when SNP fixed</w:t>
+      </w:r>
+      <w:r>
+        <w:rPr>
+          <w:rFonts w:ascii="Times New Roman" w:eastAsia="Times New Roman" w:hAnsi="Times New Roman" w:cs="Times New Roman"/>
+          <w:color w:val="000000"/>
+          <w:sz w:val="24"/>
+          <w:szCs w:val="24"/>
+        </w:rPr>
+        <w:t xml:space="preserve"> </w:t>
+      </w:r>
+      <w:r>
+        <w:rPr>
+          <w:rFonts w:ascii="Times New Roman" w:eastAsia="Times New Roman" w:hAnsi="Times New Roman" w:cs="Times New Roman"/>
+          <w:color w:val="000000"/>
+          <w:sz w:val="24"/>
+          <w:szCs w:val="24"/>
+        </w:rPr>
+        <w:t>in</w:t>
+      </w:r>
+      <w:r>
+        <w:rPr>
+          <w:rFonts w:ascii="Times New Roman" w:eastAsia="Times New Roman" w:hAnsi="Times New Roman" w:cs="Times New Roman"/>
+          <w:color w:val="000000"/>
+          <w:sz w:val="24"/>
+          <w:szCs w:val="24"/>
+        </w:rPr>
+        <w:t xml:space="preserve"> </w:t>
+      </w:r>
+      <w:r>
+        <w:rPr>
+          <w:rFonts w:ascii="Times New Roman" w:eastAsia="Times New Roman" w:hAnsi="Times New Roman" w:cs="Times New Roman"/>
+          <w:color w:val="000000"/>
+          <w:sz w:val="24"/>
+          <w:szCs w:val="24"/>
+        </w:rPr>
+        <w:t>one or both</w:t>
+      </w:r>
+      <w:r>
+        <w:rPr>
+          <w:rFonts w:ascii="Times New Roman" w:eastAsia="Times New Roman" w:hAnsi="Times New Roman" w:cs="Times New Roman"/>
+          <w:color w:val="000000"/>
+          <w:sz w:val="24"/>
+          <w:szCs w:val="24"/>
+        </w:rPr>
+        <w:t xml:space="preserve"> outgroups; and (2) the allele </w:t>
+      </w:r>
+      <w:r>
+        <w:rPr>
+          <w:rFonts w:ascii="Times New Roman" w:eastAsia="Times New Roman" w:hAnsi="Times New Roman" w:cs="Times New Roman"/>
+          <w:color w:val="000000"/>
+          <w:sz w:val="24"/>
+          <w:szCs w:val="24"/>
+        </w:rPr>
+        <w:t>not fixed the different directions</w:t>
+      </w:r>
+      <w:r>
+        <w:rPr>
+          <w:rFonts w:ascii="Times New Roman" w:eastAsia="Times New Roman" w:hAnsi="Times New Roman" w:cs="Times New Roman"/>
+          <w:color w:val="000000"/>
+          <w:sz w:val="24"/>
+          <w:szCs w:val="24"/>
+        </w:rPr>
+        <w:t>.</w:t>
+      </w:r>
+    </w:p>
+    <w:p>
+      <w:pPr>
+        <w:rPr>
+          <w:rFonts w:ascii="Times New Roman" w:hAnsi="Times New Roman" w:cs="Times New Roman"/>
+          <w:color w:val="000000"/>
+          <w:sz w:val="24"/>
+          <w:szCs w:val="24"/>
+        </w:rPr>
+      </w:pPr>
+      <w:r>
+        <w:rPr>
+          <w:rFonts w:ascii="Times New Roman" w:hAnsi="Times New Roman" w:cs="Times New Roman" w:hint="eastAsia"/>
+          <w:color w:val="000000"/>
+          <w:sz w:val="24"/>
+          <w:szCs w:val="24"/>
+        </w:rPr>
+        <w:t>改为</w:t>
+      </w:r>
+    </w:p>
+    <w:p>
+      <w:pPr>
+        <w:rPr>
+          <w:rFonts w:ascii="Times New Roman" w:eastAsia="Times New Roman" w:hAnsi="Times New Roman" w:cs="Times New Roman"/>
+          <w:color w:val="000000"/>
+          <w:sz w:val="24"/>
+          <w:szCs w:val="24"/>
+        </w:rPr>
+      </w:pPr>
+      <w:r>
+        <w:rPr>
+          <w:rFonts w:ascii="Times New Roman" w:eastAsia="Times New Roman" w:hAnsi="Times New Roman" w:cs="Times New Roman"/>
+          <w:color w:val="000000"/>
+          <w:sz w:val="24"/>
+          <w:szCs w:val="24"/>
+        </w:rPr>
+        <w:t xml:space="preserve">We then inferred ancestral alleles </w:t>
+      </w:r>
+      <w:r>
+        <w:rPr>
+          <w:rFonts w:ascii="Times New Roman" w:eastAsia="Times New Roman" w:hAnsi="Times New Roman" w:cs="Times New Roman"/>
+          <w:color w:val="000000"/>
+          <w:sz w:val="24"/>
+          <w:szCs w:val="24"/>
+        </w:rPr>
+        <w:t xml:space="preserve">by </w:t>
+      </w:r>
+      <w:r>
+        <w:rPr>
+          <w:rFonts w:ascii="Times New Roman" w:eastAsia="Times New Roman" w:hAnsi="Times New Roman" w:cs="Times New Roman"/>
+          <w:color w:val="000000"/>
+          <w:sz w:val="24"/>
+          <w:szCs w:val="24"/>
+        </w:rPr>
+        <w:t>using Muscovy ducks</w:t>
+      </w:r>
+      <w:r>
+        <w:rPr>
+          <w:rFonts w:ascii="Times New Roman" w:eastAsia="Times New Roman" w:hAnsi="Times New Roman" w:cs="Times New Roman"/>
+          <w:color w:val="000000"/>
+          <w:sz w:val="24"/>
+          <w:szCs w:val="24"/>
+        </w:rPr>
+        <w:t xml:space="preserve"> and </w:t>
+      </w:r>
+      <w:r>
+        <w:rPr>
+          <w:rFonts w:ascii="Times New Roman" w:eastAsia="Times New Roman" w:hAnsi="Times New Roman" w:cs="Times New Roman"/>
+          <w:color w:val="000000"/>
+          <w:sz w:val="24"/>
+          <w:szCs w:val="24"/>
+        </w:rPr>
+        <w:t xml:space="preserve"> </w:t>
+      </w:r>
+      <w:r>
+        <w:rPr>
+          <w:rFonts w:ascii="Times New Roman" w:eastAsia="Times New Roman" w:hAnsi="Times New Roman" w:cs="Times New Roman"/>
+          <w:color w:val="000000"/>
+          <w:sz w:val="24"/>
+          <w:szCs w:val="24"/>
+        </w:rPr>
+        <w:t xml:space="preserve">Taihu </w:t>
+      </w:r>
+      <w:r>
+        <w:rPr>
+          <w:rFonts w:ascii="Times New Roman" w:eastAsia="Times New Roman" w:hAnsi="Times New Roman" w:cs="Times New Roman"/>
+          <w:color w:val="000000"/>
+          <w:sz w:val="24"/>
+          <w:szCs w:val="24"/>
+        </w:rPr>
+        <w:t xml:space="preserve">geese as outgroups using the following thresholds: (1) more than 30-fold coverage </w:t>
+      </w:r>
+      <w:r>
+        <w:rPr>
+          <w:rFonts w:ascii="Times New Roman" w:eastAsia="Times New Roman" w:hAnsi="Times New Roman" w:cs="Times New Roman"/>
+          <w:color w:val="000000"/>
+          <w:sz w:val="24"/>
+          <w:szCs w:val="24"/>
+        </w:rPr>
+        <w:t>when SNP fixed</w:t>
+      </w:r>
+      <w:r>
+        <w:rPr>
+          <w:rFonts w:ascii="Times New Roman" w:eastAsia="Times New Roman" w:hAnsi="Times New Roman" w:cs="Times New Roman"/>
+          <w:color w:val="000000"/>
+          <w:sz w:val="24"/>
+          <w:szCs w:val="24"/>
+        </w:rPr>
+        <w:t xml:space="preserve"> </w:t>
+      </w:r>
+      <w:r>
+        <w:rPr>
+          <w:rFonts w:ascii="Times New Roman" w:eastAsia="Times New Roman" w:hAnsi="Times New Roman" w:cs="Times New Roman"/>
+          <w:color w:val="000000"/>
+          <w:sz w:val="24"/>
+          <w:szCs w:val="24"/>
+        </w:rPr>
+        <w:t>in</w:t>
+      </w:r>
+      <w:r>
+        <w:rPr>
+          <w:rFonts w:ascii="Times New Roman" w:eastAsia="Times New Roman" w:hAnsi="Times New Roman" w:cs="Times New Roman"/>
+          <w:color w:val="000000"/>
+          <w:sz w:val="24"/>
+          <w:szCs w:val="24"/>
+        </w:rPr>
+        <w:t xml:space="preserve"> </w:t>
+      </w:r>
+      <w:r>
+        <w:rPr>
+          <w:rFonts w:ascii="Times New Roman" w:eastAsia="Times New Roman" w:hAnsi="Times New Roman" w:cs="Times New Roman"/>
+          <w:color w:val="000000"/>
+          <w:sz w:val="24"/>
+          <w:szCs w:val="24"/>
+        </w:rPr>
+        <w:t>Muscovy</w:t>
+      </w:r>
+      <w:r>
+        <w:rPr>
+          <w:rFonts w:ascii="Times New Roman" w:eastAsia="Times New Roman" w:hAnsi="Times New Roman" w:cs="Times New Roman"/>
+          <w:color w:val="000000"/>
+          <w:sz w:val="24"/>
+          <w:szCs w:val="24"/>
+        </w:rPr>
+        <w:t xml:space="preserve"> </w:t>
+      </w:r>
+      <w:r>
+        <w:rPr>
+          <w:rFonts w:ascii="Times New Roman" w:eastAsia="Times New Roman" w:hAnsi="Times New Roman" w:cs="Times New Roman"/>
+          <w:color w:val="000000"/>
+          <w:sz w:val="24"/>
+          <w:szCs w:val="24"/>
+        </w:rPr>
+        <w:t>or both</w:t>
+      </w:r>
+      <w:r>
+        <w:rPr>
+          <w:rFonts w:ascii="Times New Roman" w:eastAsia="Times New Roman" w:hAnsi="Times New Roman" w:cs="Times New Roman"/>
+          <w:color w:val="000000"/>
+          <w:sz w:val="24"/>
+          <w:szCs w:val="24"/>
+        </w:rPr>
+        <w:t xml:space="preserve"> outgroups; and (2) the </w:t>
+      </w:r>
+      <w:r>
+        <w:rPr>
+          <w:rFonts w:ascii="Times New Roman" w:eastAsia="Times New Roman" w:hAnsi="Times New Roman" w:cs="Times New Roman"/>
+          <w:color w:val="000000"/>
+          <w:sz w:val="24"/>
+          <w:szCs w:val="24"/>
+        </w:rPr>
+        <w:t>both outgroups were fixed the same directions</w:t>
+      </w:r>
+      <w:r>
+        <w:rPr>
+          <w:rFonts w:ascii="Times New Roman" w:eastAsia="Times New Roman" w:hAnsi="Times New Roman" w:cs="Times New Roman"/>
+          <w:color w:val="000000"/>
+          <w:sz w:val="24"/>
+          <w:szCs w:val="24"/>
+        </w:rPr>
+        <w:t>.</w:t>
+      </w:r>
+    </w:p>
+    <w:p>
+      <w:pPr>
+        <w:rPr>
+          <w:rFonts w:ascii="Times New Roman" w:hAnsi="Times New Roman" w:cs="Times New Roman" w:hint="eastAsia"/>
+          <w:color w:val="000000"/>
+          <w:sz w:val="24"/>
+          <w:szCs w:val="24"/>
+        </w:rPr>
+      </w:pPr>
+      <w:r>
+        <w:rPr>
+          <w:rFonts w:ascii="Times New Roman" w:hAnsi="Times New Roman" w:cs="Times New Roman" w:hint="eastAsia"/>
+          <w:color w:val="000000"/>
+          <w:sz w:val="24"/>
+          <w:szCs w:val="24"/>
+        </w:rPr>
+        <w:t>早期选择的命令：</w:t>
+      </w:r>
+    </w:p>
+    <w:p>
+      <w:pPr>
+        <w:rPr>
+          <w:rFonts w:hint="eastAsia"/>
+          <w:b/>
+          <w:bCs/>
+        </w:rPr>
+      </w:pPr>
+      <w:r>
+        <w:rPr>
+          <w:b/>
+          <w:bCs/>
+        </w:rPr>
+        <w:t xml:space="preserve">python ~/life/src/NGS/Analysis/Detectsignalacrossgenome_master.py -T mallardBJ.VCFBAMconfig -T spotbilledBJ.VCFBAMconfig -R beijingBJ.VCFBAMconfig -R shaoxingBJ.VCFBAMconfig -R lianchengbaiBJ.VCFBAMconfig -R jindingBJ.VCFBAMconfig -R shanmaBJ.VCFBAMconfig -R gaoyouBJ.VCFBAMconfig -R cherryvalleyBJ.VCFBAMconfig -R campbellBJ.VCFBAMconfig -t mspsgjlksy10pop_toplevel_pekingduckref -w 40000 -s 20000 -c /ifs1/User/lrui/database/all_sep_chrfiles/pekingduckchrominfo.5MBPLUS_1 -c /ifs1/User/lrui/database/all_sep_chrfiles/pekingduckchrominfo.2MB_5MB_part1_2 -c /ifs1/User/lrui/database/all_sep_chrfiles/pekingduckchrominfo.2MB_5MB_part2_2 -c /ifs1/User/lrui/database/all_sep_chrfiles/pekingduckchrominfo.100kb_2MB_part1_3 -c /ifs1/User/lrui/database/all_sep_chrfiles/pekingduckchrominfo.100kb_2MB_part2_3 -c </w:t>
+      </w:r>
+      <w:r>
+        <w:rPr>
+          <w:b/>
+          <w:bCs/>
+        </w:rPr>
+        <w:lastRenderedPageBreak/>
+        <w:t>/ifs1/User/lrui/database/all_sep_chrfiles/pekingduckchrominfo.100kb_2MB_part3_3 -c /ifs1/User/lrui/database/all_sep_chrfiles/pekingduckchrominfo.100kb_2MB_part4_3 -c /ifs1/User/lrui/database/all_sep_chrfiles/pekingduckchrominfo.100kb_2MB_part5_3 -c /ifs1/User/lrui/database/all_sep_chrfiles/pekingduckchrominfo.40kb_100kb_4 -c /ifs1/User/lrui/database/all_sep_chrfiles/pekingduckchrominfo.5kb_40kb_5 -n 19 -o /ifs1/User/lrui/data/duckproject/configfile/ancientMixChr40k20k -p early -1 ~/life/src/NGS/Slave/Detectsignalacrossgenome_producecorrelation_slave.py -2 ~/life/src/NGS/Slave/Detectsignalacrossgenome_slidewin_slave.py</w:t>
       </w:r>
     </w:p>
     <w:sectPr>
@@ -1439,7 +1924,6 @@
   <w:style w:type="character" w:default="1" w:styleId="a0">
     <w:name w:val="Default Paragraph Font"/>
     <w:uiPriority w:val="1"/>
-    <w:semiHidden/>
     <w:unhideWhenUsed/>
   </w:style>
   <w:style w:type="table" w:default="1" w:styleId="a1">
@@ -1523,6 +2007,31 @@
     <w:link w:val="a5"/>
     <w:uiPriority w:val="99"/>
     <w:rsid w:val="007219FE"/>
+    <w:rPr>
+      <w:sz w:val="18"/>
+      <w:szCs w:val="18"/>
+    </w:rPr>
+  </w:style>
+  <w:style w:type="paragraph" w:styleId="a7">
+    <w:name w:val="Balloon Text"/>
+    <w:basedOn w:val="a"/>
+    <w:link w:val="a8"/>
+    <w:uiPriority w:val="99"/>
+    <w:semiHidden/>
+    <w:unhideWhenUsed/>
+    <w:rsid w:val="009F2203"/>
+    <w:rPr>
+      <w:sz w:val="18"/>
+      <w:szCs w:val="18"/>
+    </w:rPr>
+  </w:style>
+  <w:style w:type="character" w:customStyle="1" w:styleId="a8">
+    <w:name w:val="批注框文本 字符"/>
+    <w:basedOn w:val="a0"/>
+    <w:link w:val="a7"/>
+    <w:uiPriority w:val="99"/>
+    <w:semiHidden/>
+    <w:rsid w:val="009F2203"/>
     <w:rPr>
       <w:sz w:val="18"/>
       <w:szCs w:val="18"/>

</xml_diff>

<commit_message>
ancient selection bug fixed, MS is going to add reference may change the format or introduce some mistake
</commit_message>
<xml_diff>
--- a/ancient seletion早期选择分析.docx
+++ b/ancient seletion早期选择分析.docx
@@ -4,6 +4,12 @@
   <w:body>
     <w:p>
       <w:pPr>
+        <w:pStyle w:val="a9"/>
+        <w:numPr>
+          <w:ilvl w:val="0"/>
+          <w:numId w:val="1"/>
+        </w:numPr>
+        <w:ind w:firstLineChars="0"/>
         <w:rPr>
           <w:rFonts w:ascii="Times New Roman" w:hAnsi="Times New Roman" w:cs="Times New Roman"/>
           <w:b/>
@@ -28,6 +34,12 @@
     </w:p>
     <w:p>
       <w:pPr>
+        <w:pStyle w:val="a9"/>
+        <w:numPr>
+          <w:ilvl w:val="0"/>
+          <w:numId w:val="1"/>
+        </w:numPr>
+        <w:ind w:firstLineChars="0"/>
         <w:rPr>
           <w:rFonts w:ascii="Times New Roman" w:hAnsi="Times New Roman" w:cs="Times New Roman"/>
           <w:b/>
@@ -270,6 +282,12 @@
     </w:p>
     <w:p>
       <w:pPr>
+        <w:pStyle w:val="a9"/>
+        <w:numPr>
+          <w:ilvl w:val="0"/>
+          <w:numId w:val="1"/>
+        </w:numPr>
+        <w:ind w:firstLineChars="0"/>
         <w:rPr>
           <w:rFonts w:ascii="Times New Roman" w:hAnsi="Times New Roman" w:cs="Times New Roman"/>
           <w:b/>
@@ -354,149 +372,6 @@
             <wp:extent cx="5274310" cy="2468245"/>
             <wp:effectExtent l="0" t="0" r="2540" b="8255"/>
             <wp:docPr id="1" name="图片 1"/>
-            <wp:cNvGraphicFramePr>
-              <a:graphicFrameLocks xmlns:a="http://schemas.openxmlformats.org/drawingml/2006/main" noChangeAspect="1"/>
-            </wp:cNvGraphicFramePr>
-            <a:graphic xmlns:a="http://schemas.openxmlformats.org/drawingml/2006/main">
-              <a:graphicData uri="http://schemas.openxmlformats.org/drawingml/2006/picture">
-                <pic:pic xmlns:pic="http://schemas.openxmlformats.org/drawingml/2006/picture">
-                  <pic:nvPicPr>
-                    <pic:cNvPr id="1" name=""/>
-                    <pic:cNvPicPr/>
-                  </pic:nvPicPr>
-                  <pic:blipFill>
-                    <a:blip r:embed="rId6"/>
-                    <a:stretch>
-                      <a:fillRect/>
-                    </a:stretch>
-                  </pic:blipFill>
-                  <pic:spPr>
-                    <a:xfrm>
-                      <a:off x="0" y="0"/>
-                      <a:ext cx="5274310" cy="2468245"/>
-                    </a:xfrm>
-                    <a:prstGeom prst="rect">
-                      <a:avLst/>
-                    </a:prstGeom>
-                  </pic:spPr>
-                </pic:pic>
-              </a:graphicData>
-            </a:graphic>
-          </wp:inline>
-        </w:drawing>
-      </w:r>
-    </w:p>
-    <w:p/>
-    <w:p>
-      <w:r>
-        <w:rPr>
-          <w:rFonts w:hint="eastAsia"/>
-        </w:rPr>
-        <w:t>准备，1</w:t>
-      </w:r>
-      <w:r>
-        <w:t>0</w:t>
-      </w:r>
-      <w:r>
-        <w:rPr>
-          <w:rFonts w:hint="eastAsia"/>
-        </w:rPr>
-        <w:t>群体+</w:t>
-      </w:r>
-      <w:r>
-        <w:t>2</w:t>
-      </w:r>
-      <w:r>
-        <w:rPr>
-          <w:rFonts w:hint="eastAsia"/>
-        </w:rPr>
-        <w:t>外群的</w:t>
-      </w:r>
-      <w:r>
-        <w:t>config</w:t>
-      </w:r>
-      <w:r>
-        <w:rPr>
-          <w:rFonts w:hint="eastAsia"/>
-        </w:rPr>
-        <w:t>文件，从</w:t>
-      </w:r>
-      <w:r>
-        <w:t>p_m_sx_sp_gy_kbe_sm_lcb_ytg_jd_10pool10.SNV.vcf</w:t>
-      </w:r>
-      <w:r>
-        <w:rPr>
-          <w:rFonts w:hint="eastAsia"/>
-        </w:rPr>
-        <w:t>这个文件的t</w:t>
-      </w:r>
-      <w:r>
-        <w:t>itle</w:t>
-      </w:r>
-      <w:r>
-        <w:rPr>
-          <w:rFonts w:hint="eastAsia"/>
-        </w:rPr>
-        <w:t>看，当年c</w:t>
-      </w:r>
-      <w:r>
-        <w:t>all</w:t>
-      </w:r>
-      <w:r>
-        <w:rPr>
-          <w:rFonts w:hint="eastAsia"/>
-        </w:rPr>
-        <w:t>这个文件的b</w:t>
-      </w:r>
-      <w:r>
-        <w:t>am</w:t>
-      </w:r>
-      <w:r>
-        <w:rPr>
-          <w:rFonts w:hint="eastAsia"/>
-        </w:rPr>
-        <w:t>已经找不到了，现在有的</w:t>
-      </w:r>
-      <w:r>
-        <w:rPr>
-          <w:rFonts w:hint="eastAsia"/>
-        </w:rPr>
-        <w:t>b</w:t>
-      </w:r>
-      <w:r>
-        <w:t>am</w:t>
-      </w:r>
-      <w:r>
-        <w:rPr>
-          <w:rFonts w:hint="eastAsia"/>
-        </w:rPr>
-        <w:t>从h</w:t>
-      </w:r>
-      <w:r>
-        <w:t>eader</w:t>
-      </w:r>
-      <w:r>
-        <w:rPr>
-          <w:rFonts w:hint="eastAsia"/>
-        </w:rPr>
-        <w:t>看</w:t>
-      </w:r>
-    </w:p>
-    <w:p>
-      <w:r>
-        <w:t>mallard14.dedup.realigned.mergesorted.bam</w:t>
-      </w:r>
-    </w:p>
-    <w:p>
-      <w:r>
-        <w:rPr>
-          <w:noProof/>
-        </w:rPr>
-        <w:drawing>
-          <wp:inline distT="0" distB="0" distL="0" distR="0" wp14:anchorId="21AF27AB" wp14:editId="74F6A74A">
-            <wp:extent cx="5274310" cy="2160270"/>
-            <wp:effectExtent l="0" t="0" r="2540" b="0"/>
-            <wp:docPr id="2" name="图片 2"/>
             <wp:cNvGraphicFramePr>
               <a:graphicFrameLocks xmlns:a="http://schemas.openxmlformats.org/drawingml/2006/main" noChangeAspect="1"/>
             </wp:cNvGraphicFramePr>
@@ -516,6 +391,149 @@
                   <pic:spPr>
                     <a:xfrm>
                       <a:off x="0" y="0"/>
+                      <a:ext cx="5274310" cy="2468245"/>
+                    </a:xfrm>
+                    <a:prstGeom prst="rect">
+                      <a:avLst/>
+                    </a:prstGeom>
+                  </pic:spPr>
+                </pic:pic>
+              </a:graphicData>
+            </a:graphic>
+          </wp:inline>
+        </w:drawing>
+      </w:r>
+    </w:p>
+    <w:p/>
+    <w:p>
+      <w:r>
+        <w:rPr>
+          <w:rFonts w:hint="eastAsia"/>
+        </w:rPr>
+        <w:t>准备，1</w:t>
+      </w:r>
+      <w:r>
+        <w:t>0</w:t>
+      </w:r>
+      <w:r>
+        <w:rPr>
+          <w:rFonts w:hint="eastAsia"/>
+        </w:rPr>
+        <w:t>群体+</w:t>
+      </w:r>
+      <w:r>
+        <w:t>2</w:t>
+      </w:r>
+      <w:r>
+        <w:rPr>
+          <w:rFonts w:hint="eastAsia"/>
+        </w:rPr>
+        <w:t>外群的</w:t>
+      </w:r>
+      <w:r>
+        <w:t>config</w:t>
+      </w:r>
+      <w:r>
+        <w:rPr>
+          <w:rFonts w:hint="eastAsia"/>
+        </w:rPr>
+        <w:t>文件，从</w:t>
+      </w:r>
+      <w:r>
+        <w:t>p_m_sx_sp_gy_kbe_sm_lcb_ytg_jd_10pool10.SNV.vcf</w:t>
+      </w:r>
+      <w:r>
+        <w:rPr>
+          <w:rFonts w:hint="eastAsia"/>
+        </w:rPr>
+        <w:t>这个文件的t</w:t>
+      </w:r>
+      <w:r>
+        <w:t>itle</w:t>
+      </w:r>
+      <w:r>
+        <w:rPr>
+          <w:rFonts w:hint="eastAsia"/>
+        </w:rPr>
+        <w:t>看，当年c</w:t>
+      </w:r>
+      <w:r>
+        <w:t>all</w:t>
+      </w:r>
+      <w:r>
+        <w:rPr>
+          <w:rFonts w:hint="eastAsia"/>
+        </w:rPr>
+        <w:t>这个文件的b</w:t>
+      </w:r>
+      <w:r>
+        <w:t>am</w:t>
+      </w:r>
+      <w:r>
+        <w:rPr>
+          <w:rFonts w:hint="eastAsia"/>
+        </w:rPr>
+        <w:t>已经找不到了，现在有的</w:t>
+      </w:r>
+      <w:r>
+        <w:rPr>
+          <w:rFonts w:hint="eastAsia"/>
+        </w:rPr>
+        <w:t>b</w:t>
+      </w:r>
+      <w:r>
+        <w:t>am</w:t>
+      </w:r>
+      <w:r>
+        <w:rPr>
+          <w:rFonts w:hint="eastAsia"/>
+        </w:rPr>
+        <w:t>从h</w:t>
+      </w:r>
+      <w:r>
+        <w:t>eader</w:t>
+      </w:r>
+      <w:r>
+        <w:rPr>
+          <w:rFonts w:hint="eastAsia"/>
+        </w:rPr>
+        <w:t>看</w:t>
+      </w:r>
+    </w:p>
+    <w:p>
+      <w:r>
+        <w:t>mallard14.dedup.realigned.mergesorted.bam</w:t>
+      </w:r>
+    </w:p>
+    <w:p>
+      <w:r>
+        <w:rPr>
+          <w:noProof/>
+        </w:rPr>
+        <w:drawing>
+          <wp:inline distT="0" distB="0" distL="0" distR="0" wp14:anchorId="21AF27AB" wp14:editId="74F6A74A">
+            <wp:extent cx="5274310" cy="2160270"/>
+            <wp:effectExtent l="0" t="0" r="2540" b="0"/>
+            <wp:docPr id="2" name="图片 2"/>
+            <wp:cNvGraphicFramePr>
+              <a:graphicFrameLocks xmlns:a="http://schemas.openxmlformats.org/drawingml/2006/main" noChangeAspect="1"/>
+            </wp:cNvGraphicFramePr>
+            <a:graphic xmlns:a="http://schemas.openxmlformats.org/drawingml/2006/main">
+              <a:graphicData uri="http://schemas.openxmlformats.org/drawingml/2006/picture">
+                <pic:pic xmlns:pic="http://schemas.openxmlformats.org/drawingml/2006/picture">
+                  <pic:nvPicPr>
+                    <pic:cNvPr id="1" name=""/>
+                    <pic:cNvPicPr/>
+                  </pic:nvPicPr>
+                  <pic:blipFill>
+                    <a:blip r:embed="rId8"/>
+                    <a:stretch>
+                      <a:fillRect/>
+                    </a:stretch>
+                  </pic:blipFill>
+                  <pic:spPr>
+                    <a:xfrm>
+                      <a:off x="0" y="0"/>
                       <a:ext cx="5274310" cy="2160270"/>
                     </a:xfrm>
                     <a:prstGeom prst="rect">
@@ -667,7 +685,19 @@
         <w:rPr>
           <w:rFonts w:hint="eastAsia"/>
         </w:rPr>
-        <w:t>简化历史遗留选项，提高效率。有心奖c</w:t>
+        <w:t>简化历史遗留选项，提高效率。有心</w:t>
+      </w:r>
+      <w:r>
+        <w:rPr>
+          <w:rFonts w:hint="eastAsia"/>
+        </w:rPr>
+        <w:t>将</w:t>
+      </w:r>
+      <w:r>
+        <w:rPr>
+          <w:rFonts w:hint="eastAsia"/>
+        </w:rPr>
+        <w:t>c</w:t>
       </w:r>
       <w:r>
         <w:t>ontext</w:t>
@@ -771,6 +801,12 @@
     <w:p/>
     <w:p>
       <w:pPr>
+        <w:pStyle w:val="a9"/>
+        <w:numPr>
+          <w:ilvl w:val="0"/>
+          <w:numId w:val="1"/>
+        </w:numPr>
+        <w:ind w:firstLineChars="0"/>
         <w:rPr>
           <w:rFonts w:ascii="宋体" w:eastAsia="宋体" w:hAnsi="宋体"/>
           <w:b/>
@@ -868,26 +904,14 @@
       </w:r>
     </w:p>
     <w:p>
-      <w:pPr>
-        <w:rPr>
-          <w:rFonts w:hint="eastAsia"/>
-        </w:rPr>
-      </w:pPr>
       <w:r>
         <w:rPr>
           <w:rFonts w:hint="eastAsia"/>
         </w:rPr>
         <w:t>再填充太湖鹅外群的基因型。</w:t>
       </w:r>
-      <w:bookmarkStart w:id="0" w:name="_GoBack"/>
-      <w:bookmarkEnd w:id="0"/>
-    </w:p>
-    <w:p>
-      <w:pPr>
-        <w:rPr>
-          <w:rFonts w:hint="eastAsia"/>
-        </w:rPr>
-      </w:pPr>
+    </w:p>
+    <w:p>
       <w:r>
         <w:t>python ~/life/src/NGS/Service/fillancestraltemp_usingBAM.py -t mspsgjlksy10pop_toplevel_pekingduckref -C /ifs1/User/lrui/data/duckproject/configfile/taihugeeseBJ.VCFBAMconfig   -c pekingduckchrominfo.5MBPLUS_1</w:t>
       </w:r>
@@ -895,6 +919,9 @@
     <w:p/>
     <w:p>
       <w:r>
+        <w:rPr>
+          <w:noProof/>
+        </w:rPr>
         <w:drawing>
           <wp:inline distT="0" distB="0" distL="0" distR="0" wp14:anchorId="09F1B66A" wp14:editId="57E308D9">
             <wp:extent cx="5274310" cy="873125"/>
@@ -925,7 +952,7 @@
                     </pic:cNvPicPr>
                   </pic:nvPicPr>
                   <pic:blipFill>
-                    <a:blip r:embed="rId8"/>
+                    <a:blip r:embed="rId9"/>
                     <a:stretch>
                       <a:fillRect/>
                     </a:stretch>
@@ -1011,23 +1038,17 @@
         <w:t>0,0</w:t>
       </w:r>
     </w:p>
-    <w:p>
-      <w:pPr>
-        <w:rPr>
-          <w:rFonts w:hint="eastAsia"/>
-        </w:rPr>
-      </w:pPr>
-    </w:p>
     <w:p/>
-    <w:p>
-      <w:pPr>
-        <w:rPr>
-          <w:rFonts w:hint="eastAsia"/>
-        </w:rPr>
-      </w:pPr>
-    </w:p>
-    <w:p>
-      <w:pPr>
+    <w:p/>
+    <w:p/>
+    <w:p>
+      <w:pPr>
+        <w:pStyle w:val="a9"/>
+        <w:numPr>
+          <w:ilvl w:val="0"/>
+          <w:numId w:val="1"/>
+        </w:numPr>
+        <w:ind w:left="0" w:firstLineChars="0" w:firstLine="0"/>
         <w:rPr>
           <w:b/>
           <w:bCs/>
@@ -1381,25 +1402,7 @@
           <w:sz w:val="24"/>
           <w:szCs w:val="24"/>
         </w:rPr>
-        <w:t>Muscovy</w:t>
-      </w:r>
-      <w:r>
-        <w:rPr>
-          <w:rFonts w:ascii="Times New Roman" w:eastAsia="Times New Roman" w:hAnsi="Times New Roman" w:cs="Times New Roman"/>
-          <w:color w:val="000000"/>
-          <w:sz w:val="24"/>
-          <w:szCs w:val="24"/>
-        </w:rPr>
-        <w:t xml:space="preserve"> </w:t>
-      </w:r>
-      <w:r>
-        <w:rPr>
-          <w:rFonts w:ascii="Times New Roman" w:eastAsia="Times New Roman" w:hAnsi="Times New Roman" w:cs="Times New Roman"/>
-          <w:color w:val="000000"/>
-          <w:sz w:val="24"/>
-          <w:szCs w:val="24"/>
-        </w:rPr>
-        <w:t>or both</w:t>
+        <w:t>Muscovy or both</w:t>
       </w:r>
       <w:r>
         <w:rPr>
@@ -1432,45 +1435,171 @@
     <w:p>
       <w:pPr>
         <w:rPr>
+          <w:rFonts w:ascii="Times New Roman" w:hAnsi="Times New Roman" w:cs="Times New Roman"/>
+          <w:color w:val="000000"/>
+          <w:sz w:val="24"/>
+          <w:szCs w:val="24"/>
+        </w:rPr>
+      </w:pPr>
+      <w:r>
+        <w:rPr>
           <w:rFonts w:ascii="Times New Roman" w:hAnsi="Times New Roman" w:cs="Times New Roman" w:hint="eastAsia"/>
           <w:color w:val="000000"/>
           <w:sz w:val="24"/>
           <w:szCs w:val="24"/>
         </w:rPr>
-      </w:pPr>
-      <w:r>
-        <w:rPr>
-          <w:rFonts w:ascii="Times New Roman" w:hAnsi="Times New Roman" w:cs="Times New Roman" w:hint="eastAsia"/>
-          <w:color w:val="000000"/>
-          <w:sz w:val="24"/>
-          <w:szCs w:val="24"/>
-        </w:rPr>
         <w:t>早期选择的命令：</w:t>
       </w:r>
     </w:p>
     <w:p>
-      <w:pPr>
-        <w:rPr>
-          <w:rFonts w:hint="eastAsia"/>
-          <w:b/>
-          <w:bCs/>
-        </w:rPr>
-      </w:pPr>
-      <w:r>
-        <w:rPr>
-          <w:b/>
-          <w:bCs/>
-        </w:rPr>
-        <w:t xml:space="preserve">python ~/life/src/NGS/Analysis/Detectsignalacrossgenome_master.py -T mallardBJ.VCFBAMconfig -T spotbilledBJ.VCFBAMconfig -R beijingBJ.VCFBAMconfig -R shaoxingBJ.VCFBAMconfig -R lianchengbaiBJ.VCFBAMconfig -R jindingBJ.VCFBAMconfig -R shanmaBJ.VCFBAMconfig -R gaoyouBJ.VCFBAMconfig -R cherryvalleyBJ.VCFBAMconfig -R campbellBJ.VCFBAMconfig -t mspsgjlksy10pop_toplevel_pekingduckref -w 40000 -s 20000 -c /ifs1/User/lrui/database/all_sep_chrfiles/pekingduckchrominfo.5MBPLUS_1 -c /ifs1/User/lrui/database/all_sep_chrfiles/pekingduckchrominfo.2MB_5MB_part1_2 -c /ifs1/User/lrui/database/all_sep_chrfiles/pekingduckchrominfo.2MB_5MB_part2_2 -c /ifs1/User/lrui/database/all_sep_chrfiles/pekingduckchrominfo.100kb_2MB_part1_3 -c /ifs1/User/lrui/database/all_sep_chrfiles/pekingduckchrominfo.100kb_2MB_part2_3 -c </w:t>
-      </w:r>
-      <w:r>
-        <w:rPr>
-          <w:b/>
-          <w:bCs/>
-        </w:rPr>
+      <w:r>
+        <w:t xml:space="preserve">python ~/life/src/NGS/Analysis/Detectsignalacrossgenome_master.py -T mallardBJ.VCFBAMconfig -T spotbilledBJ.VCFBAMconfig -R beijingBJ.VCFBAMconfig -R shaoxingBJ.VCFBAMconfig -R lianchengbaiBJ.VCFBAMconfig -R jindingBJ.VCFBAMconfig -R shanmaBJ.VCFBAMconfig -R gaoyouBJ.VCFBAMconfig -R cherryvalleyBJ.VCFBAMconfig -R campbellBJ.VCFBAMconfig -t mspsgjlksy10pop_toplevel_pekingduckref -w 40000 -s 20000 -c /ifs1/User/lrui/database/all_sep_chrfiles/pekingduckchrominfo.5MBPLUS_1 -c /ifs1/User/lrui/database/all_sep_chrfiles/pekingduckchrominfo.2MB_5MB_part1_2 -c /ifs1/User/lrui/database/all_sep_chrfiles/pekingduckchrominfo.2MB_5MB_part2_2 -c /ifs1/User/lrui/database/all_sep_chrfiles/pekingduckchrominfo.100kb_2MB_part1_3 -c /ifs1/User/lrui/database/all_sep_chrfiles/pekingduckchrominfo.100kb_2MB_part2_3 -c /ifs1/User/lrui/database/all_sep_chrfiles/pekingduckchrominfo.100kb_2MB_part3_3 -c </w:t>
+      </w:r>
+      <w:r>
         <w:lastRenderedPageBreak/>
-        <w:t>/ifs1/User/lrui/database/all_sep_chrfiles/pekingduckchrominfo.100kb_2MB_part3_3 -c /ifs1/User/lrui/database/all_sep_chrfiles/pekingduckchrominfo.100kb_2MB_part4_3 -c /ifs1/User/lrui/database/all_sep_chrfiles/pekingduckchrominfo.100kb_2MB_part5_3 -c /ifs1/User/lrui/database/all_sep_chrfiles/pekingduckchrominfo.40kb_100kb_4 -c /ifs1/User/lrui/database/all_sep_chrfiles/pekingduckchrominfo.5kb_40kb_5 -n 19 -o /ifs1/User/lrui/data/duckproject/configfile/ancientMixChr40k20k -p early -1 ~/life/src/NGS/Slave/Detectsignalacrossgenome_producecorrelation_slave.py -2 ~/life/src/NGS/Slave/Detectsignalacrossgenome_slidewin_slave.py</w:t>
-      </w:r>
+        <w:t>/ifs1/User/lrui/database/all_sep_chrfiles/pekingduckchrominfo.100kb_2MB_part4_3 -c /ifs1/User/lrui/database/all_sep_chrfiles/pekingduckchrominfo.100kb_2MB_part5_3 -c /ifs1/User/lrui/database/all_sep_chrfiles/pekingduckchrominfo.40kb_100kb_4 -c /ifs1/User/lrui/database/all_sep_chrfiles/pekingduckchrominfo.5kb_40kb_5 -n 19 -o /ifs1/User/lrui/data/duckproject/configfile/ancientMixChr40k20k -p early -1 ~/life/src/NGS/Slave/Detectsignalacrossgenome_producecorrelation_slave.py -2 ~/life/src/NGS/Slave/Detectsignalacrossgenome_slidewin_slave.py</w:t>
+      </w:r>
+    </w:p>
+    <w:p>
+      <w:pPr>
+        <w:rPr>
+          <w:b/>
+          <w:bCs/>
+        </w:rPr>
+      </w:pPr>
+    </w:p>
+    <w:p>
+      <w:pPr>
+        <w:rPr>
+          <w:b/>
+          <w:bCs/>
+        </w:rPr>
+      </w:pPr>
+      <w:r>
+        <w:rPr>
+          <w:rFonts w:hint="eastAsia"/>
+          <w:b/>
+          <w:bCs/>
+        </w:rPr>
+        <w:t>分别运行</w:t>
+      </w:r>
+    </w:p>
+    <w:p>
+      <w:pPr>
+        <w:rPr>
+          <w:b/>
+          <w:bCs/>
+        </w:rPr>
+      </w:pPr>
+      <w:r>
+        <w:rPr>
+          <w:rFonts w:hint="eastAsia"/>
+          <w:b/>
+          <w:bCs/>
+        </w:rPr>
+        <w:t>区分a</w:t>
+      </w:r>
+      <w:r>
+        <w:rPr>
+          <w:b/>
+          <w:bCs/>
+        </w:rPr>
+        <w:t>utosome/sex</w:t>
+      </w:r>
+      <w:r>
+        <w:rPr>
+          <w:rFonts w:hint="eastAsia"/>
+          <w:b/>
+          <w:bCs/>
+        </w:rPr>
+        <w:t>（40</w:t>
+      </w:r>
+      <w:r>
+        <w:rPr>
+          <w:b/>
+          <w:bCs/>
+        </w:rPr>
+        <w:t>k20k</w:t>
+      </w:r>
+      <w:r>
+        <w:rPr>
+          <w:rFonts w:hint="eastAsia"/>
+          <w:b/>
+          <w:bCs/>
+        </w:rPr>
+        <w:t>）</w:t>
+      </w:r>
+    </w:p>
+    <w:p>
+      <w:pPr>
+        <w:rPr>
+          <w:b/>
+          <w:bCs/>
+        </w:rPr>
+      </w:pPr>
+      <w:r>
+        <w:rPr>
+          <w:rFonts w:hint="eastAsia"/>
+          <w:b/>
+          <w:bCs/>
+        </w:rPr>
+        <w:t>不区分au</w:t>
+      </w:r>
+      <w:r>
+        <w:rPr>
+          <w:b/>
+          <w:bCs/>
+        </w:rPr>
+        <w:t>to/sex</w:t>
+      </w:r>
+      <w:r>
+        <w:rPr>
+          <w:rFonts w:hint="eastAsia"/>
+          <w:b/>
+          <w:bCs/>
+        </w:rPr>
+        <w:t>的十个列表文件(</w:t>
+      </w:r>
+      <w:r>
+        <w:rPr>
+          <w:b/>
+          <w:bCs/>
+        </w:rPr>
+        <w:t>40k20k 20k10k)</w:t>
+      </w:r>
+    </w:p>
+    <w:p>
+      <w:pPr>
+        <w:rPr>
+          <w:b/>
+          <w:bCs/>
+        </w:rPr>
+      </w:pPr>
+    </w:p>
+    <w:p>
+      <w:pPr>
+        <w:pStyle w:val="a9"/>
+        <w:numPr>
+          <w:ilvl w:val="0"/>
+          <w:numId w:val="1"/>
+        </w:numPr>
+        <w:ind w:firstLineChars="0"/>
+        <w:rPr>
+          <w:rFonts w:hint="eastAsia"/>
+          <w:b/>
+          <w:bCs/>
+        </w:rPr>
+      </w:pPr>
+      <w:r>
+        <w:rPr>
+          <w:rFonts w:hint="eastAsia"/>
+          <w:b/>
+          <w:bCs/>
+        </w:rPr>
+        <w:t>找到受选择区域，同时注释受选择区域基因并做功能富集分析。</w:t>
+      </w:r>
+      <w:bookmarkStart w:id="0" w:name="_GoBack"/>
+      <w:bookmarkEnd w:id="0"/>
     </w:p>
     <w:sectPr>
       <w:pgSz w:w="11906" w:h="16838"/>
@@ -1518,6 +1647,367 @@
     </w:p>
   </w:footnote>
 </w:footnotes>
+</file>
+
+<file path=word/numbering.xml><?xml version="1.0" encoding="utf-8"?>
+<w:numbering xmlns:wpc="http://schemas.microsoft.com/office/word/2010/wordprocessingCanvas" xmlns:cx="http://schemas.microsoft.com/office/drawing/2014/chartex" xmlns:cx1="http://schemas.microsoft.com/office/drawing/2015/9/8/chartex" xmlns:cx2="http://schemas.microsoft.com/office/drawing/2015/10/21/chartex" xmlns:cx3="http://schemas.microsoft.com/office/drawing/2016/5/9/chartex" xmlns:cx4="http://schemas.microsoft.com/office/drawing/2016/5/10/chartex" xmlns:cx5="http://schemas.microsoft.com/office/drawing/2016/5/11/chartex" xmlns:cx6="http://schemas.microsoft.com/office/drawing/2016/5/12/chartex" xmlns:cx7="http://schemas.microsoft.com/office/drawing/2016/5/13/chartex" xmlns:cx8="http://schemas.microsoft.com/office/drawing/2016/5/14/chartex" xmlns:mc="http://schemas.openxmlformats.org/markup-compatibility/2006" xmlns:aink="http://schemas.microsoft.com/office/drawing/2016/ink" xmlns:am3d="http://schemas.microsoft.com/office/drawing/2017/model3d" xmlns:o="urn:schemas-microsoft-com:office:office" xmlns:r="http://schemas.openxmlformats.org/officeDocument/2006/relationships" xmlns:m="http://schemas.openxmlformats.org/officeDocument/2006/math" xmlns:v="urn:schemas-microsoft-com:vml" xmlns:wp14="http://schemas.microsoft.com/office/word/2010/wordprocessingDrawing" xmlns:wp="http://schemas.openxmlformats.org/drawingml/2006/wordprocessingDrawing" xmlns:w10="urn:schemas-microsoft-com:office:word" xmlns:w="http://schemas.openxmlformats.org/wordprocessingml/2006/main" xmlns:w14="http://schemas.microsoft.com/office/word/2010/wordml" xmlns:w15="http://schemas.microsoft.com/office/word/2012/wordml" xmlns:w16cid="http://schemas.microsoft.com/office/word/2016/wordml/cid" xmlns:w16se="http://schemas.microsoft.com/office/word/2015/wordml/symex" xmlns:wpg="http://schemas.microsoft.com/office/word/2010/wordprocessingGroup" xmlns:wpi="http://schemas.microsoft.com/office/word/2010/wordprocessingInk" xmlns:wne="http://schemas.microsoft.com/office/word/2006/wordml" xmlns:wps="http://schemas.microsoft.com/office/word/2010/wordprocessingShape" mc:Ignorable="w14 w15 w16se w16cid wp14">
+  <w:abstractNum w:abstractNumId="0" w15:restartNumberingAfterBreak="0">
+    <w:nsid w:val="07847F0A"/>
+    <w:multiLevelType w:val="hybridMultilevel"/>
+    <w:tmpl w:val="0EFC3DCC"/>
+    <w:lvl w:ilvl="0" w:tplc="0409000F">
+      <w:start w:val="1"/>
+      <w:numFmt w:val="decimal"/>
+      <w:lvlText w:val="%1."/>
+      <w:lvlJc w:val="left"/>
+      <w:pPr>
+        <w:ind w:left="420" w:hanging="420"/>
+      </w:pPr>
+    </w:lvl>
+    <w:lvl w:ilvl="1" w:tplc="04090019" w:tentative="1">
+      <w:start w:val="1"/>
+      <w:numFmt w:val="lowerLetter"/>
+      <w:lvlText w:val="%2)"/>
+      <w:lvlJc w:val="left"/>
+      <w:pPr>
+        <w:ind w:left="840" w:hanging="420"/>
+      </w:pPr>
+    </w:lvl>
+    <w:lvl w:ilvl="2" w:tplc="0409001B" w:tentative="1">
+      <w:start w:val="1"/>
+      <w:numFmt w:val="lowerRoman"/>
+      <w:lvlText w:val="%3."/>
+      <w:lvlJc w:val="right"/>
+      <w:pPr>
+        <w:ind w:left="1260" w:hanging="420"/>
+      </w:pPr>
+    </w:lvl>
+    <w:lvl w:ilvl="3" w:tplc="0409000F" w:tentative="1">
+      <w:start w:val="1"/>
+      <w:numFmt w:val="decimal"/>
+      <w:lvlText w:val="%4."/>
+      <w:lvlJc w:val="left"/>
+      <w:pPr>
+        <w:ind w:left="1680" w:hanging="420"/>
+      </w:pPr>
+    </w:lvl>
+    <w:lvl w:ilvl="4" w:tplc="04090019" w:tentative="1">
+      <w:start w:val="1"/>
+      <w:numFmt w:val="lowerLetter"/>
+      <w:lvlText w:val="%5)"/>
+      <w:lvlJc w:val="left"/>
+      <w:pPr>
+        <w:ind w:left="2100" w:hanging="420"/>
+      </w:pPr>
+    </w:lvl>
+    <w:lvl w:ilvl="5" w:tplc="0409001B" w:tentative="1">
+      <w:start w:val="1"/>
+      <w:numFmt w:val="lowerRoman"/>
+      <w:lvlText w:val="%6."/>
+      <w:lvlJc w:val="right"/>
+      <w:pPr>
+        <w:ind w:left="2520" w:hanging="420"/>
+      </w:pPr>
+    </w:lvl>
+    <w:lvl w:ilvl="6" w:tplc="0409000F" w:tentative="1">
+      <w:start w:val="1"/>
+      <w:numFmt w:val="decimal"/>
+      <w:lvlText w:val="%7."/>
+      <w:lvlJc w:val="left"/>
+      <w:pPr>
+        <w:ind w:left="2940" w:hanging="420"/>
+      </w:pPr>
+    </w:lvl>
+    <w:lvl w:ilvl="7" w:tplc="04090019" w:tentative="1">
+      <w:start w:val="1"/>
+      <w:numFmt w:val="lowerLetter"/>
+      <w:lvlText w:val="%8)"/>
+      <w:lvlJc w:val="left"/>
+      <w:pPr>
+        <w:ind w:left="3360" w:hanging="420"/>
+      </w:pPr>
+    </w:lvl>
+    <w:lvl w:ilvl="8" w:tplc="0409001B" w:tentative="1">
+      <w:start w:val="1"/>
+      <w:numFmt w:val="lowerRoman"/>
+      <w:lvlText w:val="%9."/>
+      <w:lvlJc w:val="right"/>
+      <w:pPr>
+        <w:ind w:left="3780" w:hanging="420"/>
+      </w:pPr>
+    </w:lvl>
+  </w:abstractNum>
+  <w:abstractNum w:abstractNumId="1" w15:restartNumberingAfterBreak="0">
+    <w:nsid w:val="0CA12C6F"/>
+    <w:multiLevelType w:val="hybridMultilevel"/>
+    <w:tmpl w:val="C8669752"/>
+    <w:lvl w:ilvl="0" w:tplc="0409000F">
+      <w:start w:val="1"/>
+      <w:numFmt w:val="decimal"/>
+      <w:lvlText w:val="%1."/>
+      <w:lvlJc w:val="left"/>
+      <w:pPr>
+        <w:ind w:left="420" w:hanging="420"/>
+      </w:pPr>
+    </w:lvl>
+    <w:lvl w:ilvl="1" w:tplc="04090019" w:tentative="1">
+      <w:start w:val="1"/>
+      <w:numFmt w:val="lowerLetter"/>
+      <w:lvlText w:val="%2)"/>
+      <w:lvlJc w:val="left"/>
+      <w:pPr>
+        <w:ind w:left="840" w:hanging="420"/>
+      </w:pPr>
+    </w:lvl>
+    <w:lvl w:ilvl="2" w:tplc="0409001B" w:tentative="1">
+      <w:start w:val="1"/>
+      <w:numFmt w:val="lowerRoman"/>
+      <w:lvlText w:val="%3."/>
+      <w:lvlJc w:val="right"/>
+      <w:pPr>
+        <w:ind w:left="1260" w:hanging="420"/>
+      </w:pPr>
+    </w:lvl>
+    <w:lvl w:ilvl="3" w:tplc="0409000F" w:tentative="1">
+      <w:start w:val="1"/>
+      <w:numFmt w:val="decimal"/>
+      <w:lvlText w:val="%4."/>
+      <w:lvlJc w:val="left"/>
+      <w:pPr>
+        <w:ind w:left="1680" w:hanging="420"/>
+      </w:pPr>
+    </w:lvl>
+    <w:lvl w:ilvl="4" w:tplc="04090019" w:tentative="1">
+      <w:start w:val="1"/>
+      <w:numFmt w:val="lowerLetter"/>
+      <w:lvlText w:val="%5)"/>
+      <w:lvlJc w:val="left"/>
+      <w:pPr>
+        <w:ind w:left="2100" w:hanging="420"/>
+      </w:pPr>
+    </w:lvl>
+    <w:lvl w:ilvl="5" w:tplc="0409001B" w:tentative="1">
+      <w:start w:val="1"/>
+      <w:numFmt w:val="lowerRoman"/>
+      <w:lvlText w:val="%6."/>
+      <w:lvlJc w:val="right"/>
+      <w:pPr>
+        <w:ind w:left="2520" w:hanging="420"/>
+      </w:pPr>
+    </w:lvl>
+    <w:lvl w:ilvl="6" w:tplc="0409000F" w:tentative="1">
+      <w:start w:val="1"/>
+      <w:numFmt w:val="decimal"/>
+      <w:lvlText w:val="%7."/>
+      <w:lvlJc w:val="left"/>
+      <w:pPr>
+        <w:ind w:left="2940" w:hanging="420"/>
+      </w:pPr>
+    </w:lvl>
+    <w:lvl w:ilvl="7" w:tplc="04090019" w:tentative="1">
+      <w:start w:val="1"/>
+      <w:numFmt w:val="lowerLetter"/>
+      <w:lvlText w:val="%8)"/>
+      <w:lvlJc w:val="left"/>
+      <w:pPr>
+        <w:ind w:left="3360" w:hanging="420"/>
+      </w:pPr>
+    </w:lvl>
+    <w:lvl w:ilvl="8" w:tplc="0409001B" w:tentative="1">
+      <w:start w:val="1"/>
+      <w:numFmt w:val="lowerRoman"/>
+      <w:lvlText w:val="%9."/>
+      <w:lvlJc w:val="right"/>
+      <w:pPr>
+        <w:ind w:left="3780" w:hanging="420"/>
+      </w:pPr>
+    </w:lvl>
+  </w:abstractNum>
+  <w:abstractNum w:abstractNumId="2" w15:restartNumberingAfterBreak="0">
+    <w:nsid w:val="3BC66728"/>
+    <w:multiLevelType w:val="hybridMultilevel"/>
+    <w:tmpl w:val="674E8EDC"/>
+    <w:lvl w:ilvl="0" w:tplc="0409000F">
+      <w:start w:val="1"/>
+      <w:numFmt w:val="decimal"/>
+      <w:lvlText w:val="%1."/>
+      <w:lvlJc w:val="left"/>
+      <w:pPr>
+        <w:ind w:left="420" w:hanging="420"/>
+      </w:pPr>
+    </w:lvl>
+    <w:lvl w:ilvl="1" w:tplc="04090019" w:tentative="1">
+      <w:start w:val="1"/>
+      <w:numFmt w:val="lowerLetter"/>
+      <w:lvlText w:val="%2)"/>
+      <w:lvlJc w:val="left"/>
+      <w:pPr>
+        <w:ind w:left="840" w:hanging="420"/>
+      </w:pPr>
+    </w:lvl>
+    <w:lvl w:ilvl="2" w:tplc="0409001B" w:tentative="1">
+      <w:start w:val="1"/>
+      <w:numFmt w:val="lowerRoman"/>
+      <w:lvlText w:val="%3."/>
+      <w:lvlJc w:val="right"/>
+      <w:pPr>
+        <w:ind w:left="1260" w:hanging="420"/>
+      </w:pPr>
+    </w:lvl>
+    <w:lvl w:ilvl="3" w:tplc="0409000F" w:tentative="1">
+      <w:start w:val="1"/>
+      <w:numFmt w:val="decimal"/>
+      <w:lvlText w:val="%4."/>
+      <w:lvlJc w:val="left"/>
+      <w:pPr>
+        <w:ind w:left="1680" w:hanging="420"/>
+      </w:pPr>
+    </w:lvl>
+    <w:lvl w:ilvl="4" w:tplc="04090019" w:tentative="1">
+      <w:start w:val="1"/>
+      <w:numFmt w:val="lowerLetter"/>
+      <w:lvlText w:val="%5)"/>
+      <w:lvlJc w:val="left"/>
+      <w:pPr>
+        <w:ind w:left="2100" w:hanging="420"/>
+      </w:pPr>
+    </w:lvl>
+    <w:lvl w:ilvl="5" w:tplc="0409001B" w:tentative="1">
+      <w:start w:val="1"/>
+      <w:numFmt w:val="lowerRoman"/>
+      <w:lvlText w:val="%6."/>
+      <w:lvlJc w:val="right"/>
+      <w:pPr>
+        <w:ind w:left="2520" w:hanging="420"/>
+      </w:pPr>
+    </w:lvl>
+    <w:lvl w:ilvl="6" w:tplc="0409000F" w:tentative="1">
+      <w:start w:val="1"/>
+      <w:numFmt w:val="decimal"/>
+      <w:lvlText w:val="%7."/>
+      <w:lvlJc w:val="left"/>
+      <w:pPr>
+        <w:ind w:left="2940" w:hanging="420"/>
+      </w:pPr>
+    </w:lvl>
+    <w:lvl w:ilvl="7" w:tplc="04090019" w:tentative="1">
+      <w:start w:val="1"/>
+      <w:numFmt w:val="lowerLetter"/>
+      <w:lvlText w:val="%8)"/>
+      <w:lvlJc w:val="left"/>
+      <w:pPr>
+        <w:ind w:left="3360" w:hanging="420"/>
+      </w:pPr>
+    </w:lvl>
+    <w:lvl w:ilvl="8" w:tplc="0409001B" w:tentative="1">
+      <w:start w:val="1"/>
+      <w:numFmt w:val="lowerRoman"/>
+      <w:lvlText w:val="%9."/>
+      <w:lvlJc w:val="right"/>
+      <w:pPr>
+        <w:ind w:left="3780" w:hanging="420"/>
+      </w:pPr>
+    </w:lvl>
+  </w:abstractNum>
+  <w:abstractNum w:abstractNumId="3" w15:restartNumberingAfterBreak="0">
+    <w:nsid w:val="7F7E6582"/>
+    <w:multiLevelType w:val="hybridMultilevel"/>
+    <w:tmpl w:val="0AFCD7C0"/>
+    <w:lvl w:ilvl="0" w:tplc="0409000F">
+      <w:start w:val="1"/>
+      <w:numFmt w:val="decimal"/>
+      <w:lvlText w:val="%1."/>
+      <w:lvlJc w:val="left"/>
+      <w:pPr>
+        <w:ind w:left="420" w:hanging="420"/>
+      </w:pPr>
+    </w:lvl>
+    <w:lvl w:ilvl="1" w:tplc="04090019" w:tentative="1">
+      <w:start w:val="1"/>
+      <w:numFmt w:val="lowerLetter"/>
+      <w:lvlText w:val="%2)"/>
+      <w:lvlJc w:val="left"/>
+      <w:pPr>
+        <w:ind w:left="840" w:hanging="420"/>
+      </w:pPr>
+    </w:lvl>
+    <w:lvl w:ilvl="2" w:tplc="0409001B" w:tentative="1">
+      <w:start w:val="1"/>
+      <w:numFmt w:val="lowerRoman"/>
+      <w:lvlText w:val="%3."/>
+      <w:lvlJc w:val="right"/>
+      <w:pPr>
+        <w:ind w:left="1260" w:hanging="420"/>
+      </w:pPr>
+    </w:lvl>
+    <w:lvl w:ilvl="3" w:tplc="0409000F" w:tentative="1">
+      <w:start w:val="1"/>
+      <w:numFmt w:val="decimal"/>
+      <w:lvlText w:val="%4."/>
+      <w:lvlJc w:val="left"/>
+      <w:pPr>
+        <w:ind w:left="1680" w:hanging="420"/>
+      </w:pPr>
+    </w:lvl>
+    <w:lvl w:ilvl="4" w:tplc="04090019" w:tentative="1">
+      <w:start w:val="1"/>
+      <w:numFmt w:val="lowerLetter"/>
+      <w:lvlText w:val="%5)"/>
+      <w:lvlJc w:val="left"/>
+      <w:pPr>
+        <w:ind w:left="2100" w:hanging="420"/>
+      </w:pPr>
+    </w:lvl>
+    <w:lvl w:ilvl="5" w:tplc="0409001B" w:tentative="1">
+      <w:start w:val="1"/>
+      <w:numFmt w:val="lowerRoman"/>
+      <w:lvlText w:val="%6."/>
+      <w:lvlJc w:val="right"/>
+      <w:pPr>
+        <w:ind w:left="2520" w:hanging="420"/>
+      </w:pPr>
+    </w:lvl>
+    <w:lvl w:ilvl="6" w:tplc="0409000F" w:tentative="1">
+      <w:start w:val="1"/>
+      <w:numFmt w:val="decimal"/>
+      <w:lvlText w:val="%7."/>
+      <w:lvlJc w:val="left"/>
+      <w:pPr>
+        <w:ind w:left="2940" w:hanging="420"/>
+      </w:pPr>
+    </w:lvl>
+    <w:lvl w:ilvl="7" w:tplc="04090019" w:tentative="1">
+      <w:start w:val="1"/>
+      <w:numFmt w:val="lowerLetter"/>
+      <w:lvlText w:val="%8)"/>
+      <w:lvlJc w:val="left"/>
+      <w:pPr>
+        <w:ind w:left="3360" w:hanging="420"/>
+      </w:pPr>
+    </w:lvl>
+    <w:lvl w:ilvl="8" w:tplc="0409001B" w:tentative="1">
+      <w:start w:val="1"/>
+      <w:numFmt w:val="lowerRoman"/>
+      <w:lvlText w:val="%9."/>
+      <w:lvlJc w:val="right"/>
+      <w:pPr>
+        <w:ind w:left="3780" w:hanging="420"/>
+      </w:pPr>
+    </w:lvl>
+  </w:abstractNum>
+  <w:num w:numId="1">
+    <w:abstractNumId w:val="2"/>
+  </w:num>
+  <w:num w:numId="2">
+    <w:abstractNumId w:val="3"/>
+  </w:num>
+  <w:num w:numId="3">
+    <w:abstractNumId w:val="1"/>
+  </w:num>
+  <w:num w:numId="4">
+    <w:abstractNumId w:val="0"/>
+  </w:num>
+</w:numbering>
 </file>
 
 <file path=word/styles.xml><?xml version="1.0" encoding="utf-8"?>
@@ -1924,6 +2414,7 @@
   <w:style w:type="character" w:default="1" w:styleId="a0">
     <w:name w:val="Default Paragraph Font"/>
     <w:uiPriority w:val="1"/>
+    <w:semiHidden/>
     <w:unhideWhenUsed/>
   </w:style>
   <w:style w:type="table" w:default="1" w:styleId="a1">
@@ -2036,6 +2527,16 @@
       <w:sz w:val="18"/>
       <w:szCs w:val="18"/>
     </w:rPr>
+  </w:style>
+  <w:style w:type="paragraph" w:styleId="a9">
+    <w:name w:val="List Paragraph"/>
+    <w:basedOn w:val="a"/>
+    <w:uiPriority w:val="34"/>
+    <w:qFormat/>
+    <w:rsid w:val="003A5BC6"/>
+    <w:pPr>
+      <w:ind w:firstLineChars="200" w:firstLine="420"/>
+    </w:pPr>
   </w:style>
 </w:styles>
 </file>

</xml_diff>

<commit_message>
modify  ancient selection value calculation
</commit_message>
<xml_diff>
--- a/ancient seletion早期选择分析.docx
+++ b/ancient seletion早期选择分析.docx
@@ -78,27 +78,75 @@
     </w:p>
     <w:p>
       <w:r>
-        <w:t xml:space="preserve">`chrID` char(128) NOT NULL DEFAULT '',                               </w:t>
-      </w:r>
-    </w:p>
-    <w:p>
-      <w:r>
-        <w:t xml:space="preserve">`snp_pos` bigint(20) NOT NULL DEFAULT '0',                           </w:t>
-      </w:r>
-    </w:p>
-    <w:p>
-      <w:r>
-        <w:t xml:space="preserve">`snpID` char(128) NOT NULL,                                          </w:t>
-      </w:r>
-    </w:p>
-    <w:p>
-      <w:r>
-        <w:t xml:space="preserve">`ref_base` varchar(1000) DEFAULT NULL,                               </w:t>
-      </w:r>
-    </w:p>
-    <w:p>
-      <w:r>
-        <w:t xml:space="preserve">`alt_base` varchar(1000) DEFAULT NULL,                               </w:t>
+        <w:t>`</w:t>
+      </w:r>
+      <w:proofErr w:type="spellStart"/>
+      <w:r>
+        <w:t>chrID</w:t>
+      </w:r>
+      <w:proofErr w:type="spellEnd"/>
+      <w:r>
+        <w:t xml:space="preserve">` char(128) NOT NULL DEFAULT '',                               </w:t>
+      </w:r>
+    </w:p>
+    <w:p>
+      <w:r>
+        <w:t>`</w:t>
+      </w:r>
+      <w:proofErr w:type="spellStart"/>
+      <w:r>
+        <w:t>snp_pos</w:t>
+      </w:r>
+      <w:proofErr w:type="spellEnd"/>
+      <w:r>
+        <w:t xml:space="preserve">` </w:t>
+      </w:r>
+      <w:proofErr w:type="spellStart"/>
+      <w:r>
+        <w:t>bigint</w:t>
+      </w:r>
+      <w:proofErr w:type="spellEnd"/>
+      <w:r>
+        <w:t xml:space="preserve">(20) NOT NULL DEFAULT '0',                           </w:t>
+      </w:r>
+    </w:p>
+    <w:p>
+      <w:r>
+        <w:t>`</w:t>
+      </w:r>
+      <w:proofErr w:type="spellStart"/>
+      <w:r>
+        <w:t>snpID</w:t>
+      </w:r>
+      <w:proofErr w:type="spellEnd"/>
+      <w:r>
+        <w:t xml:space="preserve">` char(128) NOT NULL,                                          </w:t>
+      </w:r>
+    </w:p>
+    <w:p>
+      <w:r>
+        <w:t>`</w:t>
+      </w:r>
+      <w:proofErr w:type="spellStart"/>
+      <w:r>
+        <w:t>ref_base</w:t>
+      </w:r>
+      <w:proofErr w:type="spellEnd"/>
+      <w:r>
+        <w:t xml:space="preserve">` varchar(1000) DEFAULT NULL,                               </w:t>
+      </w:r>
+    </w:p>
+    <w:p>
+      <w:r>
+        <w:t>`</w:t>
+      </w:r>
+      <w:proofErr w:type="spellStart"/>
+      <w:r>
+        <w:t>alt_base</w:t>
+      </w:r>
+      <w:proofErr w:type="spellEnd"/>
+      <w:r>
+        <w:t xml:space="preserve">` varchar(1000) DEFAULT NULL,                               </w:t>
       </w:r>
     </w:p>
     <w:p>
@@ -108,12 +156,44 @@
     </w:p>
     <w:p>
       <w:r>
-        <w:t xml:space="preserve">`wegeon__pool_withindel_vcf_alt` char(128) DEFAULT NULL,             </w:t>
-      </w:r>
-    </w:p>
-    <w:p>
-      <w:r>
-        <w:t xml:space="preserve">`wegeon__pool_withindel_vcf_dep` char(128) DEFAULT NULL,             </w:t>
+        <w:t>`</w:t>
+      </w:r>
+      <w:proofErr w:type="spellStart"/>
+      <w:r>
+        <w:t>wegeon</w:t>
+      </w:r>
+      <w:proofErr w:type="spellEnd"/>
+      <w:r>
+        <w:t>__</w:t>
+      </w:r>
+      <w:proofErr w:type="spellStart"/>
+      <w:r>
+        <w:t>pool_withindel_vcf_alt</w:t>
+      </w:r>
+      <w:proofErr w:type="spellEnd"/>
+      <w:r>
+        <w:t xml:space="preserve">` char(128) DEFAULT NULL,             </w:t>
+      </w:r>
+    </w:p>
+    <w:p>
+      <w:r>
+        <w:t>`</w:t>
+      </w:r>
+      <w:proofErr w:type="spellStart"/>
+      <w:r>
+        <w:t>wegeon</w:t>
+      </w:r>
+      <w:proofErr w:type="spellEnd"/>
+      <w:r>
+        <w:t>__</w:t>
+      </w:r>
+      <w:proofErr w:type="spellStart"/>
+      <w:r>
+        <w:t>pool_withindel_vcf_dep</w:t>
+      </w:r>
+      <w:proofErr w:type="spellEnd"/>
+      <w:r>
+        <w:t xml:space="preserve">` char(128) DEFAULT NULL,             </w:t>
       </w:r>
     </w:p>
     <w:p>
@@ -128,38 +208,99 @@
     </w:p>
     <w:p>
       <w:r>
-        <w:t xml:space="preserve">`barheadedgoose_pool_withindel_vcf_alt` char(128) DEFAULT NULL,      </w:t>
-      </w:r>
-    </w:p>
-    <w:p>
-      <w:r>
-        <w:t xml:space="preserve">`barheadedgoose_pool_withindel_vcf_dep` char(128) DEFAULT NULL,      </w:t>
-      </w:r>
-    </w:p>
-    <w:p>
-      <w:r>
-        <w:t xml:space="preserve">`taihudomesticgoose_pool_withindel_vcf_alt` char(128) DEFAULT NULL,  </w:t>
-      </w:r>
-    </w:p>
-    <w:p>
-      <w:r>
-        <w:t xml:space="preserve">`taihudomesticgoose_pool_withindel_vcf_dep` char(128) DEFAULT NULL,  </w:t>
-      </w:r>
-    </w:p>
-    <w:p>
-      <w:r>
-        <w:t xml:space="preserve">PRIMARY KEY (`chrID`,`snp_pos`)                                      </w:t>
-      </w:r>
-    </w:p>
-    <w:p>
-      <w:r>
-        <w:t>) ENGINE=InnoDB DEFAULT CHARSET=utf8</w:t>
+        <w:t>`</w:t>
+      </w:r>
+      <w:proofErr w:type="spellStart"/>
+      <w:r>
+        <w:t>barheadedgoose_pool_withindel_vcf_alt</w:t>
+      </w:r>
+      <w:proofErr w:type="spellEnd"/>
+      <w:r>
+        <w:t xml:space="preserve">` char(128) DEFAULT NULL,      </w:t>
+      </w:r>
+    </w:p>
+    <w:p>
+      <w:r>
+        <w:t>`</w:t>
+      </w:r>
+      <w:proofErr w:type="spellStart"/>
+      <w:r>
+        <w:t>barheadedgoose_pool_withindel_vcf_dep</w:t>
+      </w:r>
+      <w:proofErr w:type="spellEnd"/>
+      <w:r>
+        <w:t xml:space="preserve">` char(128) DEFAULT NULL,      </w:t>
+      </w:r>
+    </w:p>
+    <w:p>
+      <w:r>
+        <w:t>`</w:t>
+      </w:r>
+      <w:proofErr w:type="spellStart"/>
+      <w:r>
+        <w:t>taihudomesticgoose_pool_withindel_vcf_alt</w:t>
+      </w:r>
+      <w:proofErr w:type="spellEnd"/>
+      <w:r>
+        <w:t xml:space="preserve">` char(128) DEFAULT NULL,  </w:t>
+      </w:r>
+    </w:p>
+    <w:p>
+      <w:r>
+        <w:t>`</w:t>
+      </w:r>
+      <w:proofErr w:type="spellStart"/>
+      <w:r>
+        <w:t>taihudomesticgoose_pool_withindel_vcf_dep</w:t>
+      </w:r>
+      <w:proofErr w:type="spellEnd"/>
+      <w:r>
+        <w:t xml:space="preserve">` char(128) DEFAULT NULL,  </w:t>
+      </w:r>
+    </w:p>
+    <w:p>
+      <w:r>
+        <w:t>PRIMARY KEY (`</w:t>
+      </w:r>
+      <w:proofErr w:type="spellStart"/>
+      <w:r>
+        <w:t>chrID</w:t>
+      </w:r>
+      <w:proofErr w:type="spellEnd"/>
+      <w:r>
+        <w:t>`,`</w:t>
+      </w:r>
+      <w:proofErr w:type="spellStart"/>
+      <w:r>
+        <w:t>snp_pos</w:t>
+      </w:r>
+      <w:proofErr w:type="spellEnd"/>
+      <w:r>
+        <w:t xml:space="preserve">`)                                      </w:t>
+      </w:r>
+    </w:p>
+    <w:p>
+      <w:r>
+        <w:t>) ENGINE=</w:t>
+      </w:r>
+      <w:proofErr w:type="spellStart"/>
+      <w:r>
+        <w:t>InnoDB</w:t>
+      </w:r>
+      <w:proofErr w:type="spellEnd"/>
+      <w:r>
+        <w:t xml:space="preserve"> DEFAULT CHARSET=utf8</w:t>
       </w:r>
     </w:p>
     <w:p/>
     <w:p>
-      <w:r>
-        <w:t>Thit table can be initially create by such command:</w:t>
+      <w:proofErr w:type="spellStart"/>
+      <w:r>
+        <w:t>Thit</w:t>
+      </w:r>
+      <w:proofErr w:type="spellEnd"/>
+      <w:r>
+        <w:t xml:space="preserve"> table can be initially create by such command:</w:t>
       </w:r>
     </w:p>
     <w:p>
@@ -185,20 +326,21 @@
         <w:rPr>
           <w:color w:val="FF0000"/>
         </w:rPr>
-        <w:t xml:space="preserve">`chrID` char(128) NOT NULL DEFAULT '',                               </w:t>
-      </w:r>
-    </w:p>
-    <w:p>
-      <w:pPr>
+        <w:t>`</w:t>
+      </w:r>
+      <w:proofErr w:type="spellStart"/>
+      <w:r>
         <w:rPr>
           <w:color w:val="FF0000"/>
         </w:rPr>
-      </w:pPr>
+        <w:t>chrID</w:t>
+      </w:r>
+      <w:proofErr w:type="spellEnd"/>
       <w:r>
         <w:rPr>
           <w:color w:val="FF0000"/>
         </w:rPr>
-        <w:t xml:space="preserve">`snp_pos` bigint(20) NOT NULL DEFAULT '0',                           </w:t>
+        <w:t xml:space="preserve">` char(128) NOT NULL DEFAULT '',                               </w:t>
       </w:r>
     </w:p>
     <w:p>
@@ -211,33 +353,35 @@
         <w:rPr>
           <w:color w:val="FF0000"/>
         </w:rPr>
-        <w:t xml:space="preserve">`snpID` char(128) NOT NULL,                                          </w:t>
-      </w:r>
-    </w:p>
-    <w:p>
-      <w:pPr>
+        <w:t>`</w:t>
+      </w:r>
+      <w:proofErr w:type="spellStart"/>
+      <w:r>
         <w:rPr>
           <w:color w:val="FF0000"/>
         </w:rPr>
-      </w:pPr>
+        <w:t>snp_pos</w:t>
+      </w:r>
+      <w:proofErr w:type="spellEnd"/>
       <w:r>
         <w:rPr>
           <w:color w:val="FF0000"/>
         </w:rPr>
-        <w:t xml:space="preserve">`ref_base` varchar(1000) DEFAULT NULL,                               </w:t>
-      </w:r>
-    </w:p>
-    <w:p>
-      <w:pPr>
+        <w:t xml:space="preserve">` </w:t>
+      </w:r>
+      <w:proofErr w:type="spellStart"/>
+      <w:r>
         <w:rPr>
           <w:color w:val="FF0000"/>
         </w:rPr>
-      </w:pPr>
+        <w:t>bigint</w:t>
+      </w:r>
+      <w:proofErr w:type="spellEnd"/>
       <w:r>
         <w:rPr>
           <w:color w:val="FF0000"/>
         </w:rPr>
-        <w:t xml:space="preserve">`alt_base` varchar(1000) DEFAULT NULL,                               </w:t>
+        <w:t xml:space="preserve">(20) NOT NULL DEFAULT '0',                           </w:t>
       </w:r>
     </w:p>
     <w:p>
@@ -250,20 +394,143 @@
         <w:rPr>
           <w:color w:val="FF0000"/>
         </w:rPr>
-        <w:t xml:space="preserve">`context` varchar(3) DEFAULT NULL, PRIMARY KEY (`chrID`,`snp_pos`)                                      </w:t>
-      </w:r>
-    </w:p>
-    <w:p>
-      <w:pPr>
+        <w:t>`</w:t>
+      </w:r>
+      <w:proofErr w:type="spellStart"/>
+      <w:r>
         <w:rPr>
           <w:color w:val="FF0000"/>
         </w:rPr>
-      </w:pPr>
+        <w:t>snpID</w:t>
+      </w:r>
+      <w:proofErr w:type="spellEnd"/>
       <w:r>
         <w:rPr>
           <w:color w:val="FF0000"/>
         </w:rPr>
-        <w:t>) ENGINE=InnoDB DEFAULT CHARSET=utf8</w:t>
+        <w:t xml:space="preserve">` char(128) NOT NULL,                                          </w:t>
+      </w:r>
+    </w:p>
+    <w:p>
+      <w:pPr>
+        <w:rPr>
+          <w:color w:val="FF0000"/>
+        </w:rPr>
+      </w:pPr>
+      <w:r>
+        <w:rPr>
+          <w:color w:val="FF0000"/>
+        </w:rPr>
+        <w:t>`</w:t>
+      </w:r>
+      <w:proofErr w:type="spellStart"/>
+      <w:r>
+        <w:rPr>
+          <w:color w:val="FF0000"/>
+        </w:rPr>
+        <w:t>ref_base</w:t>
+      </w:r>
+      <w:proofErr w:type="spellEnd"/>
+      <w:r>
+        <w:rPr>
+          <w:color w:val="FF0000"/>
+        </w:rPr>
+        <w:t xml:space="preserve">` varchar(1000) DEFAULT NULL,                               </w:t>
+      </w:r>
+    </w:p>
+    <w:p>
+      <w:pPr>
+        <w:rPr>
+          <w:color w:val="FF0000"/>
+        </w:rPr>
+      </w:pPr>
+      <w:r>
+        <w:rPr>
+          <w:color w:val="FF0000"/>
+        </w:rPr>
+        <w:t>`</w:t>
+      </w:r>
+      <w:proofErr w:type="spellStart"/>
+      <w:r>
+        <w:rPr>
+          <w:color w:val="FF0000"/>
+        </w:rPr>
+        <w:t>alt_base</w:t>
+      </w:r>
+      <w:proofErr w:type="spellEnd"/>
+      <w:r>
+        <w:rPr>
+          <w:color w:val="FF0000"/>
+        </w:rPr>
+        <w:t xml:space="preserve">` varchar(1000) DEFAULT NULL,                               </w:t>
+      </w:r>
+    </w:p>
+    <w:p>
+      <w:pPr>
+        <w:rPr>
+          <w:color w:val="FF0000"/>
+        </w:rPr>
+      </w:pPr>
+      <w:r>
+        <w:rPr>
+          <w:color w:val="FF0000"/>
+        </w:rPr>
+        <w:t>`context` varchar(3) DEFAULT NULL, PRIMARY KEY (`</w:t>
+      </w:r>
+      <w:proofErr w:type="spellStart"/>
+      <w:r>
+        <w:rPr>
+          <w:color w:val="FF0000"/>
+        </w:rPr>
+        <w:t>chrID</w:t>
+      </w:r>
+      <w:proofErr w:type="spellEnd"/>
+      <w:r>
+        <w:rPr>
+          <w:color w:val="FF0000"/>
+        </w:rPr>
+        <w:t>`,`</w:t>
+      </w:r>
+      <w:proofErr w:type="spellStart"/>
+      <w:r>
+        <w:rPr>
+          <w:color w:val="FF0000"/>
+        </w:rPr>
+        <w:t>snp_pos</w:t>
+      </w:r>
+      <w:proofErr w:type="spellEnd"/>
+      <w:r>
+        <w:rPr>
+          <w:color w:val="FF0000"/>
+        </w:rPr>
+        <w:t xml:space="preserve">`)                                      </w:t>
+      </w:r>
+    </w:p>
+    <w:p>
+      <w:pPr>
+        <w:rPr>
+          <w:color w:val="FF0000"/>
+        </w:rPr>
+      </w:pPr>
+      <w:r>
+        <w:rPr>
+          <w:color w:val="FF0000"/>
+        </w:rPr>
+        <w:t>) ENGINE=</w:t>
+      </w:r>
+      <w:proofErr w:type="spellStart"/>
+      <w:r>
+        <w:rPr>
+          <w:color w:val="FF0000"/>
+        </w:rPr>
+        <w:t>InnoDB</w:t>
+      </w:r>
+      <w:proofErr w:type="spellEnd"/>
+      <w:r>
+        <w:rPr>
+          <w:color w:val="FF0000"/>
+        </w:rPr>
+        <w:t xml:space="preserve"> DEFAULT CHARSET=utf8</w:t>
       </w:r>
     </w:p>
     <w:p>
@@ -317,20 +584,39 @@
         <w:rPr>
           <w:rFonts w:hint="eastAsia"/>
         </w:rPr>
-        <w:t>群体的v</w:t>
-      </w:r>
-      <w:r>
-        <w:t>cf SNP</w:t>
-      </w:r>
-      <w:r>
-        <w:rPr>
-          <w:rFonts w:hint="eastAsia"/>
-        </w:rPr>
-        <w:t>数据导入数据库（看一下没有更好的v</w:t>
+        <w:t>群体的</w:t>
+      </w:r>
+      <w:proofErr w:type="spellStart"/>
+      <w:r>
+        <w:rPr>
+          <w:rFonts w:hint="eastAsia"/>
+        </w:rPr>
+        <w:t>v</w:t>
       </w:r>
       <w:r>
         <w:t>cf</w:t>
       </w:r>
+      <w:proofErr w:type="spellEnd"/>
+      <w:r>
+        <w:t xml:space="preserve"> SNP</w:t>
+      </w:r>
+      <w:r>
+        <w:rPr>
+          <w:rFonts w:hint="eastAsia"/>
+        </w:rPr>
+        <w:t>数据导入数据库（看一下没有更好的</w:t>
+      </w:r>
+      <w:proofErr w:type="spellStart"/>
+      <w:r>
+        <w:rPr>
+          <w:rFonts w:hint="eastAsia"/>
+        </w:rPr>
+        <w:t>v</w:t>
+      </w:r>
+      <w:r>
+        <w:t>cf</w:t>
+      </w:r>
+      <w:proofErr w:type="spellEnd"/>
       <w:r>
         <w:rPr>
           <w:rFonts w:hint="eastAsia"/>
@@ -339,8 +625,37 @@
       </w:r>
     </w:p>
     <w:p>
-      <w:r>
-        <w:t>mysql -uroot -p1234607 -Dfyyjvariantdata -e "load data local infile 'p_m_sx_sp_gy_kbe_sm_lcb_ytg_jd_10pool10.SNV.loadmysql' into table mspsgjlksy10pop_toplevel_pekingduckref fields terminated by '\t'"</w:t>
+      <w:proofErr w:type="spellStart"/>
+      <w:r>
+        <w:t>mysql</w:t>
+      </w:r>
+      <w:proofErr w:type="spellEnd"/>
+      <w:r>
+        <w:t xml:space="preserve"> -</w:t>
+      </w:r>
+      <w:proofErr w:type="spellStart"/>
+      <w:r>
+        <w:t>uroot</w:t>
+      </w:r>
+      <w:proofErr w:type="spellEnd"/>
+      <w:r>
+        <w:t xml:space="preserve"> -p1234607 -</w:t>
+      </w:r>
+      <w:proofErr w:type="spellStart"/>
+      <w:r>
+        <w:t>Dfyyjvariantdata</w:t>
+      </w:r>
+      <w:proofErr w:type="spellEnd"/>
+      <w:r>
+        <w:t xml:space="preserve"> -e "load data local </w:t>
+      </w:r>
+      <w:proofErr w:type="spellStart"/>
+      <w:r>
+        <w:t>infile</w:t>
+      </w:r>
+      <w:proofErr w:type="spellEnd"/>
+      <w:r>
+        <w:t xml:space="preserve"> 'p_m_sx_sp_gy_kbe_sm_lcb_ytg_jd_10pool10.SNV.loadmysql' into table mspsgjlksy10pop_toplevel_pekingduckref fields terminated by '\t'"</w:t>
       </w:r>
     </w:p>
     <w:p/>
@@ -582,8 +897,21 @@
         <w:t>流程（方案1）是：各个个体单独c</w:t>
       </w:r>
       <w:r>
-        <w:t>all bam-&gt;sort-&gt;rmdup-&gt;realignment-&gt;uniq</w:t>
-      </w:r>
+        <w:t>all bam-&gt;sort-&gt;</w:t>
+      </w:r>
+      <w:proofErr w:type="spellStart"/>
+      <w:r>
+        <w:t>rmdup</w:t>
+      </w:r>
+      <w:proofErr w:type="spellEnd"/>
+      <w:r>
+        <w:t>-&gt;realignment-&gt;</w:t>
+      </w:r>
+      <w:proofErr w:type="spellStart"/>
+      <w:r>
+        <w:t>uniq</w:t>
+      </w:r>
+      <w:proofErr w:type="spellEnd"/>
       <w:r>
         <w:rPr>
           <w:rFonts w:hint="eastAsia"/>
@@ -641,11 +969,19 @@
         <w:rPr>
           <w:rFonts w:hint="eastAsia"/>
         </w:rPr>
-        <w:t>（比如番鸭外群），可能连u</w:t>
+        <w:t>（比如番鸭外群），可能连</w:t>
+      </w:r>
+      <w:proofErr w:type="spellStart"/>
+      <w:r>
+        <w:rPr>
+          <w:rFonts w:hint="eastAsia"/>
+        </w:rPr>
+        <w:t>u</w:t>
       </w:r>
       <w:r>
         <w:t>niq</w:t>
       </w:r>
+      <w:proofErr w:type="spellEnd"/>
       <w:r>
         <w:rPr>
           <w:rFonts w:hint="eastAsia"/>
@@ -900,7 +1236,31 @@
       </w:r>
       <w:r>
         <w:lastRenderedPageBreak/>
-        <w:t>pekingduckchrominfo.5MBPLUS_1 -t mspsgjlksy10pop_toplevel_pekingduckref -C /ifs1/User/lrui/data/duckproject/fanyaBJ.VCFBAMconfig -2 /ifs1/User/lrui/database/Anas_platyrhynchos.BGI_duck_1.0.dna_sm.toplevel.fa</w:t>
+        <w:t>pekingduckchrominfo.5MBPLUS_1 -t mspsgjlksy10pop_toplevel_pekingduckref -C /ifs1/User/</w:t>
+      </w:r>
+      <w:proofErr w:type="spellStart"/>
+      <w:r>
+        <w:t>lrui</w:t>
+      </w:r>
+      <w:proofErr w:type="spellEnd"/>
+      <w:r>
+        <w:t>/data/</w:t>
+      </w:r>
+      <w:proofErr w:type="spellStart"/>
+      <w:r>
+        <w:t>duckproject</w:t>
+      </w:r>
+      <w:proofErr w:type="spellEnd"/>
+      <w:r>
+        <w:t>/</w:t>
+      </w:r>
+      <w:proofErr w:type="spellStart"/>
+      <w:r>
+        <w:t>fanyaBJ.VCFBAMconfig</w:t>
+      </w:r>
+      <w:proofErr w:type="spellEnd"/>
+      <w:r>
+        <w:t xml:space="preserve"> -2 /ifs1/User/lrui/database/Anas_platyrhynchos.BGI_duck_1.0.dna_sm.toplevel.fa</w:t>
       </w:r>
     </w:p>
     <w:p>
@@ -996,20 +1356,36 @@
         <w:rPr>
           <w:rFonts w:hint="eastAsia"/>
         </w:rPr>
-        <w:t>这条染色体无法读取后面的数据，但是v</w:t>
+        <w:t>这条染色体无法读取后面的数据，但是</w:t>
+      </w:r>
+      <w:proofErr w:type="spellStart"/>
+      <w:r>
+        <w:rPr>
+          <w:rFonts w:hint="eastAsia"/>
+        </w:rPr>
+        <w:t>v</w:t>
       </w:r>
       <w:r>
         <w:t>cf</w:t>
       </w:r>
-      <w:r>
-        <w:rPr>
-          <w:rFonts w:hint="eastAsia"/>
-        </w:rPr>
-        <w:t>文件应该是没问题的。所以重新生成了f</w:t>
+      <w:proofErr w:type="spellEnd"/>
+      <w:r>
+        <w:rPr>
+          <w:rFonts w:hint="eastAsia"/>
+        </w:rPr>
+        <w:t>文件应该是没问题的。所以重新生成了</w:t>
+      </w:r>
+      <w:proofErr w:type="spellStart"/>
+      <w:r>
+        <w:rPr>
+          <w:rFonts w:hint="eastAsia"/>
+        </w:rPr>
+        <w:t>f</w:t>
       </w:r>
       <w:r>
         <w:t>anya</w:t>
       </w:r>
+      <w:proofErr w:type="spellEnd"/>
       <w:r>
         <w:rPr>
           <w:rFonts w:hint="eastAsia"/>
@@ -1177,6 +1553,7 @@
         </w:rPr>
         <w:t xml:space="preserve"> </w:t>
       </w:r>
+      <w:proofErr w:type="spellStart"/>
       <w:r>
         <w:rPr>
           <w:rFonts w:ascii="Times New Roman" w:eastAsia="Times New Roman" w:hAnsi="Times New Roman" w:cs="Times New Roman"/>
@@ -1184,8 +1561,9 @@
           <w:sz w:val="24"/>
           <w:szCs w:val="24"/>
         </w:rPr>
-        <w:t xml:space="preserve">Taihu </w:t>
-      </w:r>
+        <w:t>Taihu</w:t>
+      </w:r>
+      <w:proofErr w:type="spellEnd"/>
       <w:r>
         <w:rPr>
           <w:rFonts w:ascii="Times New Roman" w:eastAsia="Times New Roman" w:hAnsi="Times New Roman" w:cs="Times New Roman"/>
@@ -1193,6 +1571,15 @@
           <w:sz w:val="24"/>
           <w:szCs w:val="24"/>
         </w:rPr>
+        <w:t xml:space="preserve"> </w:t>
+      </w:r>
+      <w:r>
+        <w:rPr>
+          <w:rFonts w:ascii="Times New Roman" w:eastAsia="Times New Roman" w:hAnsi="Times New Roman" w:cs="Times New Roman"/>
+          <w:color w:val="000000"/>
+          <w:sz w:val="24"/>
+          <w:szCs w:val="24"/>
+        </w:rPr>
         <w:t xml:space="preserve">geese as outgroups using the following thresholds: (1) more than 30-fold coverage </w:t>
       </w:r>
       <w:r>
@@ -1341,6 +1728,7 @@
         </w:rPr>
         <w:t xml:space="preserve"> </w:t>
       </w:r>
+      <w:proofErr w:type="spellStart"/>
       <w:r>
         <w:rPr>
           <w:rFonts w:ascii="Times New Roman" w:eastAsia="Times New Roman" w:hAnsi="Times New Roman" w:cs="Times New Roman"/>
@@ -1348,8 +1736,9 @@
           <w:sz w:val="24"/>
           <w:szCs w:val="24"/>
         </w:rPr>
-        <w:t xml:space="preserve">Taihu </w:t>
-      </w:r>
+        <w:t>Taihu</w:t>
+      </w:r>
+      <w:proofErr w:type="spellEnd"/>
       <w:r>
         <w:rPr>
           <w:rFonts w:ascii="Times New Roman" w:eastAsia="Times New Roman" w:hAnsi="Times New Roman" w:cs="Times New Roman"/>
@@ -1357,6 +1746,15 @@
           <w:sz w:val="24"/>
           <w:szCs w:val="24"/>
         </w:rPr>
+        <w:t xml:space="preserve"> </w:t>
+      </w:r>
+      <w:r>
+        <w:rPr>
+          <w:rFonts w:ascii="Times New Roman" w:eastAsia="Times New Roman" w:hAnsi="Times New Roman" w:cs="Times New Roman"/>
+          <w:color w:val="000000"/>
+          <w:sz w:val="24"/>
+          <w:szCs w:val="24"/>
+        </w:rPr>
         <w:t xml:space="preserve">geese as outgroups using the following thresholds: (1) more than 30-fold coverage </w:t>
       </w:r>
       <w:r>
@@ -1453,11 +1851,115 @@
     </w:p>
     <w:p>
       <w:r>
-        <w:t xml:space="preserve">python ~/life/src/NGS/Analysis/Detectsignalacrossgenome_master.py -T mallardBJ.VCFBAMconfig -T spotbilledBJ.VCFBAMconfig -R beijingBJ.VCFBAMconfig -R shaoxingBJ.VCFBAMconfig -R lianchengbaiBJ.VCFBAMconfig -R jindingBJ.VCFBAMconfig -R shanmaBJ.VCFBAMconfig -R gaoyouBJ.VCFBAMconfig -R cherryvalleyBJ.VCFBAMconfig -R campbellBJ.VCFBAMconfig -t mspsgjlksy10pop_toplevel_pekingduckref -w 40000 -s 20000 -c /ifs1/User/lrui/database/all_sep_chrfiles/pekingduckchrominfo.5MBPLUS_1 -c /ifs1/User/lrui/database/all_sep_chrfiles/pekingduckchrominfo.2MB_5MB_part1_2 -c /ifs1/User/lrui/database/all_sep_chrfiles/pekingduckchrominfo.2MB_5MB_part2_2 -c /ifs1/User/lrui/database/all_sep_chrfiles/pekingduckchrominfo.100kb_2MB_part1_3 -c /ifs1/User/lrui/database/all_sep_chrfiles/pekingduckchrominfo.100kb_2MB_part2_3 -c /ifs1/User/lrui/database/all_sep_chrfiles/pekingduckchrominfo.100kb_2MB_part3_3 -c </w:t>
+        <w:t xml:space="preserve">python ~/life/src/NGS/Analysis/Detectsignalacrossgenome_master.py -T </w:t>
+      </w:r>
+      <w:proofErr w:type="spellStart"/>
+      <w:r>
+        <w:t>mallardBJ.VCFBAMconfig</w:t>
+      </w:r>
+      <w:proofErr w:type="spellEnd"/>
+      <w:r>
+        <w:t xml:space="preserve"> -T </w:t>
+      </w:r>
+      <w:proofErr w:type="spellStart"/>
+      <w:r>
+        <w:t>spotbilledBJ.VCFBAMconfig</w:t>
+      </w:r>
+      <w:proofErr w:type="spellEnd"/>
+      <w:r>
+        <w:t xml:space="preserve"> -R </w:t>
+      </w:r>
+      <w:proofErr w:type="spellStart"/>
+      <w:r>
+        <w:t>beijingBJ.VCFBAMconfig</w:t>
+      </w:r>
+      <w:proofErr w:type="spellEnd"/>
+      <w:r>
+        <w:t xml:space="preserve"> -R </w:t>
+      </w:r>
+      <w:proofErr w:type="spellStart"/>
+      <w:r>
+        <w:t>shaoxingBJ.VCFBAMconfig</w:t>
+      </w:r>
+      <w:proofErr w:type="spellEnd"/>
+      <w:r>
+        <w:t xml:space="preserve"> -R </w:t>
+      </w:r>
+      <w:proofErr w:type="spellStart"/>
+      <w:r>
+        <w:t>lianchengbaiBJ.VCFBAMconfig</w:t>
+      </w:r>
+      <w:proofErr w:type="spellEnd"/>
+      <w:r>
+        <w:t xml:space="preserve"> -R </w:t>
+      </w:r>
+      <w:proofErr w:type="spellStart"/>
+      <w:r>
+        <w:t>jindingBJ.VCFBAMconfig</w:t>
+      </w:r>
+      <w:proofErr w:type="spellEnd"/>
+      <w:r>
+        <w:t xml:space="preserve"> -R </w:t>
+      </w:r>
+      <w:proofErr w:type="spellStart"/>
+      <w:r>
+        <w:t>shanmaBJ.VCFBAMconfig</w:t>
+      </w:r>
+      <w:proofErr w:type="spellEnd"/>
+      <w:r>
+        <w:t xml:space="preserve"> -R </w:t>
+      </w:r>
+      <w:proofErr w:type="spellStart"/>
+      <w:r>
+        <w:t>gaoyouBJ.VCFBAMconfig</w:t>
+      </w:r>
+      <w:proofErr w:type="spellEnd"/>
+      <w:r>
+        <w:t xml:space="preserve"> -R </w:t>
+      </w:r>
+      <w:proofErr w:type="spellStart"/>
+      <w:r>
+        <w:t>cherryvalleyBJ.VCFBAMconfig</w:t>
+      </w:r>
+      <w:proofErr w:type="spellEnd"/>
+      <w:r>
+        <w:t xml:space="preserve"> -R </w:t>
+      </w:r>
+      <w:proofErr w:type="spellStart"/>
+      <w:r>
+        <w:t>campbellBJ.VCFBAMconfig</w:t>
+      </w:r>
+      <w:proofErr w:type="spellEnd"/>
+      <w:r>
+        <w:t xml:space="preserve"> -t mspsgjlksy10pop_toplevel_pekingduckref -w 40000 -s 20000 -c /ifs1/User/lrui/database/all_sep_chrfiles/pekingduckchrominfo.5MBPLUS_1 -c /ifs1/User/lrui/database/all_sep_chrfiles/pekingduckchrominfo.2MB_5MB_part1_2 -c /ifs1/User/lrui/database/all_sep_chrfiles/pekingduckchrominfo.2MB_5MB_part2_2 -c /ifs1/User/lrui/database/all_sep_chrfiles/pekingduckchrominfo.100kb_2MB_part1_3 -c /ifs1/User/lrui/database/all_sep_chrfiles/pekingduckchrominfo.100kb_2MB_part2_3 -c /ifs1/User/lrui/database/all_sep_chrfiles/pekingduckchrominfo.100kb_2MB_part3_3 -c </w:t>
       </w:r>
       <w:r>
         <w:lastRenderedPageBreak/>
-        <w:t>/ifs1/User/lrui/database/all_sep_chrfiles/pekingduckchrominfo.100kb_2MB_part4_3 -c /ifs1/User/lrui/database/all_sep_chrfiles/pekingduckchrominfo.100kb_2MB_part5_3 -c /ifs1/User/lrui/database/all_sep_chrfiles/pekingduckchrominfo.40kb_100kb_4 -c /ifs1/User/lrui/database/all_sep_chrfiles/pekingduckchrominfo.5kb_40kb_5 -n 19 -o /ifs1/User/lrui/data/duckproject/configfile/ancientMixChr40k20k -p early -1 ~/life/src/NGS/Slave/Detectsignalacrossgenome_producecorrelation_slave.py -2 ~/life/src/NGS/Slave/Detectsignalacrossgenome_slidewin_slave.py</w:t>
+        <w:t>/ifs1/User/lrui/database/all_sep_chrfiles/pekingduckchrominfo.100kb_2MB_part4_3 -c /ifs1/User/lrui/database/all_sep_chrfiles/pekingduckchrominfo.100kb_2MB_part5_3 -c /ifs1/User/lrui/database/all_sep_chrfiles/pekingduckchrominfo.40kb_100kb_4 -c /ifs1/User/lrui/database/all_sep_chrfiles/pekingduckchrominfo.5kb_40kb_5 -n 19 -o /ifs1/User/</w:t>
+      </w:r>
+      <w:proofErr w:type="spellStart"/>
+      <w:r>
+        <w:t>lrui</w:t>
+      </w:r>
+      <w:proofErr w:type="spellEnd"/>
+      <w:r>
+        <w:t>/data/</w:t>
+      </w:r>
+      <w:proofErr w:type="spellStart"/>
+      <w:r>
+        <w:t>duckproject</w:t>
+      </w:r>
+      <w:proofErr w:type="spellEnd"/>
+      <w:r>
+        <w:t>/</w:t>
+      </w:r>
+      <w:proofErr w:type="spellStart"/>
+      <w:r>
+        <w:t>configfile</w:t>
+      </w:r>
+      <w:proofErr w:type="spellEnd"/>
+      <w:r>
+        <w:t>/ancientMixChr40k20k -p early -1 ~/life/src/NGS/Slave/Detectsignalacrossgenome_producecorrelation_slave.py -2 ~/life/src/NGS/Slave/Detectsignalacrossgenome_slidewin_slave.py</w:t>
       </w:r>
     </w:p>
     <w:p>
@@ -1569,12 +2071,311 @@
       </w:r>
     </w:p>
     <w:p>
-      <w:pPr>
-        <w:rPr>
-          <w:b/>
-          <w:bCs/>
-        </w:rPr>
-      </w:pPr>
+      <w:r>
+        <w:rPr>
+          <w:rFonts w:hint="eastAsia"/>
+        </w:rPr>
+        <w:t>第一次运行不区分的成功生成了c</w:t>
+      </w:r>
+      <w:r>
+        <w:t xml:space="preserve">orrelation </w:t>
+      </w:r>
+      <w:r>
+        <w:rPr>
+          <w:rFonts w:hint="eastAsia"/>
+        </w:rPr>
+        <w:t>文件但是到</w:t>
+      </w:r>
+      <w:proofErr w:type="spellStart"/>
+      <w:r>
+        <w:rPr>
+          <w:rFonts w:hint="eastAsia"/>
+        </w:rPr>
+        <w:t>s</w:t>
+      </w:r>
+      <w:r>
+        <w:t>lidewin</w:t>
+      </w:r>
+      <w:proofErr w:type="spellEnd"/>
+      <w:r>
+        <w:rPr>
+          <w:rFonts w:hint="eastAsia"/>
+        </w:rPr>
+        <w:t>的时候执行i</w:t>
+      </w:r>
+      <w:r>
+        <w:t xml:space="preserve">nsert </w:t>
+      </w:r>
+      <w:r>
+        <w:rPr>
+          <w:rFonts w:hint="eastAsia"/>
+        </w:rPr>
+        <w:t>记录的时候莫名其妙出现了d</w:t>
+      </w:r>
+      <w:r>
+        <w:t>uplicate KEY error</w:t>
+      </w:r>
+    </w:p>
+    <w:p>
+      <w:pPr>
+        <w:rPr>
+          <w:b/>
+          <w:bCs/>
+        </w:rPr>
+      </w:pPr>
+      <w:r>
+        <w:rPr>
+          <w:noProof/>
+        </w:rPr>
+        <w:drawing>
+          <wp:inline distT="0" distB="0" distL="0" distR="0" wp14:anchorId="38BC5C13" wp14:editId="7B446764">
+            <wp:extent cx="5274310" cy="2841625"/>
+            <wp:effectExtent l="0" t="0" r="2540" b="0"/>
+            <wp:docPr id="4" name="图片 4"/>
+            <wp:cNvGraphicFramePr>
+              <a:graphicFrameLocks xmlns:a="http://schemas.openxmlformats.org/drawingml/2006/main" noChangeAspect="1"/>
+            </wp:cNvGraphicFramePr>
+            <a:graphic xmlns:a="http://schemas.openxmlformats.org/drawingml/2006/main">
+              <a:graphicData uri="http://schemas.openxmlformats.org/drawingml/2006/picture">
+                <pic:pic xmlns:pic="http://schemas.openxmlformats.org/drawingml/2006/picture">
+                  <pic:nvPicPr>
+                    <pic:cNvPr id="1" name=""/>
+                    <pic:cNvPicPr/>
+                  </pic:nvPicPr>
+                  <pic:blipFill>
+                    <a:blip r:embed="rId10"/>
+                    <a:stretch>
+                      <a:fillRect/>
+                    </a:stretch>
+                  </pic:blipFill>
+                  <pic:spPr>
+                    <a:xfrm>
+                      <a:off x="0" y="0"/>
+                      <a:ext cx="5274310" cy="2841625"/>
+                    </a:xfrm>
+                    <a:prstGeom prst="rect">
+                      <a:avLst/>
+                    </a:prstGeom>
+                  </pic:spPr>
+                </pic:pic>
+              </a:graphicData>
+            </a:graphic>
+          </wp:inline>
+        </w:drawing>
+      </w:r>
+    </w:p>
+    <w:p>
+      <w:pPr>
+        <w:rPr>
+          <w:b/>
+          <w:bCs/>
+        </w:rPr>
+      </w:pPr>
+      <w:r>
+        <w:rPr>
+          <w:rFonts w:hint="eastAsia"/>
+          <w:b/>
+          <w:bCs/>
+        </w:rPr>
+        <w:t>修改程序i</w:t>
+      </w:r>
+      <w:r>
+        <w:rPr>
+          <w:b/>
+          <w:bCs/>
+        </w:rPr>
+        <w:t xml:space="preserve">nsert </w:t>
+      </w:r>
+      <w:r>
+        <w:rPr>
+          <w:rFonts w:hint="eastAsia"/>
+          <w:b/>
+          <w:bCs/>
+        </w:rPr>
+        <w:t>加了i</w:t>
+      </w:r>
+      <w:r>
+        <w:rPr>
+          <w:b/>
+          <w:bCs/>
+        </w:rPr>
+        <w:t>gnore</w:t>
+      </w:r>
+      <w:r>
+        <w:rPr>
+          <w:rFonts w:hint="eastAsia"/>
+          <w:b/>
+          <w:bCs/>
+        </w:rPr>
+        <w:t>关键词</w:t>
+      </w:r>
+    </w:p>
+    <w:p>
+      <w:pPr>
+        <w:rPr>
+          <w:b/>
+          <w:bCs/>
+        </w:rPr>
+      </w:pPr>
+      <w:r>
+        <w:rPr>
+          <w:rFonts w:hint="eastAsia"/>
+          <w:b/>
+          <w:bCs/>
+        </w:rPr>
+        <w:t>重新运行</w:t>
+      </w:r>
+      <w:proofErr w:type="spellStart"/>
+      <w:r>
+        <w:rPr>
+          <w:rFonts w:hint="eastAsia"/>
+          <w:b/>
+          <w:bCs/>
+        </w:rPr>
+        <w:t>s</w:t>
+      </w:r>
+      <w:r>
+        <w:rPr>
+          <w:b/>
+          <w:bCs/>
+        </w:rPr>
+        <w:t>lidewin</w:t>
+      </w:r>
+      <w:proofErr w:type="spellEnd"/>
+      <w:r>
+        <w:rPr>
+          <w:rFonts w:hint="eastAsia"/>
+          <w:b/>
+          <w:bCs/>
+        </w:rPr>
+        <w:t>程序。</w:t>
+      </w:r>
+    </w:p>
+    <w:p>
+      <w:proofErr w:type="spellStart"/>
+      <w:r>
+        <w:t>nohup</w:t>
+      </w:r>
+      <w:proofErr w:type="spellEnd"/>
+      <w:r>
+        <w:t xml:space="preserve"> python /ifs1/User/lrui/life/src/NGS/Analysis/Detectsignalacrossgenome_master.py -T </w:t>
+      </w:r>
+      <w:proofErr w:type="spellStart"/>
+      <w:r>
+        <w:t>mallardBJ.VCFBAMconfig</w:t>
+      </w:r>
+      <w:proofErr w:type="spellEnd"/>
+      <w:r>
+        <w:t xml:space="preserve"> -T </w:t>
+      </w:r>
+      <w:proofErr w:type="spellStart"/>
+      <w:r>
+        <w:t>spotbilledBJ.VCFBAMconfig</w:t>
+      </w:r>
+      <w:proofErr w:type="spellEnd"/>
+      <w:r>
+        <w:t xml:space="preserve"> -R </w:t>
+      </w:r>
+      <w:proofErr w:type="spellStart"/>
+      <w:r>
+        <w:t>beijingBJ.VCFBAMconfig</w:t>
+      </w:r>
+      <w:proofErr w:type="spellEnd"/>
+      <w:r>
+        <w:t xml:space="preserve"> -R </w:t>
+      </w:r>
+      <w:proofErr w:type="spellStart"/>
+      <w:r>
+        <w:t>shaoxingBJ.VCFBAMconfig</w:t>
+      </w:r>
+      <w:proofErr w:type="spellEnd"/>
+      <w:r>
+        <w:t xml:space="preserve"> -R </w:t>
+      </w:r>
+      <w:proofErr w:type="spellStart"/>
+      <w:r>
+        <w:t>lianchengbaiBJ.VCFBAMconfig</w:t>
+      </w:r>
+      <w:proofErr w:type="spellEnd"/>
+      <w:r>
+        <w:t xml:space="preserve"> -R </w:t>
+      </w:r>
+      <w:proofErr w:type="spellStart"/>
+      <w:r>
+        <w:t>jindingBJ.VCFBAMconfig</w:t>
+      </w:r>
+      <w:proofErr w:type="spellEnd"/>
+      <w:r>
+        <w:t xml:space="preserve"> -R </w:t>
+      </w:r>
+      <w:proofErr w:type="spellStart"/>
+      <w:r>
+        <w:t>shanmaBJ.VCFBAMconfig</w:t>
+      </w:r>
+      <w:proofErr w:type="spellEnd"/>
+      <w:r>
+        <w:t xml:space="preserve"> -R </w:t>
+      </w:r>
+      <w:proofErr w:type="spellStart"/>
+      <w:r>
+        <w:t>gaoyouBJ.VCFBAMconfig</w:t>
+      </w:r>
+      <w:proofErr w:type="spellEnd"/>
+      <w:r>
+        <w:t xml:space="preserve"> -R </w:t>
+      </w:r>
+      <w:proofErr w:type="spellStart"/>
+      <w:r>
+        <w:t>cherryvalleyBJ.VCFBAMconfig</w:t>
+      </w:r>
+      <w:proofErr w:type="spellEnd"/>
+      <w:r>
+        <w:t xml:space="preserve"> -R </w:t>
+      </w:r>
+      <w:proofErr w:type="spellStart"/>
+      <w:r>
+        <w:t>campbellBJ.VCFBAMconfig</w:t>
+      </w:r>
+      <w:proofErr w:type="spellEnd"/>
+      <w:r>
+        <w:t xml:space="preserve"> -t mspsgjlksy10pop_toplevel_pekingduckref -w 40000 -s 20000 -c /ifs1/User/lrui/database/all_sep_chrfiles/pekingduckchrominfo.5MBPLUS_1 -c /ifs1/User/lrui/database/all_sep_chrfiles/pekingduckchrominfo.2MB_5MB_part1_2 -c /ifs1/User/lrui/database/all_sep_chrfiles/pekingduckchrominfo.2MB_5MB_part2_2 -c /ifs1/User/lrui/database/all_sep_chrfiles/pekingduckchrominfo.100kb_2MB_part1_3 -c /ifs1/User/lrui/database/all_sep_chrfiles/pekingduckchrominfo.100kb_2MB_part2_3 -c /ifs1/User/lrui/database/all_sep_chrfiles/pekingduckchrominfo.100kb_2MB_part3_3 -c /ifs1/User/lrui/database/all_sep_chrfiles/pekingduckchrominfo.100kb_2MB_part4_3 -c /ifs1/User/lrui/database/all_sep_chrfiles/pekingduckchrominfo.100kb_2MB_part5_3 -c /ifs1/User/lrui/database/all_sep_chrfiles/pekingduckchrominfo.40kb_100kb_4 -c </w:t>
+      </w:r>
+      <w:r>
+        <w:lastRenderedPageBreak/>
+        <w:t>/ifs1/User/lrui/database/all_sep_chrfiles/pekingduckchrominfo.5kb_40kb_5 -o /ifs1/User/lrui/data/duckproject/configfile/ancientMixChr40k20kwithcorrelationfile -p early -1 /ifs1/User/lrui/life/src/NGS/Slave/Detectsignalacrossgenome_producecorrelation_slave.py -2 /ifs1/User/lrui/life/src/NGS/Slave/Detectsignalacrossgenome_slidewin_slave.py -C ancientMixChr40k20k.freq_correlation_merged &amp;</w:t>
+      </w:r>
+    </w:p>
+    <w:p>
+      <w:r>
+        <w:rPr>
+          <w:rFonts w:hint="eastAsia"/>
+        </w:rPr>
+        <w:t>晚上在把这个跑一下：</w:t>
+      </w:r>
+    </w:p>
+    <w:p>
+      <w:pPr>
+        <w:rPr>
+          <w:rFonts w:hint="eastAsia"/>
+        </w:rPr>
+      </w:pPr>
+      <w:r>
+        <w:t>python /ifs1/User/lrui/life/src/NGS/Analysis/Detectsignalacrossgenome_master.py -T /ifs1/User/lrui/data/duckproject/configfile/mallardBJ.VCFBAMconfig -T /ifs1/User/lrui/data/duckproject/configfile/spotbilledBJ.VCFBAMconfig -R /ifs1/User/lrui/data/duckproject/configfile/beijingBJ.VCFBAMconfig -R /ifs1/User/lrui/data/duckproject/configfile/shaoxingBJ.VCFBAMconfig -R /ifs1/User/lrui/data/duckproject/configfile/lianchengbaiBJ.VCFBAMconfig -R /ifs1/User/lrui/data/duckproject/configfile/jindingBJ.VCFBAMconfig -R /ifs1/User/lrui/data/duckproject/configfile/shanmaBJ.VCFBAMconfig -R /ifs1/User/lrui/data/duckproject/configfile/gaoyouBJ.VCFBAMconfig -R /ifs1/User/lrui/data/duckproject/configfile/cherryvalleyBJ.VCFBAMconfig -R /ifs1/User/lrui/data/duckproject/configfile/campbellBJ.VCFBAMconfig -t mspsgjlksy10pop_toplevel_pekingduckref -w 20000 -s 10000 -c /ifs1/User/lrui/database/all_sep_chrfiles/pekingduckchrominfo.5MBPLUS_1 -c /ifs1/User/lrui/database/all_sep_chrfiles/pekingduckchrominfo.2MB_5MB_part1_2 -c /ifs1/User/lrui/database/all_sep_chrfiles/pekingduckchrominfo.2MB_5MB_part2_2 -c /ifs1/User/lrui/database/all_sep_chrfiles/pekingduckchrominfo.100kb_2MB_part1_3 -c /ifs1/User/lrui/database/all_sep_chrfiles/pekingduckchrominfo.100kb_2MB_part2_3 -c /ifs1/User/lrui/database/all_sep_chrfiles/pekingduckchrominfo.100kb_2MB_part3_3 -c /ifs1/User/lrui/database/all_sep_chrfiles/pekingduckchrominfo.100kb_2MB_part4_3 -c /ifs1/User/lrui/database/all_sep_chrfiles/pekingduckchrominfo.100kb_2MB_part5_3 -c /ifs1/User/lrui/database/all_sep_chrfiles/pekingduckchrominfo.40kb_100kb_4 -c /ifs1/User/lrui/database/all_sep_chrfiles/pekingduckchrominfo.5kb_40kb_5 -C ancientMixChr20k10k.freq_correlation_merged -o /ifs1/User/lrui/data/duckproject/detectseletion/ancientMixChr20k10k</w:t>
+      </w:r>
+      <w:r>
+        <w:rPr>
+          <w:rFonts w:hint="eastAsia"/>
+        </w:rPr>
+        <w:t>Wi</w:t>
+      </w:r>
+      <w:r>
+        <w:t>thCorrfile</w:t>
+      </w:r>
+      <w:bookmarkStart w:id="0" w:name="_GoBack"/>
+      <w:bookmarkEnd w:id="0"/>
+      <w:r>
+        <w:t xml:space="preserve"> -p early -1 /ifs1/User/lrui/life/src/NGS/Slave/Detectsignalacrossgenome_producecorrelation_slave.py -2 /ifs1/User/lrui/life/src/NGS/Slave/Detectsignalacrossgenome_slidewin_slave.py</w:t>
+      </w:r>
     </w:p>
     <w:p>
       <w:pPr>
@@ -1585,7 +2386,6 @@
         </w:numPr>
         <w:ind w:firstLineChars="0"/>
         <w:rPr>
-          <w:rFonts w:hint="eastAsia"/>
           <w:b/>
           <w:bCs/>
         </w:rPr>
@@ -1598,8 +2398,6 @@
         </w:rPr>
         <w:t>找到受选择区域，同时注释受选择区域基因并做功能富集分析。</w:t>
       </w:r>
-      <w:bookmarkStart w:id="0" w:name="_GoBack"/>
-      <w:bookmarkEnd w:id="0"/>
     </w:p>
     <w:sectPr>
       <w:pgSz w:w="11906" w:h="16838"/>

</xml_diff>

<commit_message>
r("library(Cairo)") code segment removed for code test
</commit_message>
<xml_diff>
--- a/ancient seletion早期选择分析.docx
+++ b/ancient seletion早期选择分析.docx
@@ -86,7 +86,15 @@
       </w:r>
       <w:proofErr w:type="spellEnd"/>
       <w:r>
-        <w:t xml:space="preserve">` char(128) NOT NULL DEFAULT '',                               </w:t>
+        <w:t xml:space="preserve">` </w:t>
+      </w:r>
+      <w:proofErr w:type="gramStart"/>
+      <w:r>
+        <w:t>char(</w:t>
+      </w:r>
+      <w:proofErr w:type="gramEnd"/>
+      <w:r>
+        <w:t xml:space="preserve">128) NOT NULL DEFAULT '',                               </w:t>
       </w:r>
     </w:p>
     <w:p>
@@ -102,12 +110,17 @@
         <w:t xml:space="preserve">` </w:t>
       </w:r>
       <w:proofErr w:type="spellStart"/>
+      <w:proofErr w:type="gramStart"/>
       <w:r>
         <w:t>bigint</w:t>
       </w:r>
       <w:proofErr w:type="spellEnd"/>
       <w:r>
-        <w:t xml:space="preserve">(20) NOT NULL DEFAULT '0',                           </w:t>
+        <w:t>(</w:t>
+      </w:r>
+      <w:proofErr w:type="gramEnd"/>
+      <w:r>
+        <w:t xml:space="preserve">20) NOT NULL DEFAULT '0',                           </w:t>
       </w:r>
     </w:p>
     <w:p>
@@ -120,7 +133,15 @@
       </w:r>
       <w:proofErr w:type="spellEnd"/>
       <w:r>
-        <w:t xml:space="preserve">` char(128) NOT NULL,                                          </w:t>
+        <w:t xml:space="preserve">` </w:t>
+      </w:r>
+      <w:proofErr w:type="gramStart"/>
+      <w:r>
+        <w:t>char(</w:t>
+      </w:r>
+      <w:proofErr w:type="gramEnd"/>
+      <w:r>
+        <w:t xml:space="preserve">128) NOT NULL,                                          </w:t>
       </w:r>
     </w:p>
     <w:p>
@@ -133,7 +154,15 @@
       </w:r>
       <w:proofErr w:type="spellEnd"/>
       <w:r>
-        <w:t xml:space="preserve">` varchar(1000) DEFAULT NULL,                               </w:t>
+        <w:t xml:space="preserve">` </w:t>
+      </w:r>
+      <w:proofErr w:type="gramStart"/>
+      <w:r>
+        <w:t>varchar(</w:t>
+      </w:r>
+      <w:proofErr w:type="gramEnd"/>
+      <w:r>
+        <w:t xml:space="preserve">1000) DEFAULT NULL,                               </w:t>
       </w:r>
     </w:p>
     <w:p>
@@ -146,12 +175,28 @@
       </w:r>
       <w:proofErr w:type="spellEnd"/>
       <w:r>
-        <w:t xml:space="preserve">` varchar(1000) DEFAULT NULL,                               </w:t>
-      </w:r>
-    </w:p>
-    <w:p>
-      <w:r>
-        <w:t xml:space="preserve">`context` varchar(3) DEFAULT NULL,                                   </w:t>
+        <w:t xml:space="preserve">` </w:t>
+      </w:r>
+      <w:proofErr w:type="gramStart"/>
+      <w:r>
+        <w:t>varchar(</w:t>
+      </w:r>
+      <w:proofErr w:type="gramEnd"/>
+      <w:r>
+        <w:t xml:space="preserve">1000) DEFAULT NULL,                               </w:t>
+      </w:r>
+    </w:p>
+    <w:p>
+      <w:r>
+        <w:t xml:space="preserve">`context` </w:t>
+      </w:r>
+      <w:proofErr w:type="gramStart"/>
+      <w:r>
+        <w:t>varchar(</w:t>
+      </w:r>
+      <w:proofErr w:type="gramEnd"/>
+      <w:r>
+        <w:t xml:space="preserve">3) DEFAULT NULL,                                   </w:t>
       </w:r>
     </w:p>
     <w:p>
@@ -172,7 +217,15 @@
       </w:r>
       <w:proofErr w:type="spellEnd"/>
       <w:r>
-        <w:t xml:space="preserve">` char(128) DEFAULT NULL,             </w:t>
+        <w:t xml:space="preserve">` </w:t>
+      </w:r>
+      <w:proofErr w:type="gramStart"/>
+      <w:r>
+        <w:t>char(</w:t>
+      </w:r>
+      <w:proofErr w:type="gramEnd"/>
+      <w:r>
+        <w:t xml:space="preserve">128) DEFAULT NULL,             </w:t>
       </w:r>
     </w:p>
     <w:p>
@@ -193,17 +246,41 @@
       </w:r>
       <w:proofErr w:type="spellEnd"/>
       <w:r>
-        <w:t xml:space="preserve">` char(128) DEFAULT NULL,             </w:t>
-      </w:r>
-    </w:p>
-    <w:p>
-      <w:r>
-        <w:t xml:space="preserve">`fanya1_pool_withindel_vcf_alt` char(128) DEFAULT NULL,              </w:t>
-      </w:r>
-    </w:p>
-    <w:p>
-      <w:r>
-        <w:t xml:space="preserve">`fanya1_pool_withindel_vcf_dep` char(128) DEFAULT NULL,              </w:t>
+        <w:t xml:space="preserve">` </w:t>
+      </w:r>
+      <w:proofErr w:type="gramStart"/>
+      <w:r>
+        <w:t>char(</w:t>
+      </w:r>
+      <w:proofErr w:type="gramEnd"/>
+      <w:r>
+        <w:t xml:space="preserve">128) DEFAULT NULL,             </w:t>
+      </w:r>
+    </w:p>
+    <w:p>
+      <w:r>
+        <w:t xml:space="preserve">`fanya1_pool_withindel_vcf_alt` </w:t>
+      </w:r>
+      <w:proofErr w:type="gramStart"/>
+      <w:r>
+        <w:t>char(</w:t>
+      </w:r>
+      <w:proofErr w:type="gramEnd"/>
+      <w:r>
+        <w:t xml:space="preserve">128) DEFAULT NULL,              </w:t>
+      </w:r>
+    </w:p>
+    <w:p>
+      <w:r>
+        <w:t xml:space="preserve">`fanya1_pool_withindel_vcf_dep` </w:t>
+      </w:r>
+      <w:proofErr w:type="gramStart"/>
+      <w:r>
+        <w:t>char(</w:t>
+      </w:r>
+      <w:proofErr w:type="gramEnd"/>
+      <w:r>
+        <w:t xml:space="preserve">128) DEFAULT NULL,              </w:t>
       </w:r>
     </w:p>
     <w:p>
@@ -216,7 +293,15 @@
       </w:r>
       <w:proofErr w:type="spellEnd"/>
       <w:r>
-        <w:t xml:space="preserve">` char(128) DEFAULT NULL,      </w:t>
+        <w:t xml:space="preserve">` </w:t>
+      </w:r>
+      <w:proofErr w:type="gramStart"/>
+      <w:r>
+        <w:t>char(</w:t>
+      </w:r>
+      <w:proofErr w:type="gramEnd"/>
+      <w:r>
+        <w:t xml:space="preserve">128) DEFAULT NULL,      </w:t>
       </w:r>
     </w:p>
     <w:p>
@@ -229,7 +314,15 @@
       </w:r>
       <w:proofErr w:type="spellEnd"/>
       <w:r>
-        <w:t xml:space="preserve">` char(128) DEFAULT NULL,      </w:t>
+        <w:t xml:space="preserve">` </w:t>
+      </w:r>
+      <w:proofErr w:type="gramStart"/>
+      <w:r>
+        <w:t>char(</w:t>
+      </w:r>
+      <w:proofErr w:type="gramEnd"/>
+      <w:r>
+        <w:t xml:space="preserve">128) DEFAULT NULL,      </w:t>
       </w:r>
     </w:p>
     <w:p>
@@ -242,7 +335,15 @@
       </w:r>
       <w:proofErr w:type="spellEnd"/>
       <w:r>
-        <w:t xml:space="preserve">` char(128) DEFAULT NULL,  </w:t>
+        <w:t xml:space="preserve">` </w:t>
+      </w:r>
+      <w:proofErr w:type="gramStart"/>
+      <w:r>
+        <w:t>char(</w:t>
+      </w:r>
+      <w:proofErr w:type="gramEnd"/>
+      <w:r>
+        <w:t xml:space="preserve">128) DEFAULT NULL,  </w:t>
       </w:r>
     </w:p>
     <w:p>
@@ -255,7 +356,15 @@
       </w:r>
       <w:proofErr w:type="spellEnd"/>
       <w:r>
-        <w:t xml:space="preserve">` char(128) DEFAULT NULL,  </w:t>
+        <w:t xml:space="preserve">` </w:t>
+      </w:r>
+      <w:proofErr w:type="gramStart"/>
+      <w:r>
+        <w:t>char(</w:t>
+      </w:r>
+      <w:proofErr w:type="gramEnd"/>
+      <w:r>
+        <w:t xml:space="preserve">128) DEFAULT NULL,  </w:t>
       </w:r>
     </w:p>
     <w:p>
@@ -267,10 +376,12 @@
         <w:t>chrID</w:t>
       </w:r>
       <w:proofErr w:type="spellEnd"/>
+      <w:proofErr w:type="gramStart"/>
       <w:r>
         <w:t>`,`</w:t>
       </w:r>
       <w:proofErr w:type="spellStart"/>
+      <w:proofErr w:type="gramEnd"/>
       <w:r>
         <w:t>snp_pos</w:t>
       </w:r>
@@ -340,7 +451,21 @@
         <w:rPr>
           <w:color w:val="FF0000"/>
         </w:rPr>
-        <w:t xml:space="preserve">` char(128) NOT NULL DEFAULT '',                               </w:t>
+        <w:t xml:space="preserve">` </w:t>
+      </w:r>
+      <w:proofErr w:type="gramStart"/>
+      <w:r>
+        <w:rPr>
+          <w:color w:val="FF0000"/>
+        </w:rPr>
+        <w:t>char(</w:t>
+      </w:r>
+      <w:proofErr w:type="gramEnd"/>
+      <w:r>
+        <w:rPr>
+          <w:color w:val="FF0000"/>
+        </w:rPr>
+        <w:t xml:space="preserve">128) NOT NULL DEFAULT '',                               </w:t>
       </w:r>
     </w:p>
     <w:p>
@@ -370,6 +495,7 @@
         <w:t xml:space="preserve">` </w:t>
       </w:r>
       <w:proofErr w:type="spellStart"/>
+      <w:proofErr w:type="gramStart"/>
       <w:r>
         <w:rPr>
           <w:color w:val="FF0000"/>
@@ -381,7 +507,14 @@
         <w:rPr>
           <w:color w:val="FF0000"/>
         </w:rPr>
-        <w:t xml:space="preserve">(20) NOT NULL DEFAULT '0',                           </w:t>
+        <w:t>(</w:t>
+      </w:r>
+      <w:proofErr w:type="gramEnd"/>
+      <w:r>
+        <w:rPr>
+          <w:color w:val="FF0000"/>
+        </w:rPr>
+        <w:t xml:space="preserve">20) NOT NULL DEFAULT '0',                           </w:t>
       </w:r>
     </w:p>
     <w:p>
@@ -408,7 +541,21 @@
         <w:rPr>
           <w:color w:val="FF0000"/>
         </w:rPr>
-        <w:t xml:space="preserve">` char(128) NOT NULL,                                          </w:t>
+        <w:t xml:space="preserve">` </w:t>
+      </w:r>
+      <w:proofErr w:type="gramStart"/>
+      <w:r>
+        <w:rPr>
+          <w:color w:val="FF0000"/>
+        </w:rPr>
+        <w:t>char(</w:t>
+      </w:r>
+      <w:proofErr w:type="gramEnd"/>
+      <w:r>
+        <w:rPr>
+          <w:color w:val="FF0000"/>
+        </w:rPr>
+        <w:t xml:space="preserve">128) NOT NULL,                                          </w:t>
       </w:r>
     </w:p>
     <w:p>
@@ -435,7 +582,21 @@
         <w:rPr>
           <w:color w:val="FF0000"/>
         </w:rPr>
-        <w:t xml:space="preserve">` varchar(1000) DEFAULT NULL,                               </w:t>
+        <w:t xml:space="preserve">` </w:t>
+      </w:r>
+      <w:proofErr w:type="gramStart"/>
+      <w:r>
+        <w:rPr>
+          <w:color w:val="FF0000"/>
+        </w:rPr>
+        <w:t>varchar(</w:t>
+      </w:r>
+      <w:proofErr w:type="gramEnd"/>
+      <w:r>
+        <w:rPr>
+          <w:color w:val="FF0000"/>
+        </w:rPr>
+        <w:t xml:space="preserve">1000) DEFAULT NULL,                               </w:t>
       </w:r>
     </w:p>
     <w:p>
@@ -462,20 +623,48 @@
         <w:rPr>
           <w:color w:val="FF0000"/>
         </w:rPr>
-        <w:t xml:space="preserve">` varchar(1000) DEFAULT NULL,                               </w:t>
-      </w:r>
-    </w:p>
-    <w:p>
-      <w:pPr>
-        <w:rPr>
-          <w:color w:val="FF0000"/>
-        </w:rPr>
-      </w:pPr>
-      <w:r>
-        <w:rPr>
-          <w:color w:val="FF0000"/>
-        </w:rPr>
-        <w:t>`context` varchar(3) DEFAULT NULL, PRIMARY KEY (`</w:t>
+        <w:t xml:space="preserve">` </w:t>
+      </w:r>
+      <w:proofErr w:type="gramStart"/>
+      <w:r>
+        <w:rPr>
+          <w:color w:val="FF0000"/>
+        </w:rPr>
+        <w:t>varchar(</w:t>
+      </w:r>
+      <w:proofErr w:type="gramEnd"/>
+      <w:r>
+        <w:rPr>
+          <w:color w:val="FF0000"/>
+        </w:rPr>
+        <w:t xml:space="preserve">1000) DEFAULT NULL,                               </w:t>
+      </w:r>
+    </w:p>
+    <w:p>
+      <w:pPr>
+        <w:rPr>
+          <w:color w:val="FF0000"/>
+        </w:rPr>
+      </w:pPr>
+      <w:r>
+        <w:rPr>
+          <w:color w:val="FF0000"/>
+        </w:rPr>
+        <w:t xml:space="preserve">`context` </w:t>
+      </w:r>
+      <w:proofErr w:type="gramStart"/>
+      <w:r>
+        <w:rPr>
+          <w:color w:val="FF0000"/>
+        </w:rPr>
+        <w:t>varchar(</w:t>
+      </w:r>
+      <w:proofErr w:type="gramEnd"/>
+      <w:r>
+        <w:rPr>
+          <w:color w:val="FF0000"/>
+        </w:rPr>
+        <w:t>3) DEFAULT NULL, PRIMARY KEY (`</w:t>
       </w:r>
       <w:proofErr w:type="spellStart"/>
       <w:r>
@@ -535,7 +724,15 @@
     </w:p>
     <w:p>
       <w:r>
-        <w:t>The other information(sites and out group population information) could be filled automatically when this table is used.</w:t>
+        <w:t xml:space="preserve">The other </w:t>
+      </w:r>
+      <w:proofErr w:type="gramStart"/>
+      <w:r>
+        <w:t>information(</w:t>
+      </w:r>
+      <w:proofErr w:type="gramEnd"/>
+      <w:r>
+        <w:t>sites and out group population information) could be filled automatically when this table is used.</w:t>
       </w:r>
     </w:p>
     <w:p>
@@ -1042,7 +1239,21 @@
         <w:rPr>
           <w:rFonts w:hint="eastAsia"/>
         </w:rPr>
-        <w:t>提升至7个，但是又恐无法分辨那个是S</w:t>
+        <w:t>提升至7个，但是又</w:t>
+      </w:r>
+      <w:proofErr w:type="gramStart"/>
+      <w:r>
+        <w:rPr>
+          <w:rFonts w:hint="eastAsia"/>
+        </w:rPr>
+        <w:t>恐无法</w:t>
+      </w:r>
+      <w:proofErr w:type="gramEnd"/>
+      <w:r>
+        <w:rPr>
+          <w:rFonts w:hint="eastAsia"/>
+        </w:rPr>
+        <w:t>分辨那个是S</w:t>
       </w:r>
       <w:r>
         <w:t>NP</w:t>
@@ -1113,7 +1324,21 @@
         <w:rPr>
           <w:rFonts w:hint="eastAsia"/>
         </w:rPr>
-        <w:t>信息。目前一次一个外群，其实可以一次多个外群这样一次效率更高，当然分开单独跑c</w:t>
+        <w:t>信息。目前一次一个外群，其实可以一次多个外群这样一次效率更高，当然分开</w:t>
+      </w:r>
+      <w:proofErr w:type="gramStart"/>
+      <w:r>
+        <w:rPr>
+          <w:rFonts w:hint="eastAsia"/>
+        </w:rPr>
+        <w:t>单独跑</w:t>
+      </w:r>
+      <w:proofErr w:type="gramEnd"/>
+      <w:r>
+        <w:rPr>
+          <w:rFonts w:hint="eastAsia"/>
+        </w:rPr>
+        <w:t>c</w:t>
       </w:r>
       <w:r>
         <w:t>ontext</w:t>
@@ -1338,7 +1563,21 @@
         <w:rPr>
           <w:rFonts w:hint="eastAsia"/>
         </w:rPr>
-        <w:t>生成过程中番鸭的b</w:t>
+        <w:t>生成</w:t>
+      </w:r>
+      <w:proofErr w:type="gramStart"/>
+      <w:r>
+        <w:rPr>
+          <w:rFonts w:hint="eastAsia"/>
+        </w:rPr>
+        <w:t>过程中番鸭</w:t>
+      </w:r>
+      <w:proofErr w:type="gramEnd"/>
+      <w:r>
+        <w:rPr>
+          <w:rFonts w:hint="eastAsia"/>
+        </w:rPr>
+        <w:t>的b</w:t>
       </w:r>
       <w:r>
         <w:t>am</w:t>
@@ -1542,8 +1781,9 @@
           <w:sz w:val="24"/>
           <w:szCs w:val="24"/>
         </w:rPr>
-        <w:t xml:space="preserve"> and </w:t>
-      </w:r>
+        <w:t xml:space="preserve"> </w:t>
+      </w:r>
+      <w:proofErr w:type="gramStart"/>
       <w:r>
         <w:rPr>
           <w:rFonts w:ascii="Times New Roman" w:eastAsia="Times New Roman" w:hAnsi="Times New Roman" w:cs="Times New Roman"/>
@@ -1551,9 +1791,8 @@
           <w:sz w:val="24"/>
           <w:szCs w:val="24"/>
         </w:rPr>
-        <w:t xml:space="preserve"> </w:t>
-      </w:r>
-      <w:proofErr w:type="spellStart"/>
+        <w:t xml:space="preserve">and </w:t>
+      </w:r>
       <w:r>
         <w:rPr>
           <w:rFonts w:ascii="Times New Roman" w:eastAsia="Times New Roman" w:hAnsi="Times New Roman" w:cs="Times New Roman"/>
@@ -1561,9 +1800,9 @@
           <w:sz w:val="24"/>
           <w:szCs w:val="24"/>
         </w:rPr>
-        <w:t>Taihu</w:t>
-      </w:r>
-      <w:proofErr w:type="spellEnd"/>
+        <w:t xml:space="preserve"> </w:t>
+      </w:r>
+      <w:proofErr w:type="spellStart"/>
       <w:r>
         <w:rPr>
           <w:rFonts w:ascii="Times New Roman" w:eastAsia="Times New Roman" w:hAnsi="Times New Roman" w:cs="Times New Roman"/>
@@ -1571,8 +1810,10 @@
           <w:sz w:val="24"/>
           <w:szCs w:val="24"/>
         </w:rPr>
-        <w:t xml:space="preserve"> </w:t>
-      </w:r>
+        <w:t>Taihu</w:t>
+      </w:r>
+      <w:proofErr w:type="spellEnd"/>
+      <w:proofErr w:type="gramEnd"/>
       <w:r>
         <w:rPr>
           <w:rFonts w:ascii="Times New Roman" w:eastAsia="Times New Roman" w:hAnsi="Times New Roman" w:cs="Times New Roman"/>
@@ -1580,7 +1821,7 @@
           <w:sz w:val="24"/>
           <w:szCs w:val="24"/>
         </w:rPr>
-        <w:t xml:space="preserve">geese as outgroups using the following thresholds: (1) more than 30-fold coverage </w:t>
+        <w:t xml:space="preserve"> </w:t>
       </w:r>
       <w:r>
         <w:rPr>
@@ -1589,7 +1830,7 @@
           <w:sz w:val="24"/>
           <w:szCs w:val="24"/>
         </w:rPr>
-        <w:t>when SNP fixed</w:t>
+        <w:t xml:space="preserve">geese as outgroups using the following thresholds: (1) more than 30-fold coverage </w:t>
       </w:r>
       <w:r>
         <w:rPr>
@@ -1598,7 +1839,7 @@
           <w:sz w:val="24"/>
           <w:szCs w:val="24"/>
         </w:rPr>
-        <w:t xml:space="preserve"> </w:t>
+        <w:t>when SNP fixed</w:t>
       </w:r>
       <w:r>
         <w:rPr>
@@ -1607,7 +1848,7 @@
           <w:sz w:val="24"/>
           <w:szCs w:val="24"/>
         </w:rPr>
-        <w:t>in</w:t>
+        <w:t xml:space="preserve"> </w:t>
       </w:r>
       <w:r>
         <w:rPr>
@@ -1616,7 +1857,7 @@
           <w:sz w:val="24"/>
           <w:szCs w:val="24"/>
         </w:rPr>
-        <w:t xml:space="preserve"> </w:t>
+        <w:t>in</w:t>
       </w:r>
       <w:r>
         <w:rPr>
@@ -1625,7 +1866,7 @@
           <w:sz w:val="24"/>
           <w:szCs w:val="24"/>
         </w:rPr>
-        <w:t>one or both</w:t>
+        <w:t xml:space="preserve"> </w:t>
       </w:r>
       <w:r>
         <w:rPr>
@@ -1634,7 +1875,7 @@
           <w:sz w:val="24"/>
           <w:szCs w:val="24"/>
         </w:rPr>
-        <w:t xml:space="preserve"> outgroups; and (2) the allele </w:t>
+        <w:t>one or both</w:t>
       </w:r>
       <w:r>
         <w:rPr>
@@ -1643,7 +1884,7 @@
           <w:sz w:val="24"/>
           <w:szCs w:val="24"/>
         </w:rPr>
-        <w:t>not fixed the different directions</w:t>
+        <w:t xml:space="preserve"> outgroups; and (2) the allele </w:t>
       </w:r>
       <w:r>
         <w:rPr>
@@ -1652,6 +1893,15 @@
           <w:sz w:val="24"/>
           <w:szCs w:val="24"/>
         </w:rPr>
+        <w:t>not fixed the different directions</w:t>
+      </w:r>
+      <w:r>
+        <w:rPr>
+          <w:rFonts w:ascii="Times New Roman" w:eastAsia="Times New Roman" w:hAnsi="Times New Roman" w:cs="Times New Roman"/>
+          <w:color w:val="000000"/>
+          <w:sz w:val="24"/>
+          <w:szCs w:val="24"/>
+        </w:rPr>
         <w:t>.</w:t>
       </w:r>
     </w:p>
@@ -1717,8 +1967,9 @@
           <w:sz w:val="24"/>
           <w:szCs w:val="24"/>
         </w:rPr>
-        <w:t xml:space="preserve"> and </w:t>
-      </w:r>
+        <w:t xml:space="preserve"> </w:t>
+      </w:r>
+      <w:proofErr w:type="gramStart"/>
       <w:r>
         <w:rPr>
           <w:rFonts w:ascii="Times New Roman" w:eastAsia="Times New Roman" w:hAnsi="Times New Roman" w:cs="Times New Roman"/>
@@ -1726,9 +1977,8 @@
           <w:sz w:val="24"/>
           <w:szCs w:val="24"/>
         </w:rPr>
-        <w:t xml:space="preserve"> </w:t>
-      </w:r>
-      <w:proofErr w:type="spellStart"/>
+        <w:t xml:space="preserve">and </w:t>
+      </w:r>
       <w:r>
         <w:rPr>
           <w:rFonts w:ascii="Times New Roman" w:eastAsia="Times New Roman" w:hAnsi="Times New Roman" w:cs="Times New Roman"/>
@@ -1736,9 +1986,20 @@
           <w:sz w:val="24"/>
           <w:szCs w:val="24"/>
         </w:rPr>
+        <w:t xml:space="preserve"> </w:t>
+      </w:r>
+      <w:proofErr w:type="spellStart"/>
+      <w:r>
+        <w:rPr>
+          <w:rFonts w:ascii="Times New Roman" w:eastAsia="Times New Roman" w:hAnsi="Times New Roman" w:cs="Times New Roman"/>
+          <w:color w:val="000000"/>
+          <w:sz w:val="24"/>
+          <w:szCs w:val="24"/>
+        </w:rPr>
         <w:t>Taihu</w:t>
       </w:r>
       <w:proofErr w:type="spellEnd"/>
+      <w:proofErr w:type="gramEnd"/>
       <w:r>
         <w:rPr>
           <w:rFonts w:ascii="Times New Roman" w:eastAsia="Times New Roman" w:hAnsi="Times New Roman" w:cs="Times New Roman"/>
@@ -2354,11 +2615,6 @@
       </w:r>
     </w:p>
     <w:p>
-      <w:pPr>
-        <w:rPr>
-          <w:rFonts w:hint="eastAsia"/>
-        </w:rPr>
-      </w:pPr>
       <w:r>
         <w:t>python /ifs1/User/lrui/life/src/NGS/Analysis/Detectsignalacrossgenome_master.py -T /ifs1/User/lrui/data/duckproject/configfile/mallardBJ.VCFBAMconfig -T /ifs1/User/lrui/data/duckproject/configfile/spotbilledBJ.VCFBAMconfig -R /ifs1/User/lrui/data/duckproject/configfile/beijingBJ.VCFBAMconfig -R /ifs1/User/lrui/data/duckproject/configfile/shaoxingBJ.VCFBAMconfig -R /ifs1/User/lrui/data/duckproject/configfile/lianchengbaiBJ.VCFBAMconfig -R /ifs1/User/lrui/data/duckproject/configfile/jindingBJ.VCFBAMconfig -R /ifs1/User/lrui/data/duckproject/configfile/shanmaBJ.VCFBAMconfig -R /ifs1/User/lrui/data/duckproject/configfile/gaoyouBJ.VCFBAMconfig -R /ifs1/User/lrui/data/duckproject/configfile/cherryvalleyBJ.VCFBAMconfig -R /ifs1/User/lrui/data/duckproject/configfile/campbellBJ.VCFBAMconfig -t mspsgjlksy10pop_toplevel_pekingduckref -w 20000 -s 10000 -c /ifs1/User/lrui/database/all_sep_chrfiles/pekingduckchrominfo.5MBPLUS_1 -c /ifs1/User/lrui/database/all_sep_chrfiles/pekingduckchrominfo.2MB_5MB_part1_2 -c /ifs1/User/lrui/database/all_sep_chrfiles/pekingduckchrominfo.2MB_5MB_part2_2 -c /ifs1/User/lrui/database/all_sep_chrfiles/pekingduckchrominfo.100kb_2MB_part1_3 -c /ifs1/User/lrui/database/all_sep_chrfiles/pekingduckchrominfo.100kb_2MB_part2_3 -c /ifs1/User/lrui/database/all_sep_chrfiles/pekingduckchrominfo.100kb_2MB_part3_3 -c /ifs1/User/lrui/database/all_sep_chrfiles/pekingduckchrominfo.100kb_2MB_part4_3 -c /ifs1/User/lrui/database/all_sep_chrfiles/pekingduckchrominfo.100kb_2MB_part5_3 -c /ifs1/User/lrui/database/all_sep_chrfiles/pekingduckchrominfo.40kb_100kb_4 -c /ifs1/User/lrui/database/all_sep_chrfiles/pekingduckchrominfo.5kb_40kb_5 -C ancientMixChr20k10k.freq_correlation_merged -o /ifs1/User/lrui/data/duckproject/detectseletion/ancientMixChr20k10k</w:t>
       </w:r>
@@ -2371,8 +2627,6 @@
       <w:r>
         <w:t>thCorrfile</w:t>
       </w:r>
-      <w:bookmarkStart w:id="0" w:name="_GoBack"/>
-      <w:bookmarkEnd w:id="0"/>
       <w:r>
         <w:t xml:space="preserve"> -p early -1 /ifs1/User/lrui/life/src/NGS/Slave/Detectsignalacrossgenome_producecorrelation_slave.py -2 /ifs1/User/lrui/life/src/NGS/Slave/Detectsignalacrossgenome_slidewin_slave.py</w:t>
       </w:r>
@@ -2396,8 +2650,596 @@
           <w:b/>
           <w:bCs/>
         </w:rPr>
-        <w:t>找到受选择区域，同时注释受选择区域基因并做功能富集分析。</w:t>
-      </w:r>
+        <w:t>找到</w:t>
+      </w:r>
+      <w:proofErr w:type="gramStart"/>
+      <w:r>
+        <w:rPr>
+          <w:rFonts w:hint="eastAsia"/>
+          <w:b/>
+          <w:bCs/>
+        </w:rPr>
+        <w:t>受选择</w:t>
+      </w:r>
+      <w:proofErr w:type="gramEnd"/>
+      <w:r>
+        <w:rPr>
+          <w:rFonts w:hint="eastAsia"/>
+          <w:b/>
+          <w:bCs/>
+        </w:rPr>
+        <w:t>区域，同时</w:t>
+      </w:r>
+      <w:proofErr w:type="gramStart"/>
+      <w:r>
+        <w:rPr>
+          <w:rFonts w:hint="eastAsia"/>
+          <w:b/>
+          <w:bCs/>
+        </w:rPr>
+        <w:t>注释受选择</w:t>
+      </w:r>
+      <w:proofErr w:type="gramEnd"/>
+      <w:r>
+        <w:rPr>
+          <w:rFonts w:hint="eastAsia"/>
+          <w:b/>
+          <w:bCs/>
+        </w:rPr>
+        <w:t>区域基因并做功能富集分析。</w:t>
+      </w:r>
+    </w:p>
+    <w:p>
+      <w:pPr>
+        <w:rPr>
+          <w:b/>
+          <w:bCs/>
+        </w:rPr>
+      </w:pPr>
+      <w:r>
+        <w:rPr>
+          <w:rFonts w:hint="eastAsia"/>
+          <w:b/>
+          <w:bCs/>
+        </w:rPr>
+        <w:t>用到两个</w:t>
+      </w:r>
+      <w:proofErr w:type="spellStart"/>
+      <w:r>
+        <w:rPr>
+          <w:rFonts w:hint="eastAsia"/>
+          <w:b/>
+          <w:bCs/>
+        </w:rPr>
+        <w:t>m</w:t>
+      </w:r>
+      <w:r>
+        <w:rPr>
+          <w:b/>
+          <w:bCs/>
+        </w:rPr>
+        <w:t>ysql</w:t>
+      </w:r>
+      <w:proofErr w:type="spellEnd"/>
+      <w:r>
+        <w:rPr>
+          <w:rFonts w:hint="eastAsia"/>
+          <w:b/>
+          <w:bCs/>
+        </w:rPr>
+        <w:t xml:space="preserve">表，其中一个很重要的表 </w:t>
+      </w:r>
+      <w:proofErr w:type="spellStart"/>
+      <w:r>
+        <w:rPr>
+          <w:b/>
+          <w:bCs/>
+        </w:rPr>
+        <w:t>transcripttable</w:t>
+      </w:r>
+      <w:proofErr w:type="spellEnd"/>
+    </w:p>
+    <w:p>
+      <w:r>
+        <w:rPr>
+          <w:rFonts w:hint="eastAsia"/>
+        </w:rPr>
+        <w:t>在</w:t>
+      </w:r>
+      <w:r>
+        <w:t xml:space="preserve">backupfrom94/databases </w:t>
+      </w:r>
+      <w:r>
+        <w:rPr>
+          <w:rFonts w:hint="eastAsia"/>
+        </w:rPr>
+        <w:t>中找到几张表，回去看一下T</w:t>
+      </w:r>
+      <w:r>
+        <w:t>420</w:t>
+      </w:r>
+      <w:r>
+        <w:rPr>
+          <w:rFonts w:hint="eastAsia"/>
+        </w:rPr>
+        <w:t>电脑里面有没有别的表，再对比一下大硬盘里面有没有表的数据，以及学校1</w:t>
+      </w:r>
+      <w:r>
+        <w:t>17</w:t>
+      </w:r>
+      <w:r>
+        <w:rPr>
+          <w:rFonts w:hint="eastAsia"/>
+        </w:rPr>
+        <w:t>服务器。</w:t>
+      </w:r>
+      <w:r>
+        <w:rPr>
+          <w:rFonts w:hint="eastAsia"/>
+        </w:rPr>
+        <w:t>估计</w:t>
+      </w:r>
+      <w:proofErr w:type="spellStart"/>
+      <w:r>
+        <w:t>pekinduckchromTranscript_tomysql_uniq</w:t>
+      </w:r>
+      <w:proofErr w:type="spellEnd"/>
+      <w:r>
+        <w:t xml:space="preserve"> </w:t>
+      </w:r>
+      <w:r>
+        <w:rPr>
+          <w:rFonts w:hint="eastAsia"/>
+        </w:rPr>
+        <w:t>应该是最后实际导入数据库的表，只有这个表用的是</w:t>
+      </w:r>
+      <w:r>
+        <w:t>+/-</w:t>
+      </w:r>
+      <w:r>
+        <w:rPr>
+          <w:rFonts w:hint="eastAsia"/>
+        </w:rPr>
+        <w:t>表示正负连，其他用的是±1表示。</w:t>
+      </w:r>
+    </w:p>
+    <w:p>
+      <w:r>
+        <w:rPr>
+          <w:rFonts w:hint="eastAsia"/>
+        </w:rPr>
+        <w:t>表的结构可能找不到了，重新定义吧</w:t>
+      </w:r>
+    </w:p>
+    <w:p>
+      <w:r>
+        <w:t xml:space="preserve">CREATE TABLE </w:t>
+      </w:r>
+      <w:proofErr w:type="spellStart"/>
+      <w:r>
+        <w:t>pekinduckmiRNA_</w:t>
+      </w:r>
+      <w:proofErr w:type="gramStart"/>
+      <w:r>
+        <w:t>Transcript</w:t>
+      </w:r>
+      <w:proofErr w:type="spellEnd"/>
+      <w:r>
+        <w:t>(</w:t>
+      </w:r>
+      <w:proofErr w:type="gramEnd"/>
+    </w:p>
+    <w:p>
+      <w:r>
+        <w:tab/>
+      </w:r>
+      <w:proofErr w:type="spellStart"/>
+      <w:r>
+        <w:t>transcript_ID</w:t>
+      </w:r>
+      <w:proofErr w:type="spellEnd"/>
+      <w:r>
+        <w:t xml:space="preserve"> </w:t>
+      </w:r>
+      <w:proofErr w:type="gramStart"/>
+      <w:r>
+        <w:t>VARCHAR(</w:t>
+      </w:r>
+      <w:proofErr w:type="gramEnd"/>
+      <w:r>
+        <w:t>128) NOT NULL,</w:t>
+      </w:r>
+    </w:p>
+    <w:p>
+      <w:r>
+        <w:tab/>
+      </w:r>
+      <w:proofErr w:type="spellStart"/>
+      <w:r>
+        <w:t>geneID</w:t>
+      </w:r>
+      <w:proofErr w:type="spellEnd"/>
+      <w:r>
+        <w:t xml:space="preserve"> </w:t>
+      </w:r>
+      <w:proofErr w:type="gramStart"/>
+      <w:r>
+        <w:t>VARCHAR(</w:t>
+      </w:r>
+      <w:proofErr w:type="gramEnd"/>
+      <w:r>
+        <w:t>128),</w:t>
+      </w:r>
+    </w:p>
+    <w:p>
+      <w:r>
+        <w:tab/>
+      </w:r>
+      <w:proofErr w:type="spellStart"/>
+      <w:r>
+        <w:t>geneName</w:t>
+      </w:r>
+      <w:proofErr w:type="spellEnd"/>
+      <w:r>
+        <w:t xml:space="preserve"> </w:t>
+      </w:r>
+      <w:proofErr w:type="gramStart"/>
+      <w:r>
+        <w:t>VARCHAR(</w:t>
+      </w:r>
+      <w:proofErr w:type="gramEnd"/>
+      <w:r>
+        <w:t>128),</w:t>
+      </w:r>
+    </w:p>
+    <w:p>
+      <w:r>
+        <w:tab/>
+      </w:r>
+      <w:proofErr w:type="spellStart"/>
+      <w:r>
+        <w:t>chrID</w:t>
+      </w:r>
+      <w:proofErr w:type="spellEnd"/>
+      <w:r>
+        <w:t xml:space="preserve"> </w:t>
+      </w:r>
+      <w:proofErr w:type="gramStart"/>
+      <w:r>
+        <w:t>VARCHAR(</w:t>
+      </w:r>
+      <w:proofErr w:type="gramEnd"/>
+      <w:r>
+        <w:t>128) NOT NULL ,</w:t>
+      </w:r>
+    </w:p>
+    <w:p>
+      <w:r>
+        <w:lastRenderedPageBreak/>
+        <w:tab/>
+      </w:r>
+      <w:proofErr w:type="spellStart"/>
+      <w:r>
+        <w:t>GCcontent</w:t>
+      </w:r>
+      <w:proofErr w:type="spellEnd"/>
+      <w:r>
+        <w:t xml:space="preserve"> FLOAT,</w:t>
+      </w:r>
+    </w:p>
+    <w:p>
+      <w:r>
+        <w:tab/>
+      </w:r>
+      <w:proofErr w:type="spellStart"/>
+      <w:r>
+        <w:t>trscpt_start_pos</w:t>
+      </w:r>
+      <w:proofErr w:type="spellEnd"/>
+      <w:r>
+        <w:t xml:space="preserve"> </w:t>
+      </w:r>
+      <w:proofErr w:type="gramStart"/>
+      <w:r>
+        <w:t>BIGINT(</w:t>
+      </w:r>
+      <w:proofErr w:type="gramEnd"/>
+      <w:r>
+        <w:t>20),</w:t>
+      </w:r>
+    </w:p>
+    <w:p>
+      <w:r>
+        <w:tab/>
+      </w:r>
+      <w:proofErr w:type="spellStart"/>
+      <w:r>
+        <w:t>trscpt_end_pos</w:t>
+      </w:r>
+      <w:proofErr w:type="spellEnd"/>
+      <w:r>
+        <w:t xml:space="preserve"> </w:t>
+      </w:r>
+      <w:proofErr w:type="gramStart"/>
+      <w:r>
+        <w:t>BIGINT(</w:t>
+      </w:r>
+      <w:proofErr w:type="gramEnd"/>
+      <w:r>
+        <w:t>20),</w:t>
+      </w:r>
+    </w:p>
+    <w:p>
+      <w:r>
+        <w:tab/>
+        <w:t xml:space="preserve">strand </w:t>
+      </w:r>
+      <w:proofErr w:type="gramStart"/>
+      <w:r>
+        <w:t>CHAR(</w:t>
+      </w:r>
+      <w:proofErr w:type="gramEnd"/>
+      <w:r>
+        <w:t>1),</w:t>
+      </w:r>
+    </w:p>
+    <w:p>
+      <w:r>
+        <w:tab/>
+        <w:t xml:space="preserve">description </w:t>
+      </w:r>
+      <w:proofErr w:type="gramStart"/>
+      <w:r>
+        <w:t>VARCHAR(</w:t>
+      </w:r>
+      <w:proofErr w:type="gramEnd"/>
+      <w:r>
+        <w:t>1000),</w:t>
+      </w:r>
+    </w:p>
+    <w:p>
+      <w:r>
+        <w:tab/>
+        <w:t>PRIMARY KEY (</w:t>
+      </w:r>
+      <w:proofErr w:type="spellStart"/>
+      <w:r>
+        <w:t>transcript_ID</w:t>
+      </w:r>
+      <w:proofErr w:type="spellEnd"/>
+      <w:r>
+        <w:t>),</w:t>
+      </w:r>
+    </w:p>
+    <w:p>
+      <w:r>
+        <w:tab/>
+        <w:t>#foreign key(</w:t>
+      </w:r>
+      <w:proofErr w:type="spellStart"/>
+      <w:r>
+        <w:t>geneID</w:t>
+      </w:r>
+      <w:proofErr w:type="spellEnd"/>
+      <w:r>
+        <w:t>)references gene(</w:t>
+      </w:r>
+      <w:proofErr w:type="spellStart"/>
+      <w:r>
+        <w:t>geneID</w:t>
+      </w:r>
+      <w:proofErr w:type="spellEnd"/>
+      <w:r>
+        <w:t>),</w:t>
+      </w:r>
+    </w:p>
+    <w:p>
+      <w:r>
+        <w:tab/>
+        <w:t xml:space="preserve">FOREIGN </w:t>
+      </w:r>
+      <w:proofErr w:type="gramStart"/>
+      <w:r>
+        <w:t>KEY(</w:t>
+      </w:r>
+      <w:proofErr w:type="spellStart"/>
+      <w:proofErr w:type="gramEnd"/>
+      <w:r>
+        <w:t>chrID</w:t>
+      </w:r>
+      <w:proofErr w:type="spellEnd"/>
+      <w:r>
+        <w:t xml:space="preserve">)REFERENCES </w:t>
+      </w:r>
+      <w:proofErr w:type="spellStart"/>
+      <w:r>
+        <w:t>pekingduckchrominfo</w:t>
+      </w:r>
+      <w:proofErr w:type="spellEnd"/>
+      <w:r>
+        <w:t>(</w:t>
+      </w:r>
+      <w:proofErr w:type="spellStart"/>
+      <w:r>
+        <w:t>chrID</w:t>
+      </w:r>
+      <w:proofErr w:type="spellEnd"/>
+      <w:r>
+        <w:t>))ENGINE=MYISAM DEFAULT CHARSET=utf8</w:t>
+      </w:r>
+    </w:p>
+    <w:p>
+      <w:r>
+        <w:t>miRNA</w:t>
+      </w:r>
+      <w:r>
+        <w:rPr>
+          <w:rFonts w:hint="eastAsia"/>
+        </w:rPr>
+        <w:t>应该是f</w:t>
+      </w:r>
+      <w:r>
+        <w:t>a</w:t>
+      </w:r>
+      <w:r>
+        <w:rPr>
+          <w:rFonts w:hint="eastAsia"/>
+        </w:rPr>
+        <w:t xml:space="preserve">数据或者是老版本基因组坐标，之后用 </w:t>
+      </w:r>
+      <w:r>
+        <w:t xml:space="preserve">    </w:t>
+      </w:r>
+      <w:r>
+        <w:t>insertTOTranscripttableTransformScaffold</w:t>
+      </w:r>
+      <w:r>
+        <w:t>.py</w:t>
+      </w:r>
+      <w:r>
+        <w:rPr>
+          <w:rFonts w:hint="eastAsia"/>
+        </w:rPr>
+        <w:t>程序转换之后填入了数据库</w:t>
+      </w:r>
+      <w:r>
+        <w:t>)</w:t>
+      </w:r>
+      <w:r>
+        <w:rPr>
+          <w:rFonts w:hint="eastAsia"/>
+        </w:rPr>
+        <w:t>还是需要查一下试验记录本。</w:t>
+      </w:r>
+      <w:proofErr w:type="spellStart"/>
+      <w:r>
+        <w:t>allmirnafromHuangmiRNAseq.bed.loadtomysql</w:t>
+      </w:r>
+      <w:proofErr w:type="spellEnd"/>
+    </w:p>
+    <w:p/>
+    <w:p>
+      <w:r>
+        <w:rPr>
+          <w:rFonts w:hint="eastAsia"/>
+        </w:rPr>
+        <w:t>有一个</w:t>
+      </w:r>
+      <w:proofErr w:type="spellStart"/>
+      <w:r>
+        <w:rPr>
+          <w:rFonts w:hint="eastAsia"/>
+        </w:rPr>
+        <w:t>c</w:t>
+      </w:r>
+      <w:r>
+        <w:t>airo</w:t>
+      </w:r>
+      <w:proofErr w:type="spellEnd"/>
+      <w:r>
+        <w:rPr>
+          <w:rFonts w:hint="eastAsia"/>
+        </w:rPr>
+        <w:t>包怎么也安不上，也就是说只能找到区间无法自动出图了，经测试，对以前的</w:t>
+      </w:r>
+      <w:proofErr w:type="spellStart"/>
+      <w:r>
+        <w:rPr>
+          <w:rFonts w:hint="eastAsia"/>
+        </w:rPr>
+        <w:t>w</w:t>
+      </w:r>
+      <w:r>
+        <w:t>infile</w:t>
+      </w:r>
+      <w:proofErr w:type="spellEnd"/>
+      <w:r>
+        <w:rPr>
+          <w:rFonts w:hint="eastAsia"/>
+        </w:rPr>
+        <w:t>探测得到的受选择区间文件</w:t>
+      </w:r>
+      <w:r>
+        <w:rPr>
+          <w:rFonts w:hint="eastAsia"/>
+        </w:rPr>
+        <w:t>一致。所以程序和数据库都没有问题。</w:t>
+      </w:r>
+    </w:p>
+    <w:p>
+      <w:pPr>
+        <w:rPr>
+          <w:rFonts w:hint="eastAsia"/>
+        </w:rPr>
+      </w:pPr>
+      <w:r>
+        <w:t xml:space="preserve">python ~/life/src/NGS/tempRUN/testmakemht_hist.py -n /ifs1/User/lrui/data/duckproject/detectseletion/ancientseletion/selectedRegionInMallard_spotbilledEarlyStage_pk_sx_sm_g_l_j_k_yVSmallardspotbilled_split_m_s_g_l_j_k_y_p_s_s.earlypostiveselected.zscorefile.align.20000_10000  -4_Hp_in_domestic_lineage_-2 </w:t>
+      </w:r>
+      <w:proofErr w:type="spellStart"/>
+      <w:r>
+        <w:t>domestichp</w:t>
+      </w:r>
+      <w:proofErr w:type="spellEnd"/>
+      <w:r>
+        <w:t xml:space="preserve"> </w:t>
+      </w:r>
+      <w:r>
+        <w:rPr>
+          <w:color w:val="FF0000"/>
+        </w:rPr>
+        <w:t>-A /ifs1/User/</w:t>
+      </w:r>
+      <w:proofErr w:type="spellStart"/>
+      <w:r>
+        <w:rPr>
+          <w:color w:val="FF0000"/>
+        </w:rPr>
+        <w:t>lrui</w:t>
+      </w:r>
+      <w:proofErr w:type="spellEnd"/>
+      <w:r>
+        <w:rPr>
+          <w:color w:val="FF0000"/>
+        </w:rPr>
+        <w:t>/database/</w:t>
+      </w:r>
+      <w:proofErr w:type="spellStart"/>
+      <w:r>
+        <w:rPr>
+          <w:color w:val="FF0000"/>
+        </w:rPr>
+        <w:t>Duck_anchor_ref_query.txtchanged</w:t>
+      </w:r>
+      <w:proofErr w:type="spellEnd"/>
+      <w:r>
+        <w:t xml:space="preserve"> -g /ifs1/User/</w:t>
+      </w:r>
+      <w:proofErr w:type="spellStart"/>
+      <w:r>
+        <w:t>lrui</w:t>
+      </w:r>
+      <w:proofErr w:type="spellEnd"/>
+      <w:r>
+        <w:t>/database/</w:t>
+      </w:r>
+      <w:proofErr w:type="spellStart"/>
+      <w:r>
+        <w:t>duckGO.table</w:t>
+      </w:r>
+      <w:proofErr w:type="spellEnd"/>
+      <w:r>
+        <w:t xml:space="preserve"> -X </w:t>
+      </w:r>
+      <w:proofErr w:type="spellStart"/>
+      <w:r>
+        <w:t>zvalue</w:t>
+      </w:r>
+      <w:proofErr w:type="spellEnd"/>
+      <w:r>
+        <w:t xml:space="preserve"> -N 1 -w 40000 -s 20000 -u 1000 -d 1000 -o /ifs1/User/lrui/data/duckproject/detectseletion/domestication/test</w:t>
+      </w:r>
+      <w:bookmarkStart w:id="0" w:name="_GoBack"/>
+      <w:bookmarkEnd w:id="0"/>
     </w:p>
     <w:sectPr>
       <w:pgSz w:w="11906" w:h="16838"/>

</xml_diff>

<commit_message>
py2_7 restart dadi for yiqiangzhao and me
</commit_message>
<xml_diff>
--- a/ancient seletion早期选择分析.docx
+++ b/ancient seletion早期选择分析.docx
@@ -1,6 +1,6 @@
 
 <file path=word/document.xml><?xml version="1.0" encoding="utf-8"?>
-<w:document xmlns:wpc="http://schemas.microsoft.com/office/word/2010/wordprocessingCanvas" xmlns:cx="http://schemas.microsoft.com/office/drawing/2014/chartex" xmlns:cx1="http://schemas.microsoft.com/office/drawing/2015/9/8/chartex" xmlns:cx2="http://schemas.microsoft.com/office/drawing/2015/10/21/chartex" xmlns:cx3="http://schemas.microsoft.com/office/drawing/2016/5/9/chartex" xmlns:cx4="http://schemas.microsoft.com/office/drawing/2016/5/10/chartex" xmlns:cx5="http://schemas.microsoft.com/office/drawing/2016/5/11/chartex" xmlns:cx6="http://schemas.microsoft.com/office/drawing/2016/5/12/chartex" xmlns:cx7="http://schemas.microsoft.com/office/drawing/2016/5/13/chartex" xmlns:cx8="http://schemas.microsoft.com/office/drawing/2016/5/14/chartex" xmlns:mc="http://schemas.openxmlformats.org/markup-compatibility/2006" xmlns:aink="http://schemas.microsoft.com/office/drawing/2016/ink" xmlns:am3d="http://schemas.microsoft.com/office/drawing/2017/model3d" xmlns:o="urn:schemas-microsoft-com:office:office" xmlns:r="http://schemas.openxmlformats.org/officeDocument/2006/relationships" xmlns:m="http://schemas.openxmlformats.org/officeDocument/2006/math" xmlns:v="urn:schemas-microsoft-com:vml" xmlns:wp14="http://schemas.microsoft.com/office/word/2010/wordprocessingDrawing" xmlns:wp="http://schemas.openxmlformats.org/drawingml/2006/wordprocessingDrawing" xmlns:w10="urn:schemas-microsoft-com:office:word" xmlns:w="http://schemas.openxmlformats.org/wordprocessingml/2006/main" xmlns:w14="http://schemas.microsoft.com/office/word/2010/wordml" xmlns:w15="http://schemas.microsoft.com/office/word/2012/wordml" xmlns:w16cid="http://schemas.microsoft.com/office/word/2016/wordml/cid" xmlns:w16se="http://schemas.microsoft.com/office/word/2015/wordml/symex" xmlns:wpg="http://schemas.microsoft.com/office/word/2010/wordprocessingGroup" xmlns:wpi="http://schemas.microsoft.com/office/word/2010/wordprocessingInk" xmlns:wne="http://schemas.microsoft.com/office/word/2006/wordml" xmlns:wps="http://schemas.microsoft.com/office/word/2010/wordprocessingShape" mc:Ignorable="w14 w15 w16se w16cid wp14">
+<w:document xmlns:wpc="http://schemas.microsoft.com/office/word/2010/wordprocessingCanvas" xmlns:cx="http://schemas.microsoft.com/office/drawing/2014/chartex" xmlns:cx1="http://schemas.microsoft.com/office/drawing/2015/9/8/chartex" xmlns:cx2="http://schemas.microsoft.com/office/drawing/2015/10/21/chartex" xmlns:cx3="http://schemas.microsoft.com/office/drawing/2016/5/9/chartex" xmlns:cx4="http://schemas.microsoft.com/office/drawing/2016/5/10/chartex" xmlns:cx5="http://schemas.microsoft.com/office/drawing/2016/5/11/chartex" xmlns:cx6="http://schemas.microsoft.com/office/drawing/2016/5/12/chartex" xmlns:cx7="http://schemas.microsoft.com/office/drawing/2016/5/13/chartex" xmlns:cx8="http://schemas.microsoft.com/office/drawing/2016/5/14/chartex" xmlns:mc="http://schemas.openxmlformats.org/markup-compatibility/2006" xmlns:aink="http://schemas.microsoft.com/office/drawing/2016/ink" xmlns:am3d="http://schemas.microsoft.com/office/drawing/2017/model3d" xmlns:o="urn:schemas-microsoft-com:office:office" xmlns:r="http://schemas.openxmlformats.org/officeDocument/2006/relationships" xmlns:m="http://schemas.openxmlformats.org/officeDocument/2006/math" xmlns:v="urn:schemas-microsoft-com:vml" xmlns:wp14="http://schemas.microsoft.com/office/word/2010/wordprocessingDrawing" xmlns:wp="http://schemas.openxmlformats.org/drawingml/2006/wordprocessingDrawing" xmlns:w10="urn:schemas-microsoft-com:office:word" xmlns:w="http://schemas.openxmlformats.org/wordprocessingml/2006/main" xmlns:w14="http://schemas.microsoft.com/office/word/2010/wordml" xmlns:w15="http://schemas.microsoft.com/office/word/2012/wordml" xmlns:w16cex="http://schemas.microsoft.com/office/word/2018/wordml/cex" xmlns:w16cid="http://schemas.microsoft.com/office/word/2016/wordml/cid" xmlns:w16="http://schemas.microsoft.com/office/word/2018/wordml" xmlns:w16sdtdh="http://schemas.microsoft.com/office/word/2020/wordml/sdtdatahash" xmlns:w16se="http://schemas.microsoft.com/office/word/2015/wordml/symex" xmlns:wpg="http://schemas.microsoft.com/office/word/2010/wordprocessingGroup" xmlns:wpi="http://schemas.microsoft.com/office/word/2010/wordprocessingInk" xmlns:wne="http://schemas.microsoft.com/office/word/2006/wordml" xmlns:wps="http://schemas.microsoft.com/office/word/2010/wordprocessingShape" mc:Ignorable="w14 w15 w16se w16cid w16 w16cex w16sdtdh wp14">
   <w:body>
     <w:p>
       <w:pPr>
@@ -22,7 +22,47 @@
           <w:b/>
           <w:bCs/>
         </w:rPr>
-        <w:t>添加程序需要的存储过程。</w:t>
+        <w:t>加程序需要的</w:t>
+      </w:r>
+      <w:r>
+        <w:rPr>
+          <w:rFonts w:ascii="Times New Roman" w:hAnsi="Times New Roman" w:cs="Times New Roman"/>
+          <w:b/>
+          <w:bCs/>
+        </w:rPr>
+        <w:t>’</w:t>
+      </w:r>
+      <w:r>
+        <w:rPr>
+          <w:rFonts w:ascii="Times New Roman" w:hAnsi="Times New Roman" w:cs="Times New Roman"/>
+          <w:b/>
+          <w:bCs/>
+        </w:rPr>
+        <w:t>存储过程</w:t>
+      </w:r>
+      <w:r>
+        <w:rPr>
+          <w:rFonts w:ascii="Times New Roman" w:hAnsi="Times New Roman" w:cs="Times New Roman" w:hint="eastAsia"/>
+          <w:b/>
+          <w:bCs/>
+        </w:rPr>
+        <w:t>.</w:t>
+      </w:r>
+      <w:r>
+        <w:rPr>
+          <w:rFonts w:ascii="Times New Roman" w:hAnsi="Times New Roman" w:cs="Times New Roman"/>
+          <w:b/>
+          <w:bCs/>
+        </w:rPr>
+        <w:t>txt’</w:t>
+      </w:r>
+      <w:r>
+        <w:rPr>
+          <w:rFonts w:ascii="Times New Roman" w:hAnsi="Times New Roman" w:cs="Times New Roman"/>
+          <w:b/>
+          <w:bCs/>
+        </w:rPr>
+        <w:t>。</w:t>
       </w:r>
     </w:p>
     <w:p>
@@ -78,229 +118,208 @@
     </w:p>
     <w:p>
       <w:r>
-        <w:t>`</w:t>
-      </w:r>
-      <w:proofErr w:type="spellStart"/>
-      <w:r>
-        <w:t>chrID</w:t>
-      </w:r>
-      <w:proofErr w:type="spellEnd"/>
-      <w:r>
-        <w:t xml:space="preserve">` char(128) NOT NULL DEFAULT '',                               </w:t>
-      </w:r>
-    </w:p>
-    <w:p>
-      <w:r>
-        <w:t>`</w:t>
-      </w:r>
-      <w:proofErr w:type="spellStart"/>
-      <w:r>
-        <w:t>snp_pos</w:t>
-      </w:r>
-      <w:proofErr w:type="spellEnd"/>
-      <w:r>
-        <w:t xml:space="preserve">` </w:t>
-      </w:r>
-      <w:proofErr w:type="spellStart"/>
-      <w:r>
-        <w:t>bigint</w:t>
-      </w:r>
-      <w:proofErr w:type="spellEnd"/>
-      <w:r>
-        <w:t xml:space="preserve">(20) NOT NULL DEFAULT '0',                           </w:t>
-      </w:r>
-    </w:p>
-    <w:p>
-      <w:r>
-        <w:t>`</w:t>
-      </w:r>
-      <w:proofErr w:type="spellStart"/>
-      <w:r>
-        <w:t>snpID</w:t>
-      </w:r>
-      <w:proofErr w:type="spellEnd"/>
-      <w:r>
-        <w:t xml:space="preserve">` char(128) NOT NULL,                                          </w:t>
-      </w:r>
-    </w:p>
-    <w:p>
-      <w:r>
-        <w:t>`</w:t>
-      </w:r>
-      <w:proofErr w:type="spellStart"/>
-      <w:r>
-        <w:t>ref_base</w:t>
-      </w:r>
-      <w:proofErr w:type="spellEnd"/>
-      <w:r>
-        <w:t xml:space="preserve">` varchar(1000) DEFAULT NULL,                               </w:t>
-      </w:r>
-    </w:p>
-    <w:p>
-      <w:r>
-        <w:t>`</w:t>
-      </w:r>
-      <w:proofErr w:type="spellStart"/>
-      <w:r>
-        <w:t>alt_base</w:t>
-      </w:r>
-      <w:proofErr w:type="spellEnd"/>
-      <w:r>
-        <w:t xml:space="preserve">` varchar(1000) DEFAULT NULL,                               </w:t>
-      </w:r>
-    </w:p>
-    <w:p>
-      <w:r>
-        <w:t xml:space="preserve">`context` varchar(3) DEFAULT NULL,                                   </w:t>
-      </w:r>
-    </w:p>
-    <w:p>
-      <w:r>
-        <w:t>`</w:t>
-      </w:r>
-      <w:proofErr w:type="spellStart"/>
-      <w:r>
-        <w:t>wegeon</w:t>
-      </w:r>
-      <w:proofErr w:type="spellEnd"/>
-      <w:r>
-        <w:t>__</w:t>
-      </w:r>
-      <w:proofErr w:type="spellStart"/>
-      <w:r>
-        <w:t>pool_withindel_vcf_alt</w:t>
-      </w:r>
-      <w:proofErr w:type="spellEnd"/>
-      <w:r>
-        <w:t xml:space="preserve">` char(128) DEFAULT NULL,             </w:t>
-      </w:r>
-    </w:p>
-    <w:p>
-      <w:r>
-        <w:t>`</w:t>
-      </w:r>
-      <w:proofErr w:type="spellStart"/>
-      <w:r>
-        <w:t>wegeon</w:t>
-      </w:r>
-      <w:proofErr w:type="spellEnd"/>
-      <w:r>
-        <w:t>__</w:t>
-      </w:r>
-      <w:proofErr w:type="spellStart"/>
-      <w:r>
-        <w:t>pool_withindel_vcf_dep</w:t>
-      </w:r>
-      <w:proofErr w:type="spellEnd"/>
-      <w:r>
-        <w:t xml:space="preserve">` char(128) DEFAULT NULL,             </w:t>
-      </w:r>
-    </w:p>
-    <w:p>
-      <w:r>
-        <w:t xml:space="preserve">`fanya1_pool_withindel_vcf_alt` char(128) DEFAULT NULL,              </w:t>
-      </w:r>
-    </w:p>
-    <w:p>
-      <w:r>
-        <w:t xml:space="preserve">`fanya1_pool_withindel_vcf_dep` char(128) DEFAULT NULL,              </w:t>
-      </w:r>
-    </w:p>
-    <w:p>
-      <w:r>
-        <w:t>`</w:t>
-      </w:r>
-      <w:proofErr w:type="spellStart"/>
-      <w:r>
-        <w:t>barheadedgoose_pool_withindel_vcf_alt</w:t>
-      </w:r>
-      <w:proofErr w:type="spellEnd"/>
-      <w:r>
-        <w:t xml:space="preserve">` char(128) DEFAULT NULL,      </w:t>
-      </w:r>
-    </w:p>
-    <w:p>
-      <w:r>
-        <w:t>`</w:t>
-      </w:r>
-      <w:proofErr w:type="spellStart"/>
-      <w:r>
-        <w:t>barheadedgoose_pool_withindel_vcf_dep</w:t>
-      </w:r>
-      <w:proofErr w:type="spellEnd"/>
-      <w:r>
-        <w:t xml:space="preserve">` char(128) DEFAULT NULL,      </w:t>
-      </w:r>
-    </w:p>
-    <w:p>
-      <w:r>
-        <w:t>`</w:t>
-      </w:r>
-      <w:proofErr w:type="spellStart"/>
-      <w:r>
-        <w:t>taihudomesticgoose_pool_withindel_vcf_alt</w:t>
-      </w:r>
-      <w:proofErr w:type="spellEnd"/>
-      <w:r>
-        <w:t xml:space="preserve">` char(128) DEFAULT NULL,  </w:t>
-      </w:r>
-    </w:p>
-    <w:p>
-      <w:r>
-        <w:t>`</w:t>
-      </w:r>
-      <w:proofErr w:type="spellStart"/>
-      <w:r>
-        <w:t>taihudomesticgoose_pool_withindel_vcf_dep</w:t>
-      </w:r>
-      <w:proofErr w:type="spellEnd"/>
-      <w:r>
-        <w:t xml:space="preserve">` char(128) DEFAULT NULL,  </w:t>
-      </w:r>
-    </w:p>
-    <w:p>
-      <w:r>
-        <w:t>PRIMARY KEY (`</w:t>
-      </w:r>
-      <w:proofErr w:type="spellStart"/>
-      <w:r>
-        <w:t>chrID</w:t>
-      </w:r>
-      <w:proofErr w:type="spellEnd"/>
+        <w:t xml:space="preserve">`chrID` </w:t>
+      </w:r>
+      <w:proofErr w:type="gramStart"/>
+      <w:r>
+        <w:t>char(</w:t>
+      </w:r>
+      <w:proofErr w:type="gramEnd"/>
+      <w:r>
+        <w:t xml:space="preserve">128) NOT NULL DEFAULT '',                               </w:t>
+      </w:r>
+    </w:p>
+    <w:p>
+      <w:r>
+        <w:t xml:space="preserve">`snp_pos` </w:t>
+      </w:r>
+      <w:proofErr w:type="gramStart"/>
+      <w:r>
+        <w:t>bigint(</w:t>
+      </w:r>
+      <w:proofErr w:type="gramEnd"/>
+      <w:r>
+        <w:t xml:space="preserve">20) NOT NULL DEFAULT '0',                           </w:t>
+      </w:r>
+    </w:p>
+    <w:p>
+      <w:r>
+        <w:t xml:space="preserve">`snpID` </w:t>
+      </w:r>
+      <w:proofErr w:type="gramStart"/>
+      <w:r>
+        <w:t>char(</w:t>
+      </w:r>
+      <w:proofErr w:type="gramEnd"/>
+      <w:r>
+        <w:t xml:space="preserve">128) NOT NULL,                                          </w:t>
+      </w:r>
+    </w:p>
+    <w:p>
+      <w:r>
+        <w:t xml:space="preserve">`ref_base` </w:t>
+      </w:r>
+      <w:proofErr w:type="gramStart"/>
+      <w:r>
+        <w:t>varchar(</w:t>
+      </w:r>
+      <w:proofErr w:type="gramEnd"/>
+      <w:r>
+        <w:t xml:space="preserve">1000) DEFAULT NULL,                               </w:t>
+      </w:r>
+    </w:p>
+    <w:p>
+      <w:r>
+        <w:t xml:space="preserve">`alt_base` </w:t>
+      </w:r>
+      <w:proofErr w:type="gramStart"/>
+      <w:r>
+        <w:t>varchar(</w:t>
+      </w:r>
+      <w:proofErr w:type="gramEnd"/>
+      <w:r>
+        <w:t xml:space="preserve">1000) DEFAULT NULL,                               </w:t>
+      </w:r>
+    </w:p>
+    <w:p>
+      <w:r>
+        <w:t xml:space="preserve">`context` </w:t>
+      </w:r>
+      <w:proofErr w:type="gramStart"/>
+      <w:r>
+        <w:t>varchar(</w:t>
+      </w:r>
+      <w:proofErr w:type="gramEnd"/>
+      <w:r>
+        <w:t xml:space="preserve">3) DEFAULT NULL,                                   </w:t>
+      </w:r>
+    </w:p>
+    <w:p>
+      <w:r>
+        <w:t xml:space="preserve">`wegeon__pool_withindel_vcf_alt` </w:t>
+      </w:r>
+      <w:proofErr w:type="gramStart"/>
+      <w:r>
+        <w:t>char(</w:t>
+      </w:r>
+      <w:proofErr w:type="gramEnd"/>
+      <w:r>
+        <w:t xml:space="preserve">128) DEFAULT NULL,             </w:t>
+      </w:r>
+    </w:p>
+    <w:p>
+      <w:r>
+        <w:t xml:space="preserve">`wegeon__pool_withindel_vcf_dep` </w:t>
+      </w:r>
+      <w:proofErr w:type="gramStart"/>
+      <w:r>
+        <w:t>char(</w:t>
+      </w:r>
+      <w:proofErr w:type="gramEnd"/>
+      <w:r>
+        <w:t xml:space="preserve">128) DEFAULT NULL,             </w:t>
+      </w:r>
+    </w:p>
+    <w:p>
+      <w:r>
+        <w:t xml:space="preserve">`fanya1_pool_withindel_vcf_alt` </w:t>
+      </w:r>
+      <w:proofErr w:type="gramStart"/>
+      <w:r>
+        <w:t>char(</w:t>
+      </w:r>
+      <w:proofErr w:type="gramEnd"/>
+      <w:r>
+        <w:t xml:space="preserve">128) DEFAULT NULL,              </w:t>
+      </w:r>
+    </w:p>
+    <w:p>
+      <w:r>
+        <w:t xml:space="preserve">`fanya1_pool_withindel_vcf_dep` </w:t>
+      </w:r>
+      <w:proofErr w:type="gramStart"/>
+      <w:r>
+        <w:t>char(</w:t>
+      </w:r>
+      <w:proofErr w:type="gramEnd"/>
+      <w:r>
+        <w:t xml:space="preserve">128) DEFAULT NULL,              </w:t>
+      </w:r>
+    </w:p>
+    <w:p>
+      <w:r>
+        <w:t xml:space="preserve">`barheadedgoose_pool_withindel_vcf_alt` </w:t>
+      </w:r>
+      <w:proofErr w:type="gramStart"/>
+      <w:r>
+        <w:t>char(</w:t>
+      </w:r>
+      <w:proofErr w:type="gramEnd"/>
+      <w:r>
+        <w:t xml:space="preserve">128) DEFAULT NULL,      </w:t>
+      </w:r>
+    </w:p>
+    <w:p>
+      <w:r>
+        <w:t xml:space="preserve">`barheadedgoose_pool_withindel_vcf_dep` </w:t>
+      </w:r>
+      <w:proofErr w:type="gramStart"/>
+      <w:r>
+        <w:t>char(</w:t>
+      </w:r>
+      <w:proofErr w:type="gramEnd"/>
+      <w:r>
+        <w:t xml:space="preserve">128) DEFAULT NULL,      </w:t>
+      </w:r>
+    </w:p>
+    <w:p>
+      <w:r>
+        <w:t xml:space="preserve">`taihudomesticgoose_pool_withindel_vcf_alt` </w:t>
+      </w:r>
+      <w:proofErr w:type="gramStart"/>
+      <w:r>
+        <w:t>char(</w:t>
+      </w:r>
+      <w:proofErr w:type="gramEnd"/>
+      <w:r>
+        <w:t xml:space="preserve">128) DEFAULT NULL,  </w:t>
+      </w:r>
+    </w:p>
+    <w:p>
+      <w:r>
+        <w:t xml:space="preserve">`taihudomesticgoose_pool_withindel_vcf_dep` </w:t>
+      </w:r>
+      <w:proofErr w:type="gramStart"/>
+      <w:r>
+        <w:t>char(</w:t>
+      </w:r>
+      <w:proofErr w:type="gramEnd"/>
+      <w:r>
+        <w:t xml:space="preserve">128) DEFAULT NULL,  </w:t>
+      </w:r>
+    </w:p>
+    <w:p>
+      <w:r>
+        <w:t>PRIMARY KEY (`chrID</w:t>
+      </w:r>
+      <w:proofErr w:type="gramStart"/>
       <w:r>
         <w:t>`,`</w:t>
       </w:r>
-      <w:proofErr w:type="spellStart"/>
-      <w:r>
-        <w:t>snp_pos</w:t>
-      </w:r>
-      <w:proofErr w:type="spellEnd"/>
-      <w:r>
-        <w:t xml:space="preserve">`)                                      </w:t>
-      </w:r>
-    </w:p>
-    <w:p>
-      <w:r>
-        <w:t>) ENGINE=</w:t>
-      </w:r>
-      <w:proofErr w:type="spellStart"/>
-      <w:r>
-        <w:t>InnoDB</w:t>
-      </w:r>
-      <w:proofErr w:type="spellEnd"/>
-      <w:r>
-        <w:t xml:space="preserve"> DEFAULT CHARSET=utf8</w:t>
+      <w:proofErr w:type="gramEnd"/>
+      <w:r>
+        <w:t xml:space="preserve">snp_pos`)                                      </w:t>
+      </w:r>
+    </w:p>
+    <w:p>
+      <w:r>
+        <w:t>) ENGINE=InnoDB DEFAULT CHARSET=utf8</w:t>
       </w:r>
     </w:p>
     <w:p/>
     <w:p>
-      <w:proofErr w:type="spellStart"/>
-      <w:r>
-        <w:t>Thit</w:t>
-      </w:r>
-      <w:proofErr w:type="spellEnd"/>
-      <w:r>
-        <w:t xml:space="preserve"> table can be initially create by such command:</w:t>
+      <w:r>
+        <w:t>Thit table can be initially create by such command:</w:t>
       </w:r>
     </w:p>
     <w:p>
@@ -326,21 +345,21 @@
         <w:rPr>
           <w:color w:val="FF0000"/>
         </w:rPr>
-        <w:t>`</w:t>
-      </w:r>
-      <w:proofErr w:type="spellStart"/>
+        <w:t xml:space="preserve">`chrID` </w:t>
+      </w:r>
+      <w:proofErr w:type="gramStart"/>
       <w:r>
         <w:rPr>
           <w:color w:val="FF0000"/>
         </w:rPr>
-        <w:t>chrID</w:t>
-      </w:r>
-      <w:proofErr w:type="spellEnd"/>
+        <w:t>char(</w:t>
+      </w:r>
+      <w:proofErr w:type="gramEnd"/>
       <w:r>
         <w:rPr>
           <w:color w:val="FF0000"/>
         </w:rPr>
-        <w:t xml:space="preserve">` char(128) NOT NULL DEFAULT '',                               </w:t>
+        <w:t xml:space="preserve">128) NOT NULL DEFAULT '',                               </w:t>
       </w:r>
     </w:p>
     <w:p>
@@ -353,189 +372,155 @@
         <w:rPr>
           <w:color w:val="FF0000"/>
         </w:rPr>
-        <w:t>`</w:t>
-      </w:r>
-      <w:proofErr w:type="spellStart"/>
+        <w:t xml:space="preserve">`snp_pos` </w:t>
+      </w:r>
+      <w:proofErr w:type="gramStart"/>
       <w:r>
         <w:rPr>
           <w:color w:val="FF0000"/>
         </w:rPr>
-        <w:t>snp_pos</w:t>
-      </w:r>
-      <w:proofErr w:type="spellEnd"/>
+        <w:t>bigint(</w:t>
+      </w:r>
+      <w:proofErr w:type="gramEnd"/>
       <w:r>
         <w:rPr>
           <w:color w:val="FF0000"/>
         </w:rPr>
-        <w:t xml:space="preserve">` </w:t>
-      </w:r>
-      <w:proofErr w:type="spellStart"/>
-      <w:r>
+        <w:t xml:space="preserve">20) NOT NULL DEFAULT '0',                           </w:t>
+      </w:r>
+    </w:p>
+    <w:p>
+      <w:pPr>
         <w:rPr>
           <w:color w:val="FF0000"/>
         </w:rPr>
-        <w:t>bigint</w:t>
-      </w:r>
-      <w:proofErr w:type="spellEnd"/>
+      </w:pPr>
       <w:r>
         <w:rPr>
           <w:color w:val="FF0000"/>
         </w:rPr>
-        <w:t xml:space="preserve">(20) NOT NULL DEFAULT '0',                           </w:t>
-      </w:r>
-    </w:p>
-    <w:p>
-      <w:pPr>
+        <w:t xml:space="preserve">`snpID` </w:t>
+      </w:r>
+      <w:proofErr w:type="gramStart"/>
+      <w:r>
         <w:rPr>
           <w:color w:val="FF0000"/>
         </w:rPr>
-      </w:pPr>
+        <w:t>char(</w:t>
+      </w:r>
+      <w:proofErr w:type="gramEnd"/>
       <w:r>
         <w:rPr>
           <w:color w:val="FF0000"/>
         </w:rPr>
-        <w:t>`</w:t>
-      </w:r>
-      <w:proofErr w:type="spellStart"/>
-      <w:r>
+        <w:t xml:space="preserve">128) NOT NULL,                                          </w:t>
+      </w:r>
+    </w:p>
+    <w:p>
+      <w:pPr>
         <w:rPr>
           <w:color w:val="FF0000"/>
         </w:rPr>
-        <w:t>snpID</w:t>
-      </w:r>
-      <w:proofErr w:type="spellEnd"/>
+      </w:pPr>
       <w:r>
         <w:rPr>
           <w:color w:val="FF0000"/>
         </w:rPr>
-        <w:t xml:space="preserve">` char(128) NOT NULL,                                          </w:t>
-      </w:r>
-    </w:p>
-    <w:p>
-      <w:pPr>
+        <w:t xml:space="preserve">`ref_base` </w:t>
+      </w:r>
+      <w:proofErr w:type="gramStart"/>
+      <w:r>
         <w:rPr>
           <w:color w:val="FF0000"/>
         </w:rPr>
-      </w:pPr>
+        <w:t>varchar(</w:t>
+      </w:r>
+      <w:proofErr w:type="gramEnd"/>
       <w:r>
         <w:rPr>
           <w:color w:val="FF0000"/>
         </w:rPr>
-        <w:t>`</w:t>
-      </w:r>
-      <w:proofErr w:type="spellStart"/>
-      <w:r>
+        <w:t xml:space="preserve">1000) DEFAULT NULL,                               </w:t>
+      </w:r>
+    </w:p>
+    <w:p>
+      <w:pPr>
         <w:rPr>
           <w:color w:val="FF0000"/>
         </w:rPr>
-        <w:t>ref_base</w:t>
-      </w:r>
-      <w:proofErr w:type="spellEnd"/>
+      </w:pPr>
       <w:r>
         <w:rPr>
           <w:color w:val="FF0000"/>
         </w:rPr>
-        <w:t xml:space="preserve">` varchar(1000) DEFAULT NULL,                               </w:t>
-      </w:r>
-    </w:p>
-    <w:p>
-      <w:pPr>
+        <w:t xml:space="preserve">`alt_base` </w:t>
+      </w:r>
+      <w:proofErr w:type="gramStart"/>
+      <w:r>
         <w:rPr>
           <w:color w:val="FF0000"/>
         </w:rPr>
-      </w:pPr>
+        <w:t>varchar(</w:t>
+      </w:r>
+      <w:proofErr w:type="gramEnd"/>
       <w:r>
         <w:rPr>
           <w:color w:val="FF0000"/>
         </w:rPr>
-        <w:t>`</w:t>
-      </w:r>
-      <w:proofErr w:type="spellStart"/>
-      <w:r>
+        <w:t xml:space="preserve">1000) DEFAULT NULL,                               </w:t>
+      </w:r>
+    </w:p>
+    <w:p>
+      <w:pPr>
         <w:rPr>
           <w:color w:val="FF0000"/>
         </w:rPr>
-        <w:t>alt_base</w:t>
-      </w:r>
-      <w:proofErr w:type="spellEnd"/>
+      </w:pPr>
       <w:r>
         <w:rPr>
           <w:color w:val="FF0000"/>
         </w:rPr>
-        <w:t xml:space="preserve">` varchar(1000) DEFAULT NULL,                               </w:t>
-      </w:r>
-    </w:p>
-    <w:p>
-      <w:pPr>
+        <w:t xml:space="preserve">`context` </w:t>
+      </w:r>
+      <w:proofErr w:type="gramStart"/>
+      <w:r>
         <w:rPr>
           <w:color w:val="FF0000"/>
         </w:rPr>
-      </w:pPr>
+        <w:t>varchar(</w:t>
+      </w:r>
+      <w:proofErr w:type="gramEnd"/>
       <w:r>
         <w:rPr>
           <w:color w:val="FF0000"/>
         </w:rPr>
-        <w:t>`context` varchar(3) DEFAULT NULL, PRIMARY KEY (`</w:t>
-      </w:r>
-      <w:proofErr w:type="spellStart"/>
-      <w:r>
+        <w:t xml:space="preserve">3) DEFAULT NULL, PRIMARY KEY (`chrID`,`snp_pos`)                                      </w:t>
+      </w:r>
+    </w:p>
+    <w:p>
+      <w:pPr>
         <w:rPr>
           <w:color w:val="FF0000"/>
         </w:rPr>
-        <w:t>chrID</w:t>
-      </w:r>
-      <w:proofErr w:type="spellEnd"/>
+      </w:pPr>
       <w:r>
         <w:rPr>
           <w:color w:val="FF0000"/>
         </w:rPr>
-        <w:t>`,`</w:t>
-      </w:r>
-      <w:proofErr w:type="spellStart"/>
-      <w:r>
-        <w:rPr>
-          <w:color w:val="FF0000"/>
-        </w:rPr>
-        <w:t>snp_pos</w:t>
-      </w:r>
-      <w:proofErr w:type="spellEnd"/>
-      <w:r>
-        <w:rPr>
-          <w:color w:val="FF0000"/>
-        </w:rPr>
-        <w:t xml:space="preserve">`)                                      </w:t>
-      </w:r>
-    </w:p>
-    <w:p>
-      <w:pPr>
-        <w:rPr>
-          <w:color w:val="FF0000"/>
-        </w:rPr>
-      </w:pPr>
-      <w:r>
-        <w:rPr>
-          <w:color w:val="FF0000"/>
-        </w:rPr>
-        <w:t>) ENGINE=</w:t>
-      </w:r>
-      <w:proofErr w:type="spellStart"/>
-      <w:r>
-        <w:rPr>
-          <w:color w:val="FF0000"/>
-        </w:rPr>
-        <w:t>InnoDB</w:t>
-      </w:r>
-      <w:proofErr w:type="spellEnd"/>
-      <w:r>
-        <w:rPr>
-          <w:color w:val="FF0000"/>
-        </w:rPr>
-        <w:t xml:space="preserve"> DEFAULT CHARSET=utf8</w:t>
-      </w:r>
-    </w:p>
-    <w:p>
-      <w:r>
-        <w:t>The other information(sites and out group population information) could be filled automatically when this table is used.</w:t>
+        <w:t>) ENGINE=InnoDB DEFAULT CHARSET=utf8</w:t>
+      </w:r>
+    </w:p>
+    <w:p>
+      <w:r>
+        <w:t xml:space="preserve">The other </w:t>
+      </w:r>
+      <w:proofErr w:type="gramStart"/>
+      <w:r>
+        <w:t>information(</w:t>
+      </w:r>
+      <w:proofErr w:type="gramEnd"/>
+      <w:r>
+        <w:t>sites and out group population information) could be filled automatically when this table is used.</w:t>
       </w:r>
     </w:p>
     <w:p>
@@ -584,39 +569,20 @@
         <w:rPr>
           <w:rFonts w:hint="eastAsia"/>
         </w:rPr>
-        <w:t>群体的</w:t>
-      </w:r>
-      <w:proofErr w:type="spellStart"/>
-      <w:r>
-        <w:rPr>
-          <w:rFonts w:hint="eastAsia"/>
-        </w:rPr>
-        <w:t>v</w:t>
+        <w:t>群体的v</w:t>
+      </w:r>
+      <w:r>
+        <w:t>cf SNP</w:t>
+      </w:r>
+      <w:r>
+        <w:rPr>
+          <w:rFonts w:hint="eastAsia"/>
+        </w:rPr>
+        <w:t>数据导入数据库（看一下没有更好的v</w:t>
       </w:r>
       <w:r>
         <w:t>cf</w:t>
       </w:r>
-      <w:proofErr w:type="spellEnd"/>
-      <w:r>
-        <w:t xml:space="preserve"> SNP</w:t>
-      </w:r>
-      <w:r>
-        <w:rPr>
-          <w:rFonts w:hint="eastAsia"/>
-        </w:rPr>
-        <w:t>数据导入数据库（看一下没有更好的</w:t>
-      </w:r>
-      <w:proofErr w:type="spellStart"/>
-      <w:r>
-        <w:rPr>
-          <w:rFonts w:hint="eastAsia"/>
-        </w:rPr>
-        <w:t>v</w:t>
-      </w:r>
-      <w:r>
-        <w:t>cf</w:t>
-      </w:r>
-      <w:proofErr w:type="spellEnd"/>
       <w:r>
         <w:rPr>
           <w:rFonts w:hint="eastAsia"/>
@@ -625,37 +591,8 @@
       </w:r>
     </w:p>
     <w:p>
-      <w:proofErr w:type="spellStart"/>
-      <w:r>
-        <w:t>mysql</w:t>
-      </w:r>
-      <w:proofErr w:type="spellEnd"/>
-      <w:r>
-        <w:t xml:space="preserve"> -</w:t>
-      </w:r>
-      <w:proofErr w:type="spellStart"/>
-      <w:r>
-        <w:t>uroot</w:t>
-      </w:r>
-      <w:proofErr w:type="spellEnd"/>
-      <w:r>
-        <w:t xml:space="preserve"> -p1234607 -</w:t>
-      </w:r>
-      <w:proofErr w:type="spellStart"/>
-      <w:r>
-        <w:t>Dfyyjvariantdata</w:t>
-      </w:r>
-      <w:proofErr w:type="spellEnd"/>
-      <w:r>
-        <w:t xml:space="preserve"> -e "load data local </w:t>
-      </w:r>
-      <w:proofErr w:type="spellStart"/>
-      <w:r>
-        <w:t>infile</w:t>
-      </w:r>
-      <w:proofErr w:type="spellEnd"/>
-      <w:r>
-        <w:t xml:space="preserve"> 'p_m_sx_sp_gy_kbe_sm_lcb_ytg_jd_10pool10.SNV.loadmysql' into table mspsgjlksy10pop_toplevel_pekingduckref fields terminated by '\t'"</w:t>
+      <w:r>
+        <w:t>mysql -uroot -p1234607 -Dfyyjvariantdata -e "load data local infile 'p_m_sx_sp_gy_kbe_sm_lcb_ytg_jd_10pool10.SNV.loadmysql' into table mspsgjlksy10pop_toplevel_pekingduckref fields terminated by '\t'"</w:t>
       </w:r>
     </w:p>
     <w:p/>
@@ -897,21 +834,8 @@
         <w:t>流程（方案1）是：各个个体单独c</w:t>
       </w:r>
       <w:r>
-        <w:t>all bam-&gt;sort-&gt;</w:t>
-      </w:r>
-      <w:proofErr w:type="spellStart"/>
-      <w:r>
-        <w:t>rmdup</w:t>
-      </w:r>
-      <w:proofErr w:type="spellEnd"/>
-      <w:r>
-        <w:t>-&gt;realignment-&gt;</w:t>
-      </w:r>
-      <w:proofErr w:type="spellStart"/>
-      <w:r>
-        <w:t>uniq</w:t>
-      </w:r>
-      <w:proofErr w:type="spellEnd"/>
+        <w:t>all bam-&gt;sort-&gt;rmdup-&gt;realignment-&gt;uniq</w:t>
+      </w:r>
       <w:r>
         <w:rPr>
           <w:rFonts w:hint="eastAsia"/>
@@ -969,19 +893,11 @@
         <w:rPr>
           <w:rFonts w:hint="eastAsia"/>
         </w:rPr>
-        <w:t>（比如番鸭外群），可能连</w:t>
-      </w:r>
-      <w:proofErr w:type="spellStart"/>
-      <w:r>
-        <w:rPr>
-          <w:rFonts w:hint="eastAsia"/>
-        </w:rPr>
-        <w:t>u</w:t>
+        <w:t>（比如番鸭外群），可能连u</w:t>
       </w:r>
       <w:r>
         <w:t>niq</w:t>
       </w:r>
-      <w:proofErr w:type="spellEnd"/>
       <w:r>
         <w:rPr>
           <w:rFonts w:hint="eastAsia"/>
@@ -1042,7 +958,21 @@
         <w:rPr>
           <w:rFonts w:hint="eastAsia"/>
         </w:rPr>
-        <w:t>提升至7个，但是又恐无法分辨那个是S</w:t>
+        <w:t>提升至7个，但是又</w:t>
+      </w:r>
+      <w:proofErr w:type="gramStart"/>
+      <w:r>
+        <w:rPr>
+          <w:rFonts w:hint="eastAsia"/>
+        </w:rPr>
+        <w:t>恐无法</w:t>
+      </w:r>
+      <w:proofErr w:type="gramEnd"/>
+      <w:r>
+        <w:rPr>
+          <w:rFonts w:hint="eastAsia"/>
+        </w:rPr>
+        <w:t>分辨那个是S</w:t>
       </w:r>
       <w:r>
         <w:t>NP</w:t>
@@ -1113,7 +1043,21 @@
         <w:rPr>
           <w:rFonts w:hint="eastAsia"/>
         </w:rPr>
-        <w:t>信息。目前一次一个外群，其实可以一次多个外群这样一次效率更高，当然分开单独跑c</w:t>
+        <w:t>信息。目前一次一个外群，其实可以一次多个外群这样一次效率更高，当然分开</w:t>
+      </w:r>
+      <w:proofErr w:type="gramStart"/>
+      <w:r>
+        <w:rPr>
+          <w:rFonts w:hint="eastAsia"/>
+        </w:rPr>
+        <w:t>单独跑</w:t>
+      </w:r>
+      <w:proofErr w:type="gramEnd"/>
+      <w:r>
+        <w:rPr>
+          <w:rFonts w:hint="eastAsia"/>
+        </w:rPr>
+        <w:t>c</w:t>
       </w:r>
       <w:r>
         <w:t>ontext</w:t>
@@ -1236,31 +1180,7 @@
       </w:r>
       <w:r>
         <w:lastRenderedPageBreak/>
-        <w:t>pekingduckchrominfo.5MBPLUS_1 -t mspsgjlksy10pop_toplevel_pekingduckref -C /ifs1/User/</w:t>
-      </w:r>
-      <w:proofErr w:type="spellStart"/>
-      <w:r>
-        <w:t>lrui</w:t>
-      </w:r>
-      <w:proofErr w:type="spellEnd"/>
-      <w:r>
-        <w:t>/data/</w:t>
-      </w:r>
-      <w:proofErr w:type="spellStart"/>
-      <w:r>
-        <w:t>duckproject</w:t>
-      </w:r>
-      <w:proofErr w:type="spellEnd"/>
-      <w:r>
-        <w:t>/</w:t>
-      </w:r>
-      <w:proofErr w:type="spellStart"/>
-      <w:r>
-        <w:t>fanyaBJ.VCFBAMconfig</w:t>
-      </w:r>
-      <w:proofErr w:type="spellEnd"/>
-      <w:r>
-        <w:t xml:space="preserve"> -2 /ifs1/User/lrui/database/Anas_platyrhynchos.BGI_duck_1.0.dna_sm.toplevel.fa</w:t>
+        <w:t>pekingduckchrominfo.5MBPLUS_1 -t mspsgjlksy10pop_toplevel_pekingduckref -C /ifs1/User/lrui/data/duckproject/fanyaBJ.VCFBAMconfig -2 /ifs1/User/lrui/database/Anas_platyrhynchos.BGI_duck_1.0.dna_sm.toplevel.fa</w:t>
       </w:r>
     </w:p>
     <w:p>
@@ -1338,7 +1258,21 @@
         <w:rPr>
           <w:rFonts w:hint="eastAsia"/>
         </w:rPr>
-        <w:t>生成过程中番鸭的b</w:t>
+        <w:t>生成</w:t>
+      </w:r>
+      <w:proofErr w:type="gramStart"/>
+      <w:r>
+        <w:rPr>
+          <w:rFonts w:hint="eastAsia"/>
+        </w:rPr>
+        <w:t>过程中番鸭</w:t>
+      </w:r>
+      <w:proofErr w:type="gramEnd"/>
+      <w:r>
+        <w:rPr>
+          <w:rFonts w:hint="eastAsia"/>
+        </w:rPr>
+        <w:t>的b</w:t>
       </w:r>
       <w:r>
         <w:t>am</w:t>
@@ -1356,36 +1290,20 @@
         <w:rPr>
           <w:rFonts w:hint="eastAsia"/>
         </w:rPr>
-        <w:t>这条染色体无法读取后面的数据，但是</w:t>
-      </w:r>
-      <w:proofErr w:type="spellStart"/>
-      <w:r>
-        <w:rPr>
-          <w:rFonts w:hint="eastAsia"/>
-        </w:rPr>
-        <w:t>v</w:t>
+        <w:t>这条染色体无法读取后面的数据，但是v</w:t>
       </w:r>
       <w:r>
         <w:t>cf</w:t>
       </w:r>
-      <w:proofErr w:type="spellEnd"/>
-      <w:r>
-        <w:rPr>
-          <w:rFonts w:hint="eastAsia"/>
-        </w:rPr>
-        <w:t>文件应该是没问题的。所以重新生成了</w:t>
-      </w:r>
-      <w:proofErr w:type="spellStart"/>
-      <w:r>
-        <w:rPr>
-          <w:rFonts w:hint="eastAsia"/>
-        </w:rPr>
-        <w:t>f</w:t>
+      <w:r>
+        <w:rPr>
+          <w:rFonts w:hint="eastAsia"/>
+        </w:rPr>
+        <w:t>文件应该是没问题的。所以重新生成了f</w:t>
       </w:r>
       <w:r>
         <w:t>anya</w:t>
       </w:r>
-      <w:proofErr w:type="spellEnd"/>
       <w:r>
         <w:rPr>
           <w:rFonts w:hint="eastAsia"/>
@@ -1542,8 +1460,9 @@
           <w:sz w:val="24"/>
           <w:szCs w:val="24"/>
         </w:rPr>
-        <w:t xml:space="preserve"> and </w:t>
-      </w:r>
+        <w:t xml:space="preserve"> </w:t>
+      </w:r>
+      <w:proofErr w:type="gramStart"/>
       <w:r>
         <w:rPr>
           <w:rFonts w:ascii="Times New Roman" w:eastAsia="Times New Roman" w:hAnsi="Times New Roman" w:cs="Times New Roman"/>
@@ -1551,9 +1470,17 @@
           <w:sz w:val="24"/>
           <w:szCs w:val="24"/>
         </w:rPr>
+        <w:t xml:space="preserve">and </w:t>
+      </w:r>
+      <w:r>
+        <w:rPr>
+          <w:rFonts w:ascii="Times New Roman" w:eastAsia="Times New Roman" w:hAnsi="Times New Roman" w:cs="Times New Roman"/>
+          <w:color w:val="000000"/>
+          <w:sz w:val="24"/>
+          <w:szCs w:val="24"/>
+        </w:rPr>
         <w:t xml:space="preserve"> </w:t>
       </w:r>
-      <w:proofErr w:type="spellStart"/>
       <w:r>
         <w:rPr>
           <w:rFonts w:ascii="Times New Roman" w:eastAsia="Times New Roman" w:hAnsi="Times New Roman" w:cs="Times New Roman"/>
@@ -1563,7 +1490,7 @@
         </w:rPr>
         <w:t>Taihu</w:t>
       </w:r>
-      <w:proofErr w:type="spellEnd"/>
+      <w:proofErr w:type="gramEnd"/>
       <w:r>
         <w:rPr>
           <w:rFonts w:ascii="Times New Roman" w:eastAsia="Times New Roman" w:hAnsi="Times New Roman" w:cs="Times New Roman"/>
@@ -1717,8 +1644,9 @@
           <w:sz w:val="24"/>
           <w:szCs w:val="24"/>
         </w:rPr>
-        <w:t xml:space="preserve"> and </w:t>
-      </w:r>
+        <w:t xml:space="preserve"> </w:t>
+      </w:r>
+      <w:proofErr w:type="gramStart"/>
       <w:r>
         <w:rPr>
           <w:rFonts w:ascii="Times New Roman" w:eastAsia="Times New Roman" w:hAnsi="Times New Roman" w:cs="Times New Roman"/>
@@ -1726,9 +1654,17 @@
           <w:sz w:val="24"/>
           <w:szCs w:val="24"/>
         </w:rPr>
+        <w:t xml:space="preserve">and </w:t>
+      </w:r>
+      <w:r>
+        <w:rPr>
+          <w:rFonts w:ascii="Times New Roman" w:eastAsia="Times New Roman" w:hAnsi="Times New Roman" w:cs="Times New Roman"/>
+          <w:color w:val="000000"/>
+          <w:sz w:val="24"/>
+          <w:szCs w:val="24"/>
+        </w:rPr>
         <w:t xml:space="preserve"> </w:t>
       </w:r>
-      <w:proofErr w:type="spellStart"/>
       <w:r>
         <w:rPr>
           <w:rFonts w:ascii="Times New Roman" w:eastAsia="Times New Roman" w:hAnsi="Times New Roman" w:cs="Times New Roman"/>
@@ -1738,7 +1674,7 @@
         </w:rPr>
         <w:t>Taihu</w:t>
       </w:r>
-      <w:proofErr w:type="spellEnd"/>
+      <w:proofErr w:type="gramEnd"/>
       <w:r>
         <w:rPr>
           <w:rFonts w:ascii="Times New Roman" w:eastAsia="Times New Roman" w:hAnsi="Times New Roman" w:cs="Times New Roman"/>
@@ -1851,115 +1787,11 @@
     </w:p>
     <w:p>
       <w:r>
-        <w:t xml:space="preserve">python ~/life/src/NGS/Analysis/Detectsignalacrossgenome_master.py -T </w:t>
-      </w:r>
-      <w:proofErr w:type="spellStart"/>
-      <w:r>
-        <w:t>mallardBJ.VCFBAMconfig</w:t>
-      </w:r>
-      <w:proofErr w:type="spellEnd"/>
-      <w:r>
-        <w:t xml:space="preserve"> -T </w:t>
-      </w:r>
-      <w:proofErr w:type="spellStart"/>
-      <w:r>
-        <w:t>spotbilledBJ.VCFBAMconfig</w:t>
-      </w:r>
-      <w:proofErr w:type="spellEnd"/>
-      <w:r>
-        <w:t xml:space="preserve"> -R </w:t>
-      </w:r>
-      <w:proofErr w:type="spellStart"/>
-      <w:r>
-        <w:t>beijingBJ.VCFBAMconfig</w:t>
-      </w:r>
-      <w:proofErr w:type="spellEnd"/>
-      <w:r>
-        <w:t xml:space="preserve"> -R </w:t>
-      </w:r>
-      <w:proofErr w:type="spellStart"/>
-      <w:r>
-        <w:t>shaoxingBJ.VCFBAMconfig</w:t>
-      </w:r>
-      <w:proofErr w:type="spellEnd"/>
-      <w:r>
-        <w:t xml:space="preserve"> -R </w:t>
-      </w:r>
-      <w:proofErr w:type="spellStart"/>
-      <w:r>
-        <w:t>lianchengbaiBJ.VCFBAMconfig</w:t>
-      </w:r>
-      <w:proofErr w:type="spellEnd"/>
-      <w:r>
-        <w:t xml:space="preserve"> -R </w:t>
-      </w:r>
-      <w:proofErr w:type="spellStart"/>
-      <w:r>
-        <w:t>jindingBJ.VCFBAMconfig</w:t>
-      </w:r>
-      <w:proofErr w:type="spellEnd"/>
-      <w:r>
-        <w:t xml:space="preserve"> -R </w:t>
-      </w:r>
-      <w:proofErr w:type="spellStart"/>
-      <w:r>
-        <w:t>shanmaBJ.VCFBAMconfig</w:t>
-      </w:r>
-      <w:proofErr w:type="spellEnd"/>
-      <w:r>
-        <w:t xml:space="preserve"> -R </w:t>
-      </w:r>
-      <w:proofErr w:type="spellStart"/>
-      <w:r>
-        <w:t>gaoyouBJ.VCFBAMconfig</w:t>
-      </w:r>
-      <w:proofErr w:type="spellEnd"/>
-      <w:r>
-        <w:t xml:space="preserve"> -R </w:t>
-      </w:r>
-      <w:proofErr w:type="spellStart"/>
-      <w:r>
-        <w:t>cherryvalleyBJ.VCFBAMconfig</w:t>
-      </w:r>
-      <w:proofErr w:type="spellEnd"/>
-      <w:r>
-        <w:t xml:space="preserve"> -R </w:t>
-      </w:r>
-      <w:proofErr w:type="spellStart"/>
-      <w:r>
-        <w:t>campbellBJ.VCFBAMconfig</w:t>
-      </w:r>
-      <w:proofErr w:type="spellEnd"/>
-      <w:r>
-        <w:t xml:space="preserve"> -t mspsgjlksy10pop_toplevel_pekingduckref -w 40000 -s 20000 -c /ifs1/User/lrui/database/all_sep_chrfiles/pekingduckchrominfo.5MBPLUS_1 -c /ifs1/User/lrui/database/all_sep_chrfiles/pekingduckchrominfo.2MB_5MB_part1_2 -c /ifs1/User/lrui/database/all_sep_chrfiles/pekingduckchrominfo.2MB_5MB_part2_2 -c /ifs1/User/lrui/database/all_sep_chrfiles/pekingduckchrominfo.100kb_2MB_part1_3 -c /ifs1/User/lrui/database/all_sep_chrfiles/pekingduckchrominfo.100kb_2MB_part2_3 -c /ifs1/User/lrui/database/all_sep_chrfiles/pekingduckchrominfo.100kb_2MB_part3_3 -c </w:t>
+        <w:t xml:space="preserve">python ~/life/src/NGS/Analysis/Detectsignalacrossgenome_master.py -T mallardBJ.VCFBAMconfig -T spotbilledBJ.VCFBAMconfig -R beijingBJ.VCFBAMconfig -R shaoxingBJ.VCFBAMconfig -R lianchengbaiBJ.VCFBAMconfig -R jindingBJ.VCFBAMconfig -R shanmaBJ.VCFBAMconfig -R gaoyouBJ.VCFBAMconfig -R cherryvalleyBJ.VCFBAMconfig -R campbellBJ.VCFBAMconfig -t mspsgjlksy10pop_toplevel_pekingduckref -w 40000 -s 20000 -c /ifs1/User/lrui/database/all_sep_chrfiles/pekingduckchrominfo.5MBPLUS_1 -c /ifs1/User/lrui/database/all_sep_chrfiles/pekingduckchrominfo.2MB_5MB_part1_2 -c /ifs1/User/lrui/database/all_sep_chrfiles/pekingduckchrominfo.2MB_5MB_part2_2 -c /ifs1/User/lrui/database/all_sep_chrfiles/pekingduckchrominfo.100kb_2MB_part1_3 -c /ifs1/User/lrui/database/all_sep_chrfiles/pekingduckchrominfo.100kb_2MB_part2_3 -c /ifs1/User/lrui/database/all_sep_chrfiles/pekingduckchrominfo.100kb_2MB_part3_3 -c </w:t>
       </w:r>
       <w:r>
         <w:lastRenderedPageBreak/>
-        <w:t>/ifs1/User/lrui/database/all_sep_chrfiles/pekingduckchrominfo.100kb_2MB_part4_3 -c /ifs1/User/lrui/database/all_sep_chrfiles/pekingduckchrominfo.100kb_2MB_part5_3 -c /ifs1/User/lrui/database/all_sep_chrfiles/pekingduckchrominfo.40kb_100kb_4 -c /ifs1/User/lrui/database/all_sep_chrfiles/pekingduckchrominfo.5kb_40kb_5 -n 19 -o /ifs1/User/</w:t>
-      </w:r>
-      <w:proofErr w:type="spellStart"/>
-      <w:r>
-        <w:t>lrui</w:t>
-      </w:r>
-      <w:proofErr w:type="spellEnd"/>
-      <w:r>
-        <w:t>/data/</w:t>
-      </w:r>
-      <w:proofErr w:type="spellStart"/>
-      <w:r>
-        <w:t>duckproject</w:t>
-      </w:r>
-      <w:proofErr w:type="spellEnd"/>
-      <w:r>
-        <w:t>/</w:t>
-      </w:r>
-      <w:proofErr w:type="spellStart"/>
-      <w:r>
-        <w:t>configfile</w:t>
-      </w:r>
-      <w:proofErr w:type="spellEnd"/>
-      <w:r>
-        <w:t>/ancientMixChr40k20k -p early -1 ~/life/src/NGS/Slave/Detectsignalacrossgenome_producecorrelation_slave.py -2 ~/life/src/NGS/Slave/Detectsignalacrossgenome_slidewin_slave.py</w:t>
+        <w:t>/ifs1/User/lrui/database/all_sep_chrfiles/pekingduckchrominfo.100kb_2MB_part4_3 -c /ifs1/User/lrui/database/all_sep_chrfiles/pekingduckchrominfo.100kb_2MB_part5_3 -c /ifs1/User/lrui/database/all_sep_chrfiles/pekingduckchrominfo.40kb_100kb_4 -c /ifs1/User/lrui/database/all_sep_chrfiles/pekingduckchrominfo.5kb_40kb_5 -n 19 -o /ifs1/User/lrui/data/duckproject/configfile/ancientMixChr40k20k -p early -1 ~/life/src/NGS/Slave/Detectsignalacrossgenome_producecorrelation_slave.py -2 ~/life/src/NGS/Slave/Detectsignalacrossgenome_slidewin_slave.py</w:t>
       </w:r>
     </w:p>
     <w:p>
@@ -2084,19 +1916,11 @@
         <w:rPr>
           <w:rFonts w:hint="eastAsia"/>
         </w:rPr>
-        <w:t>文件但是到</w:t>
-      </w:r>
-      <w:proofErr w:type="spellStart"/>
-      <w:r>
-        <w:rPr>
-          <w:rFonts w:hint="eastAsia"/>
-        </w:rPr>
-        <w:t>s</w:t>
+        <w:t>文件但是到s</w:t>
       </w:r>
       <w:r>
         <w:t>lidewin</w:t>
       </w:r>
-      <w:proofErr w:type="spellEnd"/>
       <w:r>
         <w:rPr>
           <w:rFonts w:hint="eastAsia"/>
@@ -2223,16 +2047,7 @@
           <w:b/>
           <w:bCs/>
         </w:rPr>
-        <w:t>重新运行</w:t>
-      </w:r>
-      <w:proofErr w:type="spellStart"/>
-      <w:r>
-        <w:rPr>
-          <w:rFonts w:hint="eastAsia"/>
-          <w:b/>
-          <w:bCs/>
-        </w:rPr>
-        <w:t>s</w:t>
+        <w:t>重新运行s</w:t>
       </w:r>
       <w:r>
         <w:rPr>
@@ -2241,7 +2056,6 @@
         </w:rPr>
         <w:t>lidewin</w:t>
       </w:r>
-      <w:proofErr w:type="spellEnd"/>
       <w:r>
         <w:rPr>
           <w:rFonts w:hint="eastAsia"/>
@@ -2252,93 +2066,8 @@
       </w:r>
     </w:p>
     <w:p>
-      <w:proofErr w:type="spellStart"/>
-      <w:r>
-        <w:t>nohup</w:t>
-      </w:r>
-      <w:proofErr w:type="spellEnd"/>
-      <w:r>
-        <w:t xml:space="preserve"> python /ifs1/User/lrui/life/src/NGS/Analysis/Detectsignalacrossgenome_master.py -T </w:t>
-      </w:r>
-      <w:proofErr w:type="spellStart"/>
-      <w:r>
-        <w:t>mallardBJ.VCFBAMconfig</w:t>
-      </w:r>
-      <w:proofErr w:type="spellEnd"/>
-      <w:r>
-        <w:t xml:space="preserve"> -T </w:t>
-      </w:r>
-      <w:proofErr w:type="spellStart"/>
-      <w:r>
-        <w:t>spotbilledBJ.VCFBAMconfig</w:t>
-      </w:r>
-      <w:proofErr w:type="spellEnd"/>
-      <w:r>
-        <w:t xml:space="preserve"> -R </w:t>
-      </w:r>
-      <w:proofErr w:type="spellStart"/>
-      <w:r>
-        <w:t>beijingBJ.VCFBAMconfig</w:t>
-      </w:r>
-      <w:proofErr w:type="spellEnd"/>
-      <w:r>
-        <w:t xml:space="preserve"> -R </w:t>
-      </w:r>
-      <w:proofErr w:type="spellStart"/>
-      <w:r>
-        <w:t>shaoxingBJ.VCFBAMconfig</w:t>
-      </w:r>
-      <w:proofErr w:type="spellEnd"/>
-      <w:r>
-        <w:t xml:space="preserve"> -R </w:t>
-      </w:r>
-      <w:proofErr w:type="spellStart"/>
-      <w:r>
-        <w:t>lianchengbaiBJ.VCFBAMconfig</w:t>
-      </w:r>
-      <w:proofErr w:type="spellEnd"/>
-      <w:r>
-        <w:t xml:space="preserve"> -R </w:t>
-      </w:r>
-      <w:proofErr w:type="spellStart"/>
-      <w:r>
-        <w:t>jindingBJ.VCFBAMconfig</w:t>
-      </w:r>
-      <w:proofErr w:type="spellEnd"/>
-      <w:r>
-        <w:t xml:space="preserve"> -R </w:t>
-      </w:r>
-      <w:proofErr w:type="spellStart"/>
-      <w:r>
-        <w:t>shanmaBJ.VCFBAMconfig</w:t>
-      </w:r>
-      <w:proofErr w:type="spellEnd"/>
-      <w:r>
-        <w:t xml:space="preserve"> -R </w:t>
-      </w:r>
-      <w:proofErr w:type="spellStart"/>
-      <w:r>
-        <w:t>gaoyouBJ.VCFBAMconfig</w:t>
-      </w:r>
-      <w:proofErr w:type="spellEnd"/>
-      <w:r>
-        <w:t xml:space="preserve"> -R </w:t>
-      </w:r>
-      <w:proofErr w:type="spellStart"/>
-      <w:r>
-        <w:t>cherryvalleyBJ.VCFBAMconfig</w:t>
-      </w:r>
-      <w:proofErr w:type="spellEnd"/>
-      <w:r>
-        <w:t xml:space="preserve"> -R </w:t>
-      </w:r>
-      <w:proofErr w:type="spellStart"/>
-      <w:r>
-        <w:t>campbellBJ.VCFBAMconfig</w:t>
-      </w:r>
-      <w:proofErr w:type="spellEnd"/>
-      <w:r>
-        <w:t xml:space="preserve"> -t mspsgjlksy10pop_toplevel_pekingduckref -w 40000 -s 20000 -c /ifs1/User/lrui/database/all_sep_chrfiles/pekingduckchrominfo.5MBPLUS_1 -c /ifs1/User/lrui/database/all_sep_chrfiles/pekingduckchrominfo.2MB_5MB_part1_2 -c /ifs1/User/lrui/database/all_sep_chrfiles/pekingduckchrominfo.2MB_5MB_part2_2 -c /ifs1/User/lrui/database/all_sep_chrfiles/pekingduckchrominfo.100kb_2MB_part1_3 -c /ifs1/User/lrui/database/all_sep_chrfiles/pekingduckchrominfo.100kb_2MB_part2_3 -c /ifs1/User/lrui/database/all_sep_chrfiles/pekingduckchrominfo.100kb_2MB_part3_3 -c /ifs1/User/lrui/database/all_sep_chrfiles/pekingduckchrominfo.100kb_2MB_part4_3 -c /ifs1/User/lrui/database/all_sep_chrfiles/pekingduckchrominfo.100kb_2MB_part5_3 -c /ifs1/User/lrui/database/all_sep_chrfiles/pekingduckchrominfo.40kb_100kb_4 -c </w:t>
+      <w:r>
+        <w:t xml:space="preserve">nohup python /ifs1/User/lrui/life/src/NGS/Analysis/Detectsignalacrossgenome_master.py -T mallardBJ.VCFBAMconfig -T spotbilledBJ.VCFBAMconfig -R beijingBJ.VCFBAMconfig -R shaoxingBJ.VCFBAMconfig -R lianchengbaiBJ.VCFBAMconfig -R jindingBJ.VCFBAMconfig -R shanmaBJ.VCFBAMconfig -R gaoyouBJ.VCFBAMconfig -R cherryvalleyBJ.VCFBAMconfig -R campbellBJ.VCFBAMconfig -t mspsgjlksy10pop_toplevel_pekingduckref -w 40000 -s 20000 -c /ifs1/User/lrui/database/all_sep_chrfiles/pekingduckchrominfo.5MBPLUS_1 -c /ifs1/User/lrui/database/all_sep_chrfiles/pekingduckchrominfo.2MB_5MB_part1_2 -c /ifs1/User/lrui/database/all_sep_chrfiles/pekingduckchrominfo.2MB_5MB_part2_2 -c /ifs1/User/lrui/database/all_sep_chrfiles/pekingduckchrominfo.100kb_2MB_part1_3 -c /ifs1/User/lrui/database/all_sep_chrfiles/pekingduckchrominfo.100kb_2MB_part2_3 -c /ifs1/User/lrui/database/all_sep_chrfiles/pekingduckchrominfo.100kb_2MB_part3_3 -c /ifs1/User/lrui/database/all_sep_chrfiles/pekingduckchrominfo.100kb_2MB_part4_3 -c /ifs1/User/lrui/database/all_sep_chrfiles/pekingduckchrominfo.100kb_2MB_part5_3 -c /ifs1/User/lrui/database/all_sep_chrfiles/pekingduckchrominfo.40kb_100kb_4 -c </w:t>
       </w:r>
       <w:r>
         <w:lastRenderedPageBreak/>
@@ -2389,32 +2118,59 @@
           <w:b/>
           <w:bCs/>
         </w:rPr>
-        <w:t>找到受选择区域，同时注释受选择区域基因并做功能富集分析。</w:t>
-      </w:r>
-    </w:p>
-    <w:p>
-      <w:pPr>
-        <w:rPr>
-          <w:b/>
-          <w:bCs/>
-        </w:rPr>
-      </w:pPr>
-      <w:r>
-        <w:rPr>
-          <w:rFonts w:hint="eastAsia"/>
-          <w:b/>
-          <w:bCs/>
-        </w:rPr>
-        <w:t>用到两个</w:t>
-      </w:r>
-      <w:proofErr w:type="spellStart"/>
-      <w:r>
-        <w:rPr>
-          <w:rFonts w:hint="eastAsia"/>
-          <w:b/>
-          <w:bCs/>
-        </w:rPr>
-        <w:t>m</w:t>
+        <w:t>找到</w:t>
+      </w:r>
+      <w:proofErr w:type="gramStart"/>
+      <w:r>
+        <w:rPr>
+          <w:rFonts w:hint="eastAsia"/>
+          <w:b/>
+          <w:bCs/>
+        </w:rPr>
+        <w:t>受选择</w:t>
+      </w:r>
+      <w:proofErr w:type="gramEnd"/>
+      <w:r>
+        <w:rPr>
+          <w:rFonts w:hint="eastAsia"/>
+          <w:b/>
+          <w:bCs/>
+        </w:rPr>
+        <w:t>区域，同时</w:t>
+      </w:r>
+      <w:proofErr w:type="gramStart"/>
+      <w:r>
+        <w:rPr>
+          <w:rFonts w:hint="eastAsia"/>
+          <w:b/>
+          <w:bCs/>
+        </w:rPr>
+        <w:t>注释受选择</w:t>
+      </w:r>
+      <w:proofErr w:type="gramEnd"/>
+      <w:r>
+        <w:rPr>
+          <w:rFonts w:hint="eastAsia"/>
+          <w:b/>
+          <w:bCs/>
+        </w:rPr>
+        <w:t>区域基因并做功能富集分析。</w:t>
+      </w:r>
+    </w:p>
+    <w:p>
+      <w:pPr>
+        <w:rPr>
+          <w:b/>
+          <w:bCs/>
+        </w:rPr>
+      </w:pPr>
+      <w:r>
+        <w:rPr>
+          <w:rFonts w:hint="eastAsia"/>
+          <w:b/>
+          <w:bCs/>
+        </w:rPr>
+        <w:t>用到两个m</w:t>
       </w:r>
       <w:r>
         <w:rPr>
@@ -2423,7 +2179,6 @@
         </w:rPr>
         <w:t>ysql</w:t>
       </w:r>
-      <w:proofErr w:type="spellEnd"/>
       <w:r>
         <w:rPr>
           <w:rFonts w:hint="eastAsia"/>
@@ -2432,7 +2187,6 @@
         </w:rPr>
         <w:t xml:space="preserve">表，其中一个很重要的表 </w:t>
       </w:r>
-      <w:proofErr w:type="spellStart"/>
       <w:r>
         <w:rPr>
           <w:b/>
@@ -2440,7 +2194,6 @@
         </w:rPr>
         <w:t>transcripttable</w:t>
       </w:r>
-      <w:proofErr w:type="spellEnd"/>
     </w:p>
     <w:p>
       <w:r>
@@ -2482,13 +2235,8 @@
         </w:rPr>
         <w:t>估计</w:t>
       </w:r>
-      <w:proofErr w:type="spellStart"/>
-      <w:r>
-        <w:t>pekinduckchromTranscript_tomysql_uniq</w:t>
-      </w:r>
-      <w:proofErr w:type="spellEnd"/>
-      <w:r>
-        <w:t xml:space="preserve"> </w:t>
+      <w:r>
+        <w:t xml:space="preserve">pekinduckchromTranscript_tomysql_uniq </w:t>
       </w:r>
       <w:r>
         <w:rPr>
@@ -2516,185 +2264,165 @@
     </w:p>
     <w:p>
       <w:r>
-        <w:t xml:space="preserve">CREATE TABLE </w:t>
-      </w:r>
-      <w:proofErr w:type="spellStart"/>
-      <w:r>
-        <w:t>pekinduckmiRNA_Transcript</w:t>
-      </w:r>
-      <w:proofErr w:type="spellEnd"/>
-      <w:r>
-        <w:t>(</w:t>
-      </w:r>
+        <w:t>CREATE TABLE pekinduckmiRNA_</w:t>
+      </w:r>
+      <w:proofErr w:type="gramStart"/>
+      <w:r>
+        <w:t>Transcript(</w:t>
+      </w:r>
+      <w:proofErr w:type="gramEnd"/>
     </w:p>
     <w:p>
       <w:r>
         <w:tab/>
-      </w:r>
-      <w:proofErr w:type="spellStart"/>
-      <w:r>
-        <w:t>transcript_ID</w:t>
-      </w:r>
-      <w:proofErr w:type="spellEnd"/>
-      <w:r>
-        <w:t xml:space="preserve"> VARCHAR(128) NOT NULL,</w:t>
+        <w:t xml:space="preserve">transcript_ID </w:t>
+      </w:r>
+      <w:proofErr w:type="gramStart"/>
+      <w:r>
+        <w:t>VARCHAR(</w:t>
+      </w:r>
+      <w:proofErr w:type="gramEnd"/>
+      <w:r>
+        <w:t>128) NOT NULL,</w:t>
       </w:r>
     </w:p>
     <w:p>
       <w:r>
         <w:tab/>
-      </w:r>
-      <w:proofErr w:type="spellStart"/>
-      <w:r>
-        <w:t>geneID</w:t>
-      </w:r>
-      <w:proofErr w:type="spellEnd"/>
-      <w:r>
-        <w:t xml:space="preserve"> VARCHAR(128),</w:t>
+        <w:t xml:space="preserve">geneID </w:t>
+      </w:r>
+      <w:proofErr w:type="gramStart"/>
+      <w:r>
+        <w:t>VARCHAR(</w:t>
+      </w:r>
+      <w:proofErr w:type="gramEnd"/>
+      <w:r>
+        <w:t>128),</w:t>
       </w:r>
     </w:p>
     <w:p>
       <w:r>
         <w:tab/>
-      </w:r>
-      <w:proofErr w:type="spellStart"/>
-      <w:r>
-        <w:t>geneName</w:t>
-      </w:r>
-      <w:proofErr w:type="spellEnd"/>
-      <w:r>
-        <w:t xml:space="preserve"> VARCHAR(128),</w:t>
+        <w:t xml:space="preserve">geneName </w:t>
+      </w:r>
+      <w:proofErr w:type="gramStart"/>
+      <w:r>
+        <w:t>VARCHAR(</w:t>
+      </w:r>
+      <w:proofErr w:type="gramEnd"/>
+      <w:r>
+        <w:t>128),</w:t>
       </w:r>
     </w:p>
     <w:p>
       <w:r>
         <w:tab/>
-      </w:r>
-      <w:proofErr w:type="spellStart"/>
-      <w:r>
-        <w:t>chrID</w:t>
-      </w:r>
-      <w:proofErr w:type="spellEnd"/>
-      <w:r>
-        <w:t xml:space="preserve"> VARCHAR(128) NOT NULL ,</w:t>
+        <w:t xml:space="preserve">chrID </w:t>
+      </w:r>
+      <w:proofErr w:type="gramStart"/>
+      <w:r>
+        <w:t>VARCHAR(</w:t>
+      </w:r>
+      <w:proofErr w:type="gramEnd"/>
+      <w:r>
+        <w:t>128) NOT NULL ,</w:t>
       </w:r>
     </w:p>
     <w:p>
       <w:r>
         <w:lastRenderedPageBreak/>
         <w:tab/>
-      </w:r>
-      <w:proofErr w:type="spellStart"/>
-      <w:r>
-        <w:t>GCcontent</w:t>
-      </w:r>
-      <w:proofErr w:type="spellEnd"/>
-      <w:r>
-        <w:t xml:space="preserve"> FLOAT,</w:t>
+        <w:t>GCcontent FLOAT,</w:t>
       </w:r>
     </w:p>
     <w:p>
       <w:r>
         <w:tab/>
-      </w:r>
-      <w:proofErr w:type="spellStart"/>
-      <w:r>
-        <w:t>trscpt_start_pos</w:t>
-      </w:r>
-      <w:proofErr w:type="spellEnd"/>
-      <w:r>
-        <w:t xml:space="preserve"> BIGINT(20),</w:t>
+        <w:t xml:space="preserve">trscpt_start_pos </w:t>
+      </w:r>
+      <w:proofErr w:type="gramStart"/>
+      <w:r>
+        <w:t>BIGINT(</w:t>
+      </w:r>
+      <w:proofErr w:type="gramEnd"/>
+      <w:r>
+        <w:t>20),</w:t>
       </w:r>
     </w:p>
     <w:p>
       <w:r>
         <w:tab/>
-      </w:r>
-      <w:proofErr w:type="spellStart"/>
-      <w:r>
-        <w:t>trscpt_end_pos</w:t>
-      </w:r>
-      <w:proofErr w:type="spellEnd"/>
-      <w:r>
-        <w:t xml:space="preserve"> BIGINT(20),</w:t>
+        <w:t xml:space="preserve">trscpt_end_pos </w:t>
+      </w:r>
+      <w:proofErr w:type="gramStart"/>
+      <w:r>
+        <w:t>BIGINT(</w:t>
+      </w:r>
+      <w:proofErr w:type="gramEnd"/>
+      <w:r>
+        <w:t>20),</w:t>
       </w:r>
     </w:p>
     <w:p>
       <w:r>
         <w:tab/>
-        <w:t>strand CHAR(1),</w:t>
+        <w:t xml:space="preserve">strand </w:t>
+      </w:r>
+      <w:proofErr w:type="gramStart"/>
+      <w:r>
+        <w:t>CHAR(</w:t>
+      </w:r>
+      <w:proofErr w:type="gramEnd"/>
+      <w:r>
+        <w:t>1),</w:t>
       </w:r>
     </w:p>
     <w:p>
       <w:r>
         <w:tab/>
-        <w:t>description VARCHAR(1000),</w:t>
+        <w:t xml:space="preserve">description </w:t>
+      </w:r>
+      <w:proofErr w:type="gramStart"/>
+      <w:r>
+        <w:t>VARCHAR(</w:t>
+      </w:r>
+      <w:proofErr w:type="gramEnd"/>
+      <w:r>
+        <w:t>1000),</w:t>
       </w:r>
     </w:p>
     <w:p>
       <w:r>
         <w:tab/>
-        <w:t>PRIMARY KEY (</w:t>
-      </w:r>
-      <w:proofErr w:type="spellStart"/>
-      <w:r>
-        <w:t>transcript_ID</w:t>
-      </w:r>
-      <w:proofErr w:type="spellEnd"/>
-      <w:r>
-        <w:t>),</w:t>
+        <w:t>PRIMARY KEY (transcript_ID),</w:t>
       </w:r>
     </w:p>
     <w:p>
       <w:r>
         <w:tab/>
-        <w:t>#foreign key(</w:t>
-      </w:r>
-      <w:proofErr w:type="spellStart"/>
-      <w:r>
-        <w:t>geneID</w:t>
-      </w:r>
-      <w:proofErr w:type="spellEnd"/>
-      <w:r>
-        <w:t>)references gene(</w:t>
-      </w:r>
-      <w:proofErr w:type="spellStart"/>
-      <w:r>
-        <w:t>geneID</w:t>
-      </w:r>
-      <w:proofErr w:type="spellEnd"/>
-      <w:r>
-        <w:t>),</w:t>
+        <w:t>#</w:t>
+      </w:r>
+      <w:proofErr w:type="gramStart"/>
+      <w:r>
+        <w:t>foreign</w:t>
+      </w:r>
+      <w:proofErr w:type="gramEnd"/>
+      <w:r>
+        <w:t xml:space="preserve"> key(geneID)references gene(geneID),</w:t>
       </w:r>
     </w:p>
     <w:p>
       <w:r>
         <w:tab/>
-        <w:t>FOREIGN KEY(</w:t>
-      </w:r>
-      <w:proofErr w:type="spellStart"/>
-      <w:r>
-        <w:t>chrID</w:t>
-      </w:r>
-      <w:proofErr w:type="spellEnd"/>
-      <w:r>
-        <w:t xml:space="preserve">)REFERENCES </w:t>
-      </w:r>
-      <w:proofErr w:type="spellStart"/>
-      <w:r>
-        <w:t>pekingduckchrominfo</w:t>
-      </w:r>
-      <w:proofErr w:type="spellEnd"/>
-      <w:r>
-        <w:t>(</w:t>
-      </w:r>
-      <w:proofErr w:type="spellStart"/>
-      <w:r>
-        <w:t>chrID</w:t>
-      </w:r>
-      <w:proofErr w:type="spellEnd"/>
-      <w:r>
-        <w:t>))ENGINE=MYISAM DEFAULT CHARSET=utf8</w:t>
+        <w:t xml:space="preserve">FOREIGN </w:t>
+      </w:r>
+      <w:proofErr w:type="gramStart"/>
+      <w:r>
+        <w:t>KEY(</w:t>
+      </w:r>
+      <w:proofErr w:type="gramEnd"/>
+      <w:r>
+        <w:t>chrID)REFERENCES pekingduckchrominfo(chrID))ENGINE=MYISAM DEFAULT CHARSET=utf8</w:t>
       </w:r>
     </w:p>
     <w:p>
@@ -2740,11 +2468,9 @@
         </w:rPr>
         <w:t>还是需要查一下试验记录本。</w:t>
       </w:r>
-      <w:proofErr w:type="spellStart"/>
       <w:r>
         <w:t>allmirnafromHuangmiRNAseq.bed.loadtomysql</w:t>
       </w:r>
-      <w:proofErr w:type="spellEnd"/>
     </w:p>
     <w:p/>
     <w:p>
@@ -2752,36 +2478,20 @@
         <w:rPr>
           <w:rFonts w:hint="eastAsia"/>
         </w:rPr>
-        <w:t>有一个</w:t>
-      </w:r>
-      <w:proofErr w:type="spellStart"/>
-      <w:r>
-        <w:rPr>
-          <w:rFonts w:hint="eastAsia"/>
-        </w:rPr>
-        <w:t>c</w:t>
+        <w:t>有一个c</w:t>
       </w:r>
       <w:r>
         <w:t>airo</w:t>
       </w:r>
-      <w:proofErr w:type="spellEnd"/>
-      <w:r>
-        <w:rPr>
-          <w:rFonts w:hint="eastAsia"/>
-        </w:rPr>
-        <w:t>包怎么也安不上，也就是说只能找到区间无法自动出图了，经测试，对以前的</w:t>
-      </w:r>
-      <w:proofErr w:type="spellStart"/>
-      <w:r>
-        <w:rPr>
-          <w:rFonts w:hint="eastAsia"/>
-        </w:rPr>
-        <w:t>w</w:t>
+      <w:r>
+        <w:rPr>
+          <w:rFonts w:hint="eastAsia"/>
+        </w:rPr>
+        <w:t>包怎么也安不上，也就是说只能找到区间无法自动出图了，经测试，对以前的w</w:t>
       </w:r>
       <w:r>
         <w:t>infile</w:t>
       </w:r>
-      <w:proofErr w:type="spellEnd"/>
       <w:r>
         <w:rPr>
           <w:rFonts w:hint="eastAsia"/>
@@ -2797,70 +2507,16 @@
     </w:p>
     <w:p>
       <w:r>
-        <w:t xml:space="preserve">python ~/life/src/NGS/tempRUN/testmakemht_hist.py -n /ifs1/User/lrui/data/duckproject/detectseletion/ancientseletion/selectedRegionInMallard_spotbilledEarlyStage_pk_sx_sm_g_l_j_k_yVSmallardspotbilled_split_m_s_g_l_j_k_y_p_s_s.earlypostiveselected.zscorefile.align.20000_10000  -4_Hp_in_domestic_lineage_-2 </w:t>
-      </w:r>
-      <w:proofErr w:type="spellStart"/>
-      <w:r>
-        <w:t>domestichp</w:t>
-      </w:r>
-      <w:proofErr w:type="spellEnd"/>
-      <w:r>
-        <w:t xml:space="preserve"> </w:t>
+        <w:t xml:space="preserve">python ~/life/src/NGS/tempRUN/testmakemht_hist.py -n /ifs1/User/lrui/data/duckproject/detectseletion/ancientseletion/selectedRegionInMallard_spotbilledEarlyStage_pk_sx_sm_g_l_j_k_yVSmallardspotbilled_split_m_s_g_l_j_k_y_p_s_s.earlypostiveselected.zscorefile.align.20000_10000  -4_Hp_in_domestic_lineage_-2 domestichp </w:t>
       </w:r>
       <w:r>
         <w:rPr>
           <w:color w:val="FF0000"/>
         </w:rPr>
-        <w:t>-A /ifs1/User/</w:t>
-      </w:r>
-      <w:proofErr w:type="spellStart"/>
-      <w:r>
-        <w:rPr>
-          <w:color w:val="FF0000"/>
-        </w:rPr>
-        <w:t>lrui</w:t>
-      </w:r>
-      <w:proofErr w:type="spellEnd"/>
-      <w:r>
-        <w:rPr>
-          <w:color w:val="FF0000"/>
-        </w:rPr>
-        <w:t>/database/</w:t>
-      </w:r>
-      <w:proofErr w:type="spellStart"/>
-      <w:r>
-        <w:rPr>
-          <w:color w:val="FF0000"/>
-        </w:rPr>
-        <w:t>Duck_anchor_ref_query.txtchanged</w:t>
-      </w:r>
-      <w:proofErr w:type="spellEnd"/>
-      <w:r>
-        <w:t xml:space="preserve"> -g /ifs1/User/</w:t>
-      </w:r>
-      <w:proofErr w:type="spellStart"/>
-      <w:r>
-        <w:t>lrui</w:t>
-      </w:r>
-      <w:proofErr w:type="spellEnd"/>
-      <w:r>
-        <w:t>/database/</w:t>
-      </w:r>
-      <w:proofErr w:type="spellStart"/>
-      <w:r>
-        <w:t>duckGO.table</w:t>
-      </w:r>
-      <w:proofErr w:type="spellEnd"/>
-      <w:r>
-        <w:t xml:space="preserve"> -X </w:t>
-      </w:r>
-      <w:proofErr w:type="spellStart"/>
-      <w:r>
-        <w:t>zvalue</w:t>
-      </w:r>
-      <w:proofErr w:type="spellEnd"/>
-      <w:r>
-        <w:t xml:space="preserve"> -N 1 -w 40000 -s 20000 -u 1000 -d 1000 -o /ifs1/User/lrui/data/duckproject/detectseletion/domestication/test</w:t>
+        <w:t>-A /ifs1/User/lrui/database/Duck_anchor_ref_query.txtchanged</w:t>
+      </w:r>
+      <w:r>
+        <w:t xml:space="preserve"> -g /ifs1/User/lrui/database/duckGO.table -X zvalue -N 1 -w 40000 -s 20000 -u 1000 -d 1000 -o /ifs1/User/lrui/data/duckproject/detectseletion/domestication/test</w:t>
       </w:r>
     </w:p>
     <w:p/>
@@ -2882,15 +2538,8 @@
       </w:r>
     </w:p>
     <w:p>
-      <w:bookmarkStart w:id="0" w:name="_GoBack"/>
-      <w:bookmarkEnd w:id="0"/>
-      <w:proofErr w:type="spellStart"/>
-      <w:r>
-        <w:t>nohup</w:t>
-      </w:r>
-      <w:proofErr w:type="spellEnd"/>
-      <w:r>
-        <w:t xml:space="preserve"> python /ifs1/User/lrui/life/src/NGS/Analysis/Detectsignalacrossgenome_master.py -T /ifs1/User/lrui/data/duckproject/configfile/mallardBJ.VCFBAMconfig -T /ifs1/User/lrui/data/duckproject/configfile/spotbilledBJ.VCFBAMconfig -R /ifs1/User/lrui/data/duckproject/configfile/beijingBJ.VCFBAMconfig -R /ifs1/User/lrui/data/duckproject/configfile/shaoxingBJ.VCFBAMconfig -R /ifs1/User/lrui/data/duckproject/configfile/lianchengbaiBJ.VCFBAMconfig -R /ifs1/User/lrui/data/duckproject/configfile/jindingBJ.VCFBAMconfig -R /ifs1/User/lrui/data/duckproject/configfile/shanmaBJ.VCFBAMconfig -R /ifs1/User/lrui/data/duckproject/configfile/gaoyouBJ.VCFBAMconfig -R /ifs1/User/lrui/data/duckproject/configfile/cherryvalleyBJ.VCFBAMconfig -R /ifs1/User/lrui/data/duckproject/configfile/campbellBJ.VCFBAMconfig -t mspsgjlksy10pop_toplevel_pekingduckref -w 20000 -s 10000 -c /ifs1/User/lrui/database/all_sep_chrfiles/pekingduckchrominfo.Zscaffolds -o /ifs1/User/lrui/data/duckproject/detectseletion/ancientseletion/Dr0Dtn0/ancient20k10kZ2 -p early -1 /ifs1/User/lrui/life/src/NGS/Slave/Detectsignalacrossgenome_producecorrelation_slave.py -2 /ifs1/User/lrui/life/src/NGS/Slave/Detectsignalacrossgenome_slidewin_slave.py -n 17 &amp;</w:t>
+      <w:r>
+        <w:t>nohup python /ifs1/User/lrui/life/src/NGS/Analysis/Detectsignalacrossgenome_master.py -T /ifs1/User/lrui/data/duckproject/configfile/mallardBJ.VCFBAMconfig -T /ifs1/User/lrui/data/duckproject/configfile/spotbilledBJ.VCFBAMconfig -R /ifs1/User/lrui/data/duckproject/configfile/beijingBJ.VCFBAMconfig -R /ifs1/User/lrui/data/duckproject/configfile/shaoxingBJ.VCFBAMconfig -R /ifs1/User/lrui/data/duckproject/configfile/lianchengbaiBJ.VCFBAMconfig -R /ifs1/User/lrui/data/duckproject/configfile/jindingBJ.VCFBAMconfig -R /ifs1/User/lrui/data/duckproject/configfile/shanmaBJ.VCFBAMconfig -R /ifs1/User/lrui/data/duckproject/configfile/gaoyouBJ.VCFBAMconfig -R /ifs1/User/lrui/data/duckproject/configfile/cherryvalleyBJ.VCFBAMconfig -R /ifs1/User/lrui/data/duckproject/configfile/campbellBJ.VCFBAMconfig -t mspsgjlksy10pop_toplevel_pekingduckref -w 20000 -s 10000 -c /ifs1/User/lrui/database/all_sep_chrfiles/pekingduckchrominfo.Zscaffolds -o /ifs1/User/lrui/data/duckproject/detectseletion/ancientseletion/Dr0Dtn0/ancient20k10kZ2 -p early -1 /ifs1/User/lrui/life/src/NGS/Slave/Detectsignalacrossgenome_producecorrelation_slave.py -2 /ifs1/User/lrui/life/src/NGS/Slave/Detectsignalacrossgenome_slidewin_slave.py -n 17 &amp;</w:t>
       </w:r>
     </w:p>
     <w:sectPr>
@@ -2904,7 +2553,7 @@
 </file>
 
 <file path=word/endnotes.xml><?xml version="1.0" encoding="utf-8"?>
-<w:endnotes xmlns:wpc="http://schemas.microsoft.com/office/word/2010/wordprocessingCanvas" xmlns:cx="http://schemas.microsoft.com/office/drawing/2014/chartex" xmlns:cx1="http://schemas.microsoft.com/office/drawing/2015/9/8/chartex" xmlns:cx2="http://schemas.microsoft.com/office/drawing/2015/10/21/chartex" xmlns:cx3="http://schemas.microsoft.com/office/drawing/2016/5/9/chartex" xmlns:cx4="http://schemas.microsoft.com/office/drawing/2016/5/10/chartex" xmlns:cx5="http://schemas.microsoft.com/office/drawing/2016/5/11/chartex" xmlns:cx6="http://schemas.microsoft.com/office/drawing/2016/5/12/chartex" xmlns:cx7="http://schemas.microsoft.com/office/drawing/2016/5/13/chartex" xmlns:cx8="http://schemas.microsoft.com/office/drawing/2016/5/14/chartex" xmlns:mc="http://schemas.openxmlformats.org/markup-compatibility/2006" xmlns:aink="http://schemas.microsoft.com/office/drawing/2016/ink" xmlns:am3d="http://schemas.microsoft.com/office/drawing/2017/model3d" xmlns:o="urn:schemas-microsoft-com:office:office" xmlns:r="http://schemas.openxmlformats.org/officeDocument/2006/relationships" xmlns:m="http://schemas.openxmlformats.org/officeDocument/2006/math" xmlns:v="urn:schemas-microsoft-com:vml" xmlns:wp14="http://schemas.microsoft.com/office/word/2010/wordprocessingDrawing" xmlns:wp="http://schemas.openxmlformats.org/drawingml/2006/wordprocessingDrawing" xmlns:w10="urn:schemas-microsoft-com:office:word" xmlns:w="http://schemas.openxmlformats.org/wordprocessingml/2006/main" xmlns:w14="http://schemas.microsoft.com/office/word/2010/wordml" xmlns:w15="http://schemas.microsoft.com/office/word/2012/wordml" xmlns:w16cid="http://schemas.microsoft.com/office/word/2016/wordml/cid" xmlns:w16se="http://schemas.microsoft.com/office/word/2015/wordml/symex" xmlns:wpg="http://schemas.microsoft.com/office/word/2010/wordprocessingGroup" xmlns:wpi="http://schemas.microsoft.com/office/word/2010/wordprocessingInk" xmlns:wne="http://schemas.microsoft.com/office/word/2006/wordml" xmlns:wps="http://schemas.microsoft.com/office/word/2010/wordprocessingShape" mc:Ignorable="w14 w15 w16se w16cid wp14">
+<w:endnotes xmlns:wpc="http://schemas.microsoft.com/office/word/2010/wordprocessingCanvas" xmlns:cx="http://schemas.microsoft.com/office/drawing/2014/chartex" xmlns:cx1="http://schemas.microsoft.com/office/drawing/2015/9/8/chartex" xmlns:cx2="http://schemas.microsoft.com/office/drawing/2015/10/21/chartex" xmlns:cx3="http://schemas.microsoft.com/office/drawing/2016/5/9/chartex" xmlns:cx4="http://schemas.microsoft.com/office/drawing/2016/5/10/chartex" xmlns:cx5="http://schemas.microsoft.com/office/drawing/2016/5/11/chartex" xmlns:cx6="http://schemas.microsoft.com/office/drawing/2016/5/12/chartex" xmlns:cx7="http://schemas.microsoft.com/office/drawing/2016/5/13/chartex" xmlns:cx8="http://schemas.microsoft.com/office/drawing/2016/5/14/chartex" xmlns:mc="http://schemas.openxmlformats.org/markup-compatibility/2006" xmlns:aink="http://schemas.microsoft.com/office/drawing/2016/ink" xmlns:am3d="http://schemas.microsoft.com/office/drawing/2017/model3d" xmlns:o="urn:schemas-microsoft-com:office:office" xmlns:r="http://schemas.openxmlformats.org/officeDocument/2006/relationships" xmlns:m="http://schemas.openxmlformats.org/officeDocument/2006/math" xmlns:v="urn:schemas-microsoft-com:vml" xmlns:wp14="http://schemas.microsoft.com/office/word/2010/wordprocessingDrawing" xmlns:wp="http://schemas.openxmlformats.org/drawingml/2006/wordprocessingDrawing" xmlns:w10="urn:schemas-microsoft-com:office:word" xmlns:w="http://schemas.openxmlformats.org/wordprocessingml/2006/main" xmlns:w14="http://schemas.microsoft.com/office/word/2010/wordml" xmlns:w15="http://schemas.microsoft.com/office/word/2012/wordml" xmlns:w16cex="http://schemas.microsoft.com/office/word/2018/wordml/cex" xmlns:w16cid="http://schemas.microsoft.com/office/word/2016/wordml/cid" xmlns:w16="http://schemas.microsoft.com/office/word/2018/wordml" xmlns:w16sdtdh="http://schemas.microsoft.com/office/word/2020/wordml/sdtdatahash" xmlns:w16se="http://schemas.microsoft.com/office/word/2015/wordml/symex" xmlns:wpg="http://schemas.microsoft.com/office/word/2010/wordprocessingGroup" xmlns:wpi="http://schemas.microsoft.com/office/word/2010/wordprocessingInk" xmlns:wne="http://schemas.microsoft.com/office/word/2006/wordml" xmlns:wps="http://schemas.microsoft.com/office/word/2010/wordprocessingShape" mc:Ignorable="w14 w15 w16se w16cid w16 w16cex w16sdtdh wp14">
   <w:endnote w:type="separator" w:id="-1">
     <w:p>
       <w:r>
@@ -2923,7 +2572,7 @@
 </file>
 
 <file path=word/footnotes.xml><?xml version="1.0" encoding="utf-8"?>
-<w:footnotes xmlns:wpc="http://schemas.microsoft.com/office/word/2010/wordprocessingCanvas" xmlns:cx="http://schemas.microsoft.com/office/drawing/2014/chartex" xmlns:cx1="http://schemas.microsoft.com/office/drawing/2015/9/8/chartex" xmlns:cx2="http://schemas.microsoft.com/office/drawing/2015/10/21/chartex" xmlns:cx3="http://schemas.microsoft.com/office/drawing/2016/5/9/chartex" xmlns:cx4="http://schemas.microsoft.com/office/drawing/2016/5/10/chartex" xmlns:cx5="http://schemas.microsoft.com/office/drawing/2016/5/11/chartex" xmlns:cx6="http://schemas.microsoft.com/office/drawing/2016/5/12/chartex" xmlns:cx7="http://schemas.microsoft.com/office/drawing/2016/5/13/chartex" xmlns:cx8="http://schemas.microsoft.com/office/drawing/2016/5/14/chartex" xmlns:mc="http://schemas.openxmlformats.org/markup-compatibility/2006" xmlns:aink="http://schemas.microsoft.com/office/drawing/2016/ink" xmlns:am3d="http://schemas.microsoft.com/office/drawing/2017/model3d" xmlns:o="urn:schemas-microsoft-com:office:office" xmlns:r="http://schemas.openxmlformats.org/officeDocument/2006/relationships" xmlns:m="http://schemas.openxmlformats.org/officeDocument/2006/math" xmlns:v="urn:schemas-microsoft-com:vml" xmlns:wp14="http://schemas.microsoft.com/office/word/2010/wordprocessingDrawing" xmlns:wp="http://schemas.openxmlformats.org/drawingml/2006/wordprocessingDrawing" xmlns:w10="urn:schemas-microsoft-com:office:word" xmlns:w="http://schemas.openxmlformats.org/wordprocessingml/2006/main" xmlns:w14="http://schemas.microsoft.com/office/word/2010/wordml" xmlns:w15="http://schemas.microsoft.com/office/word/2012/wordml" xmlns:w16cid="http://schemas.microsoft.com/office/word/2016/wordml/cid" xmlns:w16se="http://schemas.microsoft.com/office/word/2015/wordml/symex" xmlns:wpg="http://schemas.microsoft.com/office/word/2010/wordprocessingGroup" xmlns:wpi="http://schemas.microsoft.com/office/word/2010/wordprocessingInk" xmlns:wne="http://schemas.microsoft.com/office/word/2006/wordml" xmlns:wps="http://schemas.microsoft.com/office/word/2010/wordprocessingShape" mc:Ignorable="w14 w15 w16se w16cid wp14">
+<w:footnotes xmlns:wpc="http://schemas.microsoft.com/office/word/2010/wordprocessingCanvas" xmlns:cx="http://schemas.microsoft.com/office/drawing/2014/chartex" xmlns:cx1="http://schemas.microsoft.com/office/drawing/2015/9/8/chartex" xmlns:cx2="http://schemas.microsoft.com/office/drawing/2015/10/21/chartex" xmlns:cx3="http://schemas.microsoft.com/office/drawing/2016/5/9/chartex" xmlns:cx4="http://schemas.microsoft.com/office/drawing/2016/5/10/chartex" xmlns:cx5="http://schemas.microsoft.com/office/drawing/2016/5/11/chartex" xmlns:cx6="http://schemas.microsoft.com/office/drawing/2016/5/12/chartex" xmlns:cx7="http://schemas.microsoft.com/office/drawing/2016/5/13/chartex" xmlns:cx8="http://schemas.microsoft.com/office/drawing/2016/5/14/chartex" xmlns:mc="http://schemas.openxmlformats.org/markup-compatibility/2006" xmlns:aink="http://schemas.microsoft.com/office/drawing/2016/ink" xmlns:am3d="http://schemas.microsoft.com/office/drawing/2017/model3d" xmlns:o="urn:schemas-microsoft-com:office:office" xmlns:r="http://schemas.openxmlformats.org/officeDocument/2006/relationships" xmlns:m="http://schemas.openxmlformats.org/officeDocument/2006/math" xmlns:v="urn:schemas-microsoft-com:vml" xmlns:wp14="http://schemas.microsoft.com/office/word/2010/wordprocessingDrawing" xmlns:wp="http://schemas.openxmlformats.org/drawingml/2006/wordprocessingDrawing" xmlns:w10="urn:schemas-microsoft-com:office:word" xmlns:w="http://schemas.openxmlformats.org/wordprocessingml/2006/main" xmlns:w14="http://schemas.microsoft.com/office/word/2010/wordml" xmlns:w15="http://schemas.microsoft.com/office/word/2012/wordml" xmlns:w16cex="http://schemas.microsoft.com/office/word/2018/wordml/cex" xmlns:w16cid="http://schemas.microsoft.com/office/word/2016/wordml/cid" xmlns:w16="http://schemas.microsoft.com/office/word/2018/wordml" xmlns:w16sdtdh="http://schemas.microsoft.com/office/word/2020/wordml/sdtdatahash" xmlns:w16se="http://schemas.microsoft.com/office/word/2015/wordml/symex" xmlns:wpg="http://schemas.microsoft.com/office/word/2010/wordprocessingGroup" xmlns:wpi="http://schemas.microsoft.com/office/word/2010/wordprocessingInk" xmlns:wne="http://schemas.microsoft.com/office/word/2006/wordml" xmlns:wps="http://schemas.microsoft.com/office/word/2010/wordprocessingShape" mc:Ignorable="w14 w15 w16se w16cid w16 w16cex w16sdtdh wp14">
   <w:footnote w:type="separator" w:id="-1">
     <w:p>
       <w:r>
@@ -2942,7 +2591,7 @@
 </file>
 
 <file path=word/numbering.xml><?xml version="1.0" encoding="utf-8"?>
-<w:numbering xmlns:wpc="http://schemas.microsoft.com/office/word/2010/wordprocessingCanvas" xmlns:cx="http://schemas.microsoft.com/office/drawing/2014/chartex" xmlns:cx1="http://schemas.microsoft.com/office/drawing/2015/9/8/chartex" xmlns:cx2="http://schemas.microsoft.com/office/drawing/2015/10/21/chartex" xmlns:cx3="http://schemas.microsoft.com/office/drawing/2016/5/9/chartex" xmlns:cx4="http://schemas.microsoft.com/office/drawing/2016/5/10/chartex" xmlns:cx5="http://schemas.microsoft.com/office/drawing/2016/5/11/chartex" xmlns:cx6="http://schemas.microsoft.com/office/drawing/2016/5/12/chartex" xmlns:cx7="http://schemas.microsoft.com/office/drawing/2016/5/13/chartex" xmlns:cx8="http://schemas.microsoft.com/office/drawing/2016/5/14/chartex" xmlns:mc="http://schemas.openxmlformats.org/markup-compatibility/2006" xmlns:aink="http://schemas.microsoft.com/office/drawing/2016/ink" xmlns:am3d="http://schemas.microsoft.com/office/drawing/2017/model3d" xmlns:o="urn:schemas-microsoft-com:office:office" xmlns:r="http://schemas.openxmlformats.org/officeDocument/2006/relationships" xmlns:m="http://schemas.openxmlformats.org/officeDocument/2006/math" xmlns:v="urn:schemas-microsoft-com:vml" xmlns:wp14="http://schemas.microsoft.com/office/word/2010/wordprocessingDrawing" xmlns:wp="http://schemas.openxmlformats.org/drawingml/2006/wordprocessingDrawing" xmlns:w10="urn:schemas-microsoft-com:office:word" xmlns:w="http://schemas.openxmlformats.org/wordprocessingml/2006/main" xmlns:w14="http://schemas.microsoft.com/office/word/2010/wordml" xmlns:w15="http://schemas.microsoft.com/office/word/2012/wordml" xmlns:w16cid="http://schemas.microsoft.com/office/word/2016/wordml/cid" xmlns:w16se="http://schemas.microsoft.com/office/word/2015/wordml/symex" xmlns:wpg="http://schemas.microsoft.com/office/word/2010/wordprocessingGroup" xmlns:wpi="http://schemas.microsoft.com/office/word/2010/wordprocessingInk" xmlns:wne="http://schemas.microsoft.com/office/word/2006/wordml" xmlns:wps="http://schemas.microsoft.com/office/word/2010/wordprocessingShape" mc:Ignorable="w14 w15 w16se w16cid wp14">
+<w:numbering xmlns:wpc="http://schemas.microsoft.com/office/word/2010/wordprocessingCanvas" xmlns:cx="http://schemas.microsoft.com/office/drawing/2014/chartex" xmlns:cx1="http://schemas.microsoft.com/office/drawing/2015/9/8/chartex" xmlns:cx2="http://schemas.microsoft.com/office/drawing/2015/10/21/chartex" xmlns:cx3="http://schemas.microsoft.com/office/drawing/2016/5/9/chartex" xmlns:cx4="http://schemas.microsoft.com/office/drawing/2016/5/10/chartex" xmlns:cx5="http://schemas.microsoft.com/office/drawing/2016/5/11/chartex" xmlns:cx6="http://schemas.microsoft.com/office/drawing/2016/5/12/chartex" xmlns:cx7="http://schemas.microsoft.com/office/drawing/2016/5/13/chartex" xmlns:cx8="http://schemas.microsoft.com/office/drawing/2016/5/14/chartex" xmlns:mc="http://schemas.openxmlformats.org/markup-compatibility/2006" xmlns:aink="http://schemas.microsoft.com/office/drawing/2016/ink" xmlns:am3d="http://schemas.microsoft.com/office/drawing/2017/model3d" xmlns:o="urn:schemas-microsoft-com:office:office" xmlns:r="http://schemas.openxmlformats.org/officeDocument/2006/relationships" xmlns:m="http://schemas.openxmlformats.org/officeDocument/2006/math" xmlns:v="urn:schemas-microsoft-com:vml" xmlns:wp14="http://schemas.microsoft.com/office/word/2010/wordprocessingDrawing" xmlns:wp="http://schemas.openxmlformats.org/drawingml/2006/wordprocessingDrawing" xmlns:w10="urn:schemas-microsoft-com:office:word" xmlns:w="http://schemas.openxmlformats.org/wordprocessingml/2006/main" xmlns:w14="http://schemas.microsoft.com/office/word/2010/wordml" xmlns:w15="http://schemas.microsoft.com/office/word/2012/wordml" xmlns:w16cex="http://schemas.microsoft.com/office/word/2018/wordml/cex" xmlns:w16cid="http://schemas.microsoft.com/office/word/2016/wordml/cid" xmlns:w16="http://schemas.microsoft.com/office/word/2018/wordml" xmlns:w16sdtdh="http://schemas.microsoft.com/office/word/2020/wordml/sdtdatahash" xmlns:w16se="http://schemas.microsoft.com/office/word/2015/wordml/symex" xmlns:wpg="http://schemas.microsoft.com/office/word/2010/wordprocessingGroup" xmlns:wpi="http://schemas.microsoft.com/office/word/2010/wordprocessingInk" xmlns:wne="http://schemas.microsoft.com/office/word/2006/wordml" xmlns:wps="http://schemas.microsoft.com/office/word/2010/wordprocessingShape" mc:Ignorable="w14 w15 w16se w16cid w16 w16cex w16sdtdh wp14">
   <w:abstractNum w:abstractNumId="0" w15:restartNumberingAfterBreak="0">
     <w:nsid w:val="07847F0A"/>
     <w:multiLevelType w:val="hybridMultilevel"/>
@@ -3303,7 +2952,7 @@
 </file>
 
 <file path=word/styles.xml><?xml version="1.0" encoding="utf-8"?>
-<w:styles xmlns:mc="http://schemas.openxmlformats.org/markup-compatibility/2006" xmlns:r="http://schemas.openxmlformats.org/officeDocument/2006/relationships" xmlns:w="http://schemas.openxmlformats.org/wordprocessingml/2006/main" xmlns:w14="http://schemas.microsoft.com/office/word/2010/wordml" xmlns:w15="http://schemas.microsoft.com/office/word/2012/wordml" xmlns:w16cid="http://schemas.microsoft.com/office/word/2016/wordml/cid" xmlns:w16se="http://schemas.microsoft.com/office/word/2015/wordml/symex" mc:Ignorable="w14 w15 w16se w16cid">
+<w:styles xmlns:mc="http://schemas.openxmlformats.org/markup-compatibility/2006" xmlns:r="http://schemas.openxmlformats.org/officeDocument/2006/relationships" xmlns:w="http://schemas.openxmlformats.org/wordprocessingml/2006/main" xmlns:w14="http://schemas.microsoft.com/office/word/2010/wordml" xmlns:w15="http://schemas.microsoft.com/office/word/2012/wordml" xmlns:w16cex="http://schemas.microsoft.com/office/word/2018/wordml/cex" xmlns:w16cid="http://schemas.microsoft.com/office/word/2016/wordml/cid" xmlns:w16="http://schemas.microsoft.com/office/word/2018/wordml" xmlns:w16sdtdh="http://schemas.microsoft.com/office/word/2020/wordml/sdtdatahash" xmlns:w16se="http://schemas.microsoft.com/office/word/2015/wordml/symex" mc:Ignorable="w14 w15 w16se w16cid w16 w16cex w16sdtdh">
   <w:docDefaults>
     <w:rPrDefault>
       <w:rPr>

</xml_diff>